<commit_message>
Add actual application screenshots and verify stage-two report coverage
</commit_message>
<xml_diff>
--- a/第二阶段/提交材料/2026_ECNU_PJ1_2_温正泽-可编辑.docx
+++ b/第二阶段/提交材料/2026_ECNU_PJ1_2_温正泽-可编辑.docx
@@ -30,7 +30,7 @@
         <w:rPr>
           <w:sz w:val="19"/>
         </w:rPr>
-        <w:t>温正泽　10244304404　数据管理系统　2026年10月28日</w:t>
+        <w:t>温正泽　10244304404　数据管理系统　2026年10月29日</w:t>
       </w:r>
     </w:p>
     <w:p>
@@ -2032,6 +2032,150 @@
         <w:t>当前每题最多100版，跨卷统计限本人问卷，数字分布自适应分桶，不提供删除引用源题的入口；扩展这些边界需先明确授权和数据量。源码、设计、API、测试及可编辑报告在同一仓库，后续可继续调整。</w:t>
       </w:r>
     </w:p>
+    <w:p>
+      <w:pPr>
+        <w:pStyle w:val="Heading1"/>
+        <w:pageBreakBefore/>
+        <w:spacing w:before="200" w:after="100"/>
+      </w:pPr>
+      <w:r>
+        <w:t>附录 页面与结果展示</w:t>
+      </w:r>
+    </w:p>
+    <w:p>
+      <w:pPr>
+        <w:widowControl/>
+        <w:spacing w:line="360" w:lineRule="auto" w:after="60"/>
+        <w:ind w:firstLine="420"/>
+      </w:pPr>
+      <w:r>
+        <w:t>以下为2026年10月29日双账号验收时的真实页面局部截图，使用独立测试库和合成账号。截图只截取相关界面区域，未改动页面文字或统计结果；同一题目分别用于创建者与接收者各自的问卷，答卷统计不因题目共享而相互开放。</w:t>
+      </w:r>
+    </w:p>
+    <w:p>
+      <w:pPr>
+        <w:keepNext/>
+        <w:ind w:firstLine="0"/>
+      </w:pPr>
+      <w:r>
+        <w:rPr>
+          <w:sz w:val="19"/>
+        </w:rPr>
+        <w:t>图3 题库版本管理页面</w:t>
+      </w:r>
+    </w:p>
+    <w:p>
+      <w:pPr>
+        <w:keepLines/>
+        <w:ind w:firstLine="0"/>
+      </w:pPr>
+      <w:r>
+        <w:drawing>
+          <wp:inline xmlns:a="http://schemas.openxmlformats.org/drawingml/2006/main" xmlns:pic="http://schemas.openxmlformats.org/drawingml/2006/picture">
+            <wp:extent cx="6120000" cy="2202460"/>
+            <wp:docPr id="3" name="Picture 3"/>
+            <wp:cNvGraphicFramePr>
+              <a:graphicFrameLocks noChangeAspect="1"/>
+            </wp:cNvGraphicFramePr>
+            <a:graphic>
+              <a:graphicData uri="http://schemas.openxmlformats.org/drawingml/2006/picture">
+                <pic:pic>
+                  <pic:nvPicPr>
+                    <pic:cNvPr id="0" name="stage2-version-page.png"/>
+                    <pic:cNvPicPr/>
+                  </pic:nvPicPr>
+                  <pic:blipFill>
+                    <a:blip r:embed="rId18"/>
+                    <a:stretch>
+                      <a:fillRect/>
+                    </a:stretch>
+                  </pic:blipFill>
+                  <pic:spPr>
+                    <a:xfrm>
+                      <a:off x="0" y="0"/>
+                      <a:ext cx="6120000" cy="2202460"/>
+                    </a:xfrm>
+                    <a:prstGeom prst="rect"/>
+                  </pic:spPr>
+                </pic:pic>
+              </a:graphicData>
+            </a:graphic>
+          </wp:inline>
+        </w:drawing>
+      </w:r>
+    </w:p>
+    <w:p>
+      <w:pPr>
+        <w:widowControl/>
+        <w:spacing w:line="360" w:lineRule="auto" w:after="60"/>
+        <w:ind w:firstLine="420"/>
+      </w:pPr>
+      <w:r>
+        <w:t>页面显示当前第2版、父版本及题目预览，可选择历史版本、恢复并查看使用位置。导入按钮需从本人草稿问卷进入后使用，避免未选择目标问卷时误导入。</w:t>
+      </w:r>
+    </w:p>
+    <w:p>
+      <w:pPr>
+        <w:keepNext/>
+        <w:ind w:firstLine="0"/>
+      </w:pPr>
+      <w:r>
+        <w:rPr>
+          <w:sz w:val="19"/>
+        </w:rPr>
+        <w:t>图4 本人问卷中的跨卷统计页面</w:t>
+      </w:r>
+    </w:p>
+    <w:p>
+      <w:pPr>
+        <w:keepLines/>
+        <w:ind w:firstLine="0"/>
+      </w:pPr>
+      <w:r>
+        <w:drawing>
+          <wp:inline xmlns:a="http://schemas.openxmlformats.org/drawingml/2006/main" xmlns:pic="http://schemas.openxmlformats.org/drawingml/2006/picture">
+            <wp:extent cx="6120000" cy="2540255"/>
+            <wp:docPr id="4" name="Picture 4"/>
+            <wp:cNvGraphicFramePr>
+              <a:graphicFrameLocks noChangeAspect="1"/>
+            </wp:cNvGraphicFramePr>
+            <a:graphic>
+              <a:graphicData uri="http://schemas.openxmlformats.org/drawingml/2006/picture">
+                <pic:pic>
+                  <pic:nvPicPr>
+                    <pic:cNvPr id="0" name="stage2-statistics-page.png"/>
+                    <pic:cNvPicPr/>
+                  </pic:nvPicPr>
+                  <pic:blipFill>
+                    <a:blip r:embed="rId19"/>
+                    <a:stretch>
+                      <a:fillRect/>
+                    </a:stretch>
+                  </pic:blipFill>
+                  <pic:spPr>
+                    <a:xfrm>
+                      <a:off x="0" y="0"/>
+                      <a:ext cx="6120000" cy="2540255"/>
+                    </a:xfrm>
+                    <a:prstGeom prst="rect"/>
+                  </pic:spPr>
+                </pic:pic>
+              </a:graphicData>
+            </a:graphic>
+          </wp:inline>
+        </w:drawing>
+      </w:r>
+    </w:p>
+    <w:p>
+      <w:pPr>
+        <w:widowControl/>
+        <w:spacing w:line="360" w:lineRule="auto" w:after="60"/>
+        <w:ind w:firstLine="420"/>
+      </w:pPr>
+      <w:r>
+        <w:t>该组来自作者问卷的一次有效回答8，均值、最小值和最大值均为8，区间[8,8]计1次。接收者另一问卷的回答2单独统计，未混入此结果；版本ID与图3相同。不同版本或本卷内容变化后的题目另分组，图中数据为验收样本，不作为实际调查结论。</w:t>
+      </w:r>
+    </w:p>
     <w:sectPr>
       <w:footerReference w:type="default" r:id="rId14"/>
       <w:headerReference w:type="default" r:id="rId15"/>

</xml_diff>

<commit_message>
Refine stage-two report diagrams with consistent course styling
</commit_message>
<xml_diff>
--- a/第二阶段/提交材料/2026_ECNU_PJ1_2_温正泽-可编辑.docx
+++ b/第二阶段/提交材料/2026_ECNU_PJ1_2_温正泽-可编辑.docx
@@ -721,7 +721,7 @@
       <w:r>
         <w:drawing>
           <wp:inline xmlns:a="http://schemas.openxmlformats.org/drawingml/2006/main" xmlns:pic="http://schemas.openxmlformats.org/drawingml/2006/picture">
-            <wp:extent cx="6120000" cy="2805000"/>
+            <wp:extent cx="6120000" cy="2703172"/>
             <wp:docPr id="1" name="Picture 1"/>
             <wp:cNvGraphicFramePr>
               <a:graphicFrameLocks noChangeAspect="1"/>
@@ -730,7 +730,7 @@
               <a:graphicData uri="http://schemas.openxmlformats.org/drawingml/2006/picture">
                 <pic:pic>
                   <pic:nvPicPr>
-                    <pic:cNvPr id="0" name="stage2-data-flow.png"/>
+                    <pic:cNvPr id="0" name="stage2-data-flow-refined.png"/>
                     <pic:cNvPicPr/>
                   </pic:nvPicPr>
                   <pic:blipFill>
@@ -742,7 +742,7 @@
                   <pic:spPr>
                     <a:xfrm>
                       <a:off x="0" y="0"/>
-                      <a:ext cx="6120000" cy="2805000"/>
+                      <a:ext cx="6120000" cy="2703172"/>
                     </a:xfrm>
                     <a:prstGeom prst="rect"/>
                   </pic:spPr>
@@ -850,7 +850,7 @@
       <w:r>
         <w:drawing>
           <wp:inline xmlns:a="http://schemas.openxmlformats.org/drawingml/2006/main" xmlns:pic="http://schemas.openxmlformats.org/drawingml/2006/picture">
-            <wp:extent cx="6120000" cy="2710650"/>
+            <wp:extent cx="6120000" cy="2549426"/>
             <wp:docPr id="2" name="Picture 2"/>
             <wp:cNvGraphicFramePr>
               <a:graphicFrameLocks noChangeAspect="1"/>
@@ -859,7 +859,7 @@
               <a:graphicData uri="http://schemas.openxmlformats.org/drawingml/2006/picture">
                 <pic:pic>
                   <pic:nvPicPr>
-                    <pic:cNvPr id="0" name="stage2-version-flow.png"/>
+                    <pic:cNvPr id="0" name="stage2-version-flow-refined.png"/>
                     <pic:cNvPicPr/>
                   </pic:nvPicPr>
                   <pic:blipFill>
@@ -871,7 +871,7 @@
                   <pic:spPr>
                     <a:xfrm>
                       <a:off x="0" y="0"/>
-                      <a:ext cx="6120000" cy="2710650"/>
+                      <a:ext cx="6120000" cy="2549426"/>
                     </a:xfrm>
                     <a:prstGeom prst="rect"/>
                   </pic:spPr>

</xml_diff>

<commit_message>
Fix report font inheritance and render diagrams with installed fonts
</commit_message>
<xml_diff>
--- a/第二阶段/提交材料/2026_ECNU_PJ1_2_温正泽-可编辑.docx
+++ b/第二阶段/提交材料/2026_ECNU_PJ1_2_温正泽-可编辑.docx
@@ -8,6 +8,7 @@
       </w:pPr>
       <w:r>
         <w:rPr>
+          <w:rFonts w:ascii="Times New Roman" w:hAnsi="Times New Roman" w:cs="Times New Roman" w:eastAsia="宋体"/>
           <w:sz w:val="19"/>
         </w:rPr>
         <w:t>GitHub 仓库：https://github.com/Ferrari2006/mongodb-survey-system</w:t>
@@ -19,6 +20,10 @@
         <w:ind w:firstLine="0"/>
       </w:pPr>
       <w:r>
+        <w:rPr>
+          <w:rFonts w:ascii="Times New Roman" w:hAnsi="Times New Roman" w:cs="Times New Roman" w:eastAsia="黑体"/>
+          <w:b w:val="0"/>
+        </w:rPr>
         <w:t>MongoDB问卷系统第二阶段项目报告</w:t>
       </w:r>
     </w:p>
@@ -28,6 +33,7 @@
       </w:pPr>
       <w:r>
         <w:rPr>
+          <w:rFonts w:ascii="Times New Roman" w:hAnsi="Times New Roman" w:cs="Times New Roman" w:eastAsia="宋体"/>
           <w:sz w:val="19"/>
         </w:rPr>
         <w:t>温正泽　10244304404　数据管理系统　2026年10月29日</w:t>
@@ -39,6 +45,10 @@
         <w:spacing w:before="200" w:after="100"/>
       </w:pPr>
       <w:r>
+        <w:rPr>
+          <w:rFonts w:ascii="Times New Roman" w:hAnsi="Times New Roman" w:cs="Times New Roman" w:eastAsia="黑体"/>
+          <w:b w:val="0"/>
+        </w:rPr>
         <w:t>一 需求变化与实现范围</w:t>
       </w:r>
     </w:p>
@@ -49,6 +59,9 @@
         <w:ind w:firstLine="420"/>
       </w:pPr>
       <w:r>
+        <w:rPr>
+          <w:rFonts w:ascii="Times New Roman" w:hAnsi="Times New Roman" w:cs="Times New Roman" w:eastAsia="宋体"/>
+        </w:rPr>
         <w:t>第二阶段在原有账号、问卷、跳转、填写和统计功能上增加题目复用。常用题能够跨卷使用、共享、改版和恢复，并追踪引用与汇总答卷。问卷仍保存发布内容，另增独立的题库来源和版本历史。</w:t>
       </w:r>
     </w:p>
@@ -59,6 +72,9 @@
         <w:ind w:firstLine="420"/>
       </w:pPr>
       <w:r>
+        <w:rPr>
+          <w:rFonts w:ascii="Times New Roman" w:hAnsi="Times New Roman" w:cs="Times New Roman" w:eastAsia="宋体"/>
+        </w:rPr>
         <w:t>本次在原Flask、PyMongo和原生网页上扩展，没有替换第一阶段技术栈。新增两个MongoDB集合及12个API，系统共有七个集合、35个API。第一阶段提交快照保留为stage1-submission-20261023，旧报告及38项测试记录保持原样。本阶段52项自动化测试通过，另完成真实浏览器流程；这些结果覆盖已执行的场景，不代表已完成大规模性能验证。</w:t>
       </w:r>
     </w:p>
@@ -69,6 +85,7 @@
       </w:pPr>
       <w:r>
         <w:rPr>
+          <w:rFonts w:ascii="Times New Roman" w:hAnsi="Times New Roman" w:cs="Times New Roman" w:eastAsia="宋体"/>
           <w:sz w:val="19"/>
         </w:rPr>
         <w:t>表1 第二阶段需求与处理方式</w:t>
@@ -105,11 +122,13 @@
           </w:tcPr>
           <w:p>
             <w:pPr>
+              <w:keepNext/>
               <w:spacing w:after="60" w:before="60" w:line="324" w:lineRule="auto"/>
             </w:pPr>
             <w:r>
               <w:rPr>
-                <w:b/>
+                <w:rFonts w:ascii="Times New Roman" w:hAnsi="Times New Roman" w:cs="Times New Roman" w:eastAsia="黑体"/>
+                <w:b w:val="0"/>
                 <w:sz w:val="18"/>
               </w:rPr>
               <w:t>需求</w:t>
@@ -125,11 +144,13 @@
           </w:tcPr>
           <w:p>
             <w:pPr>
+              <w:keepNext/>
               <w:spacing w:after="60" w:before="60" w:line="324" w:lineRule="auto"/>
             </w:pPr>
             <w:r>
               <w:rPr>
-                <w:b/>
+                <w:rFonts w:ascii="Times New Roman" w:hAnsi="Times New Roman" w:cs="Times New Roman" w:eastAsia="黑体"/>
+                <w:b w:val="0"/>
                 <w:sz w:val="18"/>
               </w:rPr>
               <w:t>实现与设计考虑</w:t>
@@ -148,6 +169,7 @@
             </w:pPr>
             <w:r>
               <w:rPr>
+                <w:rFonts w:ascii="Times New Roman" w:hAnsi="Times New Roman" w:cs="Times New Roman" w:eastAsia="宋体"/>
                 <w:b w:val="0"/>
                 <w:sz w:val="18"/>
               </w:rPr>
@@ -165,6 +187,7 @@
             </w:pPr>
             <w:r>
               <w:rPr>
+                <w:rFonts w:ascii="Times New Roman" w:hAnsi="Times New Roman" w:cs="Times New Roman" w:eastAsia="宋体"/>
                 <w:b w:val="0"/>
                 <w:sz w:val="18"/>
               </w:rPr>
@@ -184,6 +207,7 @@
             </w:pPr>
             <w:r>
               <w:rPr>
+                <w:rFonts w:ascii="Times New Roman" w:hAnsi="Times New Roman" w:cs="Times New Roman" w:eastAsia="宋体"/>
                 <w:b w:val="0"/>
                 <w:sz w:val="18"/>
               </w:rPr>
@@ -201,6 +225,7 @@
             </w:pPr>
             <w:r>
               <w:rPr>
+                <w:rFonts w:ascii="Times New Roman" w:hAnsi="Times New Roman" w:cs="Times New Roman" w:eastAsia="宋体"/>
                 <w:b w:val="0"/>
                 <w:sz w:val="18"/>
               </w:rPr>
@@ -220,6 +245,7 @@
             </w:pPr>
             <w:r>
               <w:rPr>
+                <w:rFonts w:ascii="Times New Roman" w:hAnsi="Times New Roman" w:cs="Times New Roman" w:eastAsia="宋体"/>
                 <w:b w:val="0"/>
                 <w:sz w:val="18"/>
               </w:rPr>
@@ -237,6 +263,7 @@
             </w:pPr>
             <w:r>
               <w:rPr>
+                <w:rFonts w:ascii="Times New Roman" w:hAnsi="Times New Roman" w:cs="Times New Roman" w:eastAsia="宋体"/>
                 <w:b w:val="0"/>
                 <w:sz w:val="18"/>
               </w:rPr>
@@ -256,6 +283,7 @@
             </w:pPr>
             <w:r>
               <w:rPr>
+                <w:rFonts w:ascii="Times New Roman" w:hAnsi="Times New Roman" w:cs="Times New Roman" w:eastAsia="宋体"/>
                 <w:b w:val="0"/>
                 <w:sz w:val="18"/>
               </w:rPr>
@@ -273,6 +301,7 @@
             </w:pPr>
             <w:r>
               <w:rPr>
+                <w:rFonts w:ascii="Times New Roman" w:hAnsi="Times New Roman" w:cs="Times New Roman" w:eastAsia="宋体"/>
                 <w:b w:val="0"/>
                 <w:sz w:val="18"/>
               </w:rPr>
@@ -292,6 +321,7 @@
             </w:pPr>
             <w:r>
               <w:rPr>
+                <w:rFonts w:ascii="Times New Roman" w:hAnsi="Times New Roman" w:cs="Times New Roman" w:eastAsia="宋体"/>
                 <w:b w:val="0"/>
                 <w:sz w:val="18"/>
               </w:rPr>
@@ -309,6 +339,7 @@
             </w:pPr>
             <w:r>
               <w:rPr>
+                <w:rFonts w:ascii="Times New Roman" w:hAnsi="Times New Roman" w:cs="Times New Roman" w:eastAsia="宋体"/>
                 <w:b w:val="0"/>
                 <w:sz w:val="18"/>
               </w:rPr>
@@ -328,6 +359,7 @@
             </w:pPr>
             <w:r>
               <w:rPr>
+                <w:rFonts w:ascii="Times New Roman" w:hAnsi="Times New Roman" w:cs="Times New Roman" w:eastAsia="宋体"/>
                 <w:b w:val="0"/>
                 <w:sz w:val="18"/>
               </w:rPr>
@@ -345,6 +377,7 @@
             </w:pPr>
             <w:r>
               <w:rPr>
+                <w:rFonts w:ascii="Times New Roman" w:hAnsi="Times New Roman" w:cs="Times New Roman" w:eastAsia="宋体"/>
                 <w:b w:val="0"/>
                 <w:sz w:val="18"/>
               </w:rPr>
@@ -360,6 +393,10 @@
         <w:spacing w:before="200" w:after="100"/>
       </w:pPr>
       <w:r>
+        <w:rPr>
+          <w:rFonts w:ascii="Times New Roman" w:hAnsi="Times New Roman" w:cs="Times New Roman" w:eastAsia="黑体"/>
+          <w:b w:val="0"/>
+        </w:rPr>
         <w:t>二 数据库结构与扩展理由</w:t>
       </w:r>
     </w:p>
@@ -369,6 +406,10 @@
         <w:spacing w:before="180" w:after="100"/>
       </w:pPr>
       <w:r>
+        <w:rPr>
+          <w:rFonts w:ascii="Times New Roman" w:hAnsi="Times New Roman" w:cs="Times New Roman" w:eastAsia="黑体"/>
+          <w:b w:val="0"/>
+        </w:rPr>
         <w:t>2.1 保留原有集合 增加题库来源</w:t>
       </w:r>
     </w:p>
@@ -379,6 +420,9 @@
         <w:ind w:firstLine="420"/>
       </w:pPr>
       <w:r>
+        <w:rPr>
+          <w:rFonts w:ascii="Times New Roman" w:hAnsi="Times New Roman" w:cs="Times New Roman" w:eastAsia="宋体"/>
+        </w:rPr>
         <w:t>原五集合继续保存账户、会话、问卷、进度与正式答卷。题型、校验和跳转仍嵌入surveys.questions，随问卷一起读取；答卷独立存储，避免问卷文档随提交量持续增长。</w:t>
       </w:r>
     </w:p>
@@ -389,6 +433,9 @@
         <w:ind w:firstLine="420"/>
       </w:pPr>
       <w:r>
+        <w:rPr>
+          <w:rFonts w:ascii="Times New Roman" w:hAnsi="Times New Roman" w:cs="Times New Roman" w:eastAsia="宋体"/>
+        </w:rPr>
         <w:t>新增question_banks保存题库名称、说明及所有者。library_questions保存题目所属题库、共享名单、工作稿、历史版本和当前版本指针。题库用于分组管理，题目用于独立共享；分享某一道题不自动开放整座题库。</w:t>
       </w:r>
     </w:p>
@@ -399,6 +446,7 @@
       </w:pPr>
       <w:r>
         <w:rPr>
+          <w:rFonts w:ascii="Times New Roman" w:hAnsi="Times New Roman" w:cs="Times New Roman" w:eastAsia="宋体"/>
           <w:sz w:val="19"/>
         </w:rPr>
         <w:t>表2 新增集合的主要字段</w:t>
@@ -436,11 +484,13 @@
           </w:tcPr>
           <w:p>
             <w:pPr>
+              <w:keepNext/>
               <w:spacing w:after="60" w:before="60" w:line="324" w:lineRule="auto"/>
             </w:pPr>
             <w:r>
               <w:rPr>
-                <w:b/>
+                <w:rFonts w:ascii="Times New Roman" w:hAnsi="Times New Roman" w:cs="Times New Roman" w:eastAsia="黑体"/>
+                <w:b w:val="0"/>
                 <w:sz w:val="18"/>
               </w:rPr>
               <w:t>集合</w:t>
@@ -456,11 +506,13 @@
           </w:tcPr>
           <w:p>
             <w:pPr>
+              <w:keepNext/>
               <w:spacing w:after="60" w:before="60" w:line="324" w:lineRule="auto"/>
             </w:pPr>
             <w:r>
               <w:rPr>
-                <w:b/>
+                <w:rFonts w:ascii="Times New Roman" w:hAnsi="Times New Roman" w:cs="Times New Roman" w:eastAsia="黑体"/>
+                <w:b w:val="0"/>
                 <w:sz w:val="18"/>
               </w:rPr>
               <w:t>主要字段</w:t>
@@ -476,11 +528,13 @@
           </w:tcPr>
           <w:p>
             <w:pPr>
+              <w:keepNext/>
               <w:spacing w:after="60" w:before="60" w:line="324" w:lineRule="auto"/>
             </w:pPr>
             <w:r>
               <w:rPr>
-                <w:b/>
+                <w:rFonts w:ascii="Times New Roman" w:hAnsi="Times New Roman" w:cs="Times New Roman" w:eastAsia="黑体"/>
+                <w:b w:val="0"/>
                 <w:sz w:val="18"/>
               </w:rPr>
               <w:t>作用与约束</w:t>
@@ -499,6 +553,7 @@
             </w:pPr>
             <w:r>
               <w:rPr>
+                <w:rFonts w:ascii="Times New Roman" w:hAnsi="Times New Roman" w:cs="Times New Roman" w:eastAsia="宋体"/>
                 <w:b w:val="0"/>
                 <w:sz w:val="18"/>
               </w:rPr>
@@ -516,6 +571,7 @@
             </w:pPr>
             <w:r>
               <w:rPr>
+                <w:rFonts w:ascii="Times New Roman" w:hAnsi="Times New Roman" w:cs="Times New Roman" w:eastAsia="宋体"/>
                 <w:b w:val="0"/>
                 <w:sz w:val="18"/>
               </w:rPr>
@@ -533,6 +589,7 @@
             </w:pPr>
             <w:r>
               <w:rPr>
+                <w:rFonts w:ascii="Times New Roman" w:hAnsi="Times New Roman" w:cs="Times New Roman" w:eastAsia="宋体"/>
                 <w:b w:val="0"/>
                 <w:sz w:val="18"/>
               </w:rPr>
@@ -552,6 +609,7 @@
             </w:pPr>
             <w:r>
               <w:rPr>
+                <w:rFonts w:ascii="Times New Roman" w:hAnsi="Times New Roman" w:cs="Times New Roman" w:eastAsia="宋体"/>
                 <w:b w:val="0"/>
                 <w:sz w:val="18"/>
               </w:rPr>
@@ -569,6 +627,7 @@
             </w:pPr>
             <w:r>
               <w:rPr>
+                <w:rFonts w:ascii="Times New Roman" w:hAnsi="Times New Roman" w:cs="Times New Roman" w:eastAsia="宋体"/>
                 <w:b w:val="0"/>
                 <w:sz w:val="18"/>
               </w:rPr>
@@ -586,6 +645,7 @@
             </w:pPr>
             <w:r>
               <w:rPr>
+                <w:rFonts w:ascii="Times New Roman" w:hAnsi="Times New Roman" w:cs="Times New Roman" w:eastAsia="宋体"/>
                 <w:b w:val="0"/>
                 <w:sz w:val="18"/>
               </w:rPr>
@@ -605,6 +665,7 @@
             </w:pPr>
             <w:r>
               <w:rPr>
+                <w:rFonts w:ascii="Times New Roman" w:hAnsi="Times New Roman" w:cs="Times New Roman" w:eastAsia="宋体"/>
                 <w:b w:val="0"/>
                 <w:sz w:val="18"/>
               </w:rPr>
@@ -622,6 +683,7 @@
             </w:pPr>
             <w:r>
               <w:rPr>
+                <w:rFonts w:ascii="Times New Roman" w:hAnsi="Times New Roman" w:cs="Times New Roman" w:eastAsia="宋体"/>
                 <w:b w:val="0"/>
                 <w:sz w:val="18"/>
               </w:rPr>
@@ -639,6 +701,7 @@
             </w:pPr>
             <w:r>
               <w:rPr>
+                <w:rFonts w:ascii="Times New Roman" w:hAnsi="Times New Roman" w:cs="Times New Roman" w:eastAsia="宋体"/>
                 <w:b w:val="0"/>
                 <w:sz w:val="18"/>
               </w:rPr>
@@ -658,6 +721,7 @@
             </w:pPr>
             <w:r>
               <w:rPr>
+                <w:rFonts w:ascii="Times New Roman" w:hAnsi="Times New Roman" w:cs="Times New Roman" w:eastAsia="宋体"/>
                 <w:b w:val="0"/>
                 <w:sz w:val="18"/>
               </w:rPr>
@@ -675,6 +739,7 @@
             </w:pPr>
             <w:r>
               <w:rPr>
+                <w:rFonts w:ascii="Times New Roman" w:hAnsi="Times New Roman" w:cs="Times New Roman" w:eastAsia="宋体"/>
                 <w:b w:val="0"/>
                 <w:sz w:val="18"/>
               </w:rPr>
@@ -692,6 +757,7 @@
             </w:pPr>
             <w:r>
               <w:rPr>
+                <w:rFonts w:ascii="Times New Roman" w:hAnsi="Times New Roman" w:cs="Times New Roman" w:eastAsia="宋体"/>
                 <w:b w:val="0"/>
                 <w:sz w:val="18"/>
               </w:rPr>
@@ -708,6 +774,7 @@
       </w:pPr>
       <w:r>
         <w:rPr>
+          <w:rFonts w:ascii="Times New Roman" w:hAnsi="Times New Roman" w:cs="Times New Roman" w:eastAsia="宋体"/>
           <w:sz w:val="19"/>
         </w:rPr>
         <w:t>图1 题库来源与问卷快照关系</w:t>
@@ -719,9 +786,12 @@
         <w:ind w:firstLine="0"/>
       </w:pPr>
       <w:r>
+        <w:rPr>
+          <w:rFonts w:ascii="Times New Roman" w:hAnsi="Times New Roman" w:cs="Times New Roman" w:eastAsia="宋体"/>
+        </w:rPr>
         <w:drawing>
           <wp:inline xmlns:a="http://schemas.openxmlformats.org/drawingml/2006/main" xmlns:pic="http://schemas.openxmlformats.org/drawingml/2006/picture">
-            <wp:extent cx="6120000" cy="2703172"/>
+            <wp:extent cx="6120000" cy="2703000"/>
             <wp:docPr id="1" name="Picture 1"/>
             <wp:cNvGraphicFramePr>
               <a:graphicFrameLocks noChangeAspect="1"/>
@@ -742,7 +812,7 @@
                   <pic:spPr>
                     <a:xfrm>
                       <a:off x="0" y="0"/>
-                      <a:ext cx="6120000" cy="2703172"/>
+                      <a:ext cx="6120000" cy="2703000"/>
                     </a:xfrm>
                     <a:prstGeom prst="rect"/>
                   </pic:spPr>
@@ -759,6 +829,10 @@
         <w:spacing w:before="180" w:after="100"/>
       </w:pPr>
       <w:r>
+        <w:rPr>
+          <w:rFonts w:ascii="Times New Roman" w:hAnsi="Times New Roman" w:cs="Times New Roman" w:eastAsia="黑体"/>
+          <w:b w:val="0"/>
+        </w:rPr>
         <w:t>2.2 历史版本内嵌的取舍</w:t>
       </w:r>
     </w:p>
@@ -769,6 +843,9 @@
         <w:ind w:firstLine="420"/>
       </w:pPr>
       <w:r>
+        <w:rPr>
+          <w:rFonts w:ascii="Times New Roman" w:hAnsi="Times New Roman" w:cs="Times New Roman" w:eastAsia="宋体"/>
+        </w:rPr>
         <w:t>版本、当前指针和修订号同文档保存，以所有者和原revision为更新条件，一次写入历史和指针。两个请求使用同一修订号时，一个成功，另一个返回409，避免覆盖修改。</w:t>
       </w:r>
     </w:p>
@@ -779,6 +856,9 @@
         <w:ind w:firstLine="420"/>
       </w:pPr>
       <w:r>
+        <w:rPr>
+          <w:rFonts w:ascii="Times New Roman" w:hAnsi="Times New Roman" w:cs="Times New Roman" w:eastAsia="宋体"/>
+        </w:rPr>
         <w:t>内嵌历史便于整体读取和原子更新，但不能无限增长。当前每题最多保留100个已提交版本，达到上限时明确拒绝继续追加；如果后续版本量明显增加，可将历史拆成独立集合。这个限制是本项目的实现选择，不是课程指定的MongoDB结构。</w:t>
       </w:r>
     </w:p>
@@ -789,6 +869,9 @@
         <w:ind w:firstLine="420"/>
       </w:pPr>
       <w:r>
+        <w:rPr>
+          <w:rFonts w:ascii="Times New Roman" w:hAnsi="Times New Roman" w:cs="Times New Roman" w:eastAsia="宋体"/>
+        </w:rPr>
         <w:t>新增集合使用JSON Schema约束字段类型和必需字段；索引覆盖题库所有者、题目所有者、共享名单、题库分组及问卷中的来源题ID。旧五集合的验证器不在初始化时被替换，旧问卷不要求补齐source。当前完整结构导出为database/schema-stage2.json，第一阶段schema.json保留为历史证据。</w:t>
       </w:r>
     </w:p>
@@ -798,6 +881,10 @@
         <w:spacing w:before="200" w:after="100"/>
       </w:pPr>
       <w:r>
+        <w:rPr>
+          <w:rFonts w:ascii="Times New Roman" w:hAnsi="Times New Roman" w:cs="Times New Roman" w:eastAsia="黑体"/>
+          <w:b w:val="0"/>
+        </w:rPr>
         <w:t>三 版本管理与旧数据保护</w:t>
       </w:r>
     </w:p>
@@ -807,6 +894,10 @@
         <w:spacing w:before="180" w:after="100"/>
       </w:pPr>
       <w:r>
+        <w:rPr>
+          <w:rFonts w:ascii="Times New Roman" w:hAnsi="Times New Roman" w:cs="Times New Roman" w:eastAsia="黑体"/>
+          <w:b w:val="0"/>
+        </w:rPr>
         <w:t>3.1 工作稿 提交与恢复</w:t>
       </w:r>
     </w:p>
@@ -817,6 +908,9 @@
         <w:ind w:firstLine="420"/>
       </w:pPr>
       <w:r>
+        <w:rPr>
+          <w:rFonts w:ascii="Times New Roman" w:hAnsi="Times New Roman" w:cs="Times New Roman" w:eastAsia="宋体"/>
+        </w:rPr>
         <w:t>工作稿用于保存尚未提交为版本的修改，仅作者可见。保存工作稿不更改当前版本，其他用户和问卷只能选择已提交版本。提交时可指定任意已有版本作为父版本，因此同一来源题能够形成分支，而不是只能沿当前版本顺序覆盖。</w:t>
       </w:r>
     </w:p>
@@ -827,6 +921,9 @@
         <w:ind w:firstLine="420"/>
       </w:pPr>
       <w:r>
+        <w:rPr>
+          <w:rFonts w:ascii="Times New Roman" w:hAnsi="Times New Roman" w:cs="Times New Roman" w:eastAsia="宋体"/>
+        </w:rPr>
         <w:t>恢复操作把选定历史内容复制为一个新版本，parent_version记录恢复操作前的当前版本，restored_from记录恢复内容来自哪一版。这样既可以恢复旧题，又不丢掉恢复前的修改过程。revision表示并发修订次数，版本ID表示题目内容历史，两者没有混用。</w:t>
       </w:r>
     </w:p>
@@ -837,6 +934,7 @@
       </w:pPr>
       <w:r>
         <w:rPr>
+          <w:rFonts w:ascii="Times New Roman" w:hAnsi="Times New Roman" w:cs="Times New Roman" w:eastAsia="宋体"/>
           <w:sz w:val="19"/>
         </w:rPr>
         <w:t>图2 题目版本分支与恢复</w:t>
@@ -848,9 +946,12 @@
         <w:ind w:firstLine="0"/>
       </w:pPr>
       <w:r>
+        <w:rPr>
+          <w:rFonts w:ascii="Times New Roman" w:hAnsi="Times New Roman" w:cs="Times New Roman" w:eastAsia="宋体"/>
+        </w:rPr>
         <w:drawing>
           <wp:inline xmlns:a="http://schemas.openxmlformats.org/drawingml/2006/main" xmlns:pic="http://schemas.openxmlformats.org/drawingml/2006/picture">
-            <wp:extent cx="6120000" cy="2549426"/>
+            <wp:extent cx="6120000" cy="2550000"/>
             <wp:docPr id="2" name="Picture 2"/>
             <wp:cNvGraphicFramePr>
               <a:graphicFrameLocks noChangeAspect="1"/>
@@ -871,7 +972,7 @@
                   <pic:spPr>
                     <a:xfrm>
                       <a:off x="0" y="0"/>
-                      <a:ext cx="6120000" cy="2549426"/>
+                      <a:ext cx="6120000" cy="2550000"/>
                     </a:xfrm>
                     <a:prstGeom prst="rect"/>
                   </pic:spPr>
@@ -888,6 +989,10 @@
         <w:spacing w:before="180" w:after="100"/>
       </w:pPr>
       <w:r>
+        <w:rPr>
+          <w:rFonts w:ascii="Times New Roman" w:hAnsi="Times New Roman" w:cs="Times New Roman" w:eastAsia="黑体"/>
+          <w:b w:val="0"/>
+        </w:rPr>
         <w:t>3.2 复制题目与记录来源</w:t>
       </w:r>
     </w:p>
@@ -898,6 +1003,9 @@
         <w:ind w:firstLine="420"/>
       </w:pPr>
       <w:r>
+        <w:rPr>
+          <w:rFonts w:ascii="Times New Roman" w:hAnsi="Times New Roman" w:cs="Times New Roman" w:eastAsia="宋体"/>
+        </w:rPr>
         <w:t>导入时复制指定版本内容，设置本卷题号并记录来源ID、版本和定义摘要。题库改版不更新副本，旧问卷继续按原题解释答卷；采用新版由创建者明确选择。</w:t>
       </w:r>
     </w:p>
@@ -908,6 +1016,9 @@
         <w:ind w:firstLine="420"/>
       </w:pPr>
       <w:r>
+        <w:rPr>
+          <w:rFonts w:ascii="Times New Roman" w:hAnsi="Times New Roman" w:cs="Times New Roman" w:eastAsia="宋体"/>
+        </w:rPr>
         <w:t>如果在草稿问卷内调整了已导入题，来源信息由服务器保留，实际题目定义重新参与统计分组。题目标题、选项、题型、必答和校验变化都按定义变化处理，避免不同含义的答案被合并。局部题号和本卷跳转不属于定义摘要；跳转只改变路径，不改变这个来源题的内容。</w:t>
       </w:r>
     </w:p>
@@ -918,6 +1029,9 @@
         <w:ind w:firstLine="420"/>
       </w:pPr>
       <w:r>
+        <w:rPr>
+          <w:rFonts w:ascii="Times New Roman" w:hAnsi="Times New Roman" w:cs="Times New Roman" w:eastAsia="宋体"/>
+        </w:rPr>
         <w:t>从问卷存入题库时，指向本卷其他题号的跳转会被移除，接口和页面明确提示。直接把这些跳转复制到另一问卷，可能产生不存在的目标或错误路径，所以导入后由创建者在目标问卷重新配置。原有后端路径计算、必答检查和发布校验继续执行。</w:t>
       </w:r>
     </w:p>
@@ -927,6 +1041,10 @@
         <w:spacing w:before="180" w:after="100"/>
       </w:pPr>
       <w:r>
+        <w:rPr>
+          <w:rFonts w:ascii="Times New Roman" w:hAnsi="Times New Roman" w:cs="Times New Roman" w:eastAsia="黑体"/>
+          <w:b w:val="0"/>
+        </w:rPr>
         <w:t>3.3 共享边界</w:t>
       </w:r>
     </w:p>
@@ -937,6 +1055,9 @@
         <w:ind w:firstLine="420"/>
       </w:pPr>
       <w:r>
+        <w:rPr>
+          <w:rFonts w:ascii="Times New Roman" w:hAnsi="Times New Roman" w:cs="Times New Roman" w:eastAsia="宋体"/>
+        </w:rPr>
         <w:t>共享授予题目读取和导入权限，不授予修改原题或读取别人答卷的权限。共享对象使用已注册用户名，未知账号被拒绝；作者可以替换或清空名单。撤销后阻止新的读取和导入，已经导入的问卷副本继续可用。</w:t>
       </w:r>
     </w:p>
@@ -947,6 +1068,9 @@
         <w:ind w:firstLine="420"/>
       </w:pPr>
       <w:r>
+        <w:rPr>
+          <w:rFonts w:ascii="Times New Roman" w:hAnsi="Times New Roman" w:cs="Times New Roman" w:eastAsia="宋体"/>
+        </w:rPr>
         <w:t>题主可查本人问卷名称、题号、版本和本卷修改标识；外部引用只显示次数。跨卷统计先限制问卷所有者，再按来源查答卷，不返回他人标题、链接或答案。全局统计需另行明确授权及匿名汇总规则。</w:t>
       </w:r>
     </w:p>
@@ -956,6 +1080,10 @@
         <w:spacing w:before="200" w:after="100"/>
       </w:pPr>
       <w:r>
+        <w:rPr>
+          <w:rFonts w:ascii="Times New Roman" w:hAnsi="Times New Roman" w:cs="Times New Roman" w:eastAsia="黑体"/>
+          <w:b w:val="0"/>
+        </w:rPr>
         <w:t>四 MongoDB操作与统计口径</w:t>
       </w:r>
     </w:p>
@@ -966,6 +1094,9 @@
         <w:ind w:firstLine="420"/>
       </w:pPr>
       <w:r>
+        <w:rPr>
+          <w:rFonts w:ascii="Times New Roman" w:hAnsi="Times New Roman" w:cs="Times New Roman" w:eastAsia="宋体"/>
+        </w:rPr>
         <w:t>跨卷统计沿用MongoDB聚合，由问卷中的source查找同一来源题的使用位置，再从本人问卷的正式答卷展开answers。每个回答按“来源版本ID与实际定义摘要”分组。同一题在两份问卷中各回答一次计为两次作答，分母不是去重人数；跳过题和明确空答不会生成有效答案记录。</w:t>
       </w:r>
     </w:p>
@@ -976,6 +1107,9 @@
         <w:ind w:firstLine="420"/>
       </w:pPr>
       <w:r>
+        <w:rPr>
+          <w:rFonts w:ascii="Times New Roman" w:hAnsi="Times New Roman" w:cs="Times New Roman" w:eastAsia="宋体"/>
+        </w:rPr>
         <w:t>单选和多选使用展开与分组计算各选项次数。多选每项占比除以该题有效作答次数，合计可以超过100%。数字题使用平均、最小、最大聚合，并通过$bucketAuto生成最多10个自适应区间；区间左端包含、右端不含，最后区间包含右端。不同分组的区间由各自数据生成，不能把它们当作统一年龄段直接比较。</w:t>
       </w:r>
     </w:p>
@@ -986,6 +1120,9 @@
         <w:ind w:firstLine="420"/>
       </w:pPr>
       <w:r>
+        <w:rPr>
+          <w:rFonts w:ascii="Times New Roman" w:hAnsi="Times New Roman" w:cs="Times New Roman" w:eastAsia="宋体"/>
+        </w:rPr>
         <w:t>文本题按提交时间及答卷ID排序，每页20条；总作答次数与当前页内容分开返回。数字0参与平均，空数字组返回null均值和空分布。统计使用同一个$facet输入完成分支汇总，避免为总数与选项次数分别读取带来的结果差异。选项分支只处理选择题，文本不会进入无意义的选项汇总。</w:t>
       </w:r>
     </w:p>
@@ -996,6 +1133,7 @@
       </w:pPr>
       <w:r>
         <w:rPr>
+          <w:rFonts w:ascii="Times New Roman" w:hAnsi="Times New Roman" w:cs="Times New Roman" w:eastAsia="宋体"/>
           <w:sz w:val="19"/>
         </w:rPr>
         <w:t>表3 本次扩展实际使用的MongoDB能力</w:t>
@@ -1033,11 +1171,13 @@
           </w:tcPr>
           <w:p>
             <w:pPr>
+              <w:keepNext/>
               <w:spacing w:after="60" w:before="60" w:line="324" w:lineRule="auto"/>
             </w:pPr>
             <w:r>
               <w:rPr>
-                <w:b/>
+                <w:rFonts w:ascii="Times New Roman" w:hAnsi="Times New Roman" w:cs="Times New Roman" w:eastAsia="黑体"/>
+                <w:b w:val="0"/>
                 <w:sz w:val="18"/>
               </w:rPr>
               <w:t>操作</w:t>
@@ -1053,11 +1193,13 @@
           </w:tcPr>
           <w:p>
             <w:pPr>
+              <w:keepNext/>
               <w:spacing w:after="60" w:before="60" w:line="324" w:lineRule="auto"/>
             </w:pPr>
             <w:r>
               <w:rPr>
-                <w:b/>
+                <w:rFonts w:ascii="Times New Roman" w:hAnsi="Times New Roman" w:cs="Times New Roman" w:eastAsia="黑体"/>
+                <w:b w:val="0"/>
                 <w:sz w:val="18"/>
               </w:rPr>
               <w:t>用途</w:t>
@@ -1073,11 +1215,13 @@
           </w:tcPr>
           <w:p>
             <w:pPr>
+              <w:keepNext/>
               <w:spacing w:after="60" w:before="60" w:line="324" w:lineRule="auto"/>
             </w:pPr>
             <w:r>
               <w:rPr>
-                <w:b/>
+                <w:rFonts w:ascii="Times New Roman" w:hAnsi="Times New Roman" w:cs="Times New Roman" w:eastAsia="黑体"/>
+                <w:b w:val="0"/>
                 <w:sz w:val="18"/>
               </w:rPr>
               <w:t>实现依据</w:t>
@@ -1096,6 +1240,7 @@
             </w:pPr>
             <w:r>
               <w:rPr>
+                <w:rFonts w:ascii="Times New Roman" w:hAnsi="Times New Roman" w:cs="Times New Roman" w:eastAsia="宋体"/>
                 <w:b w:val="0"/>
                 <w:sz w:val="18"/>
               </w:rPr>
@@ -1113,6 +1258,7 @@
             </w:pPr>
             <w:r>
               <w:rPr>
+                <w:rFonts w:ascii="Times New Roman" w:hAnsi="Times New Roman" w:cs="Times New Roman" w:eastAsia="宋体"/>
                 <w:b w:val="0"/>
                 <w:sz w:val="18"/>
               </w:rPr>
@@ -1130,6 +1276,7 @@
             </w:pPr>
             <w:r>
               <w:rPr>
+                <w:rFonts w:ascii="Times New Roman" w:hAnsi="Times New Roman" w:cs="Times New Roman" w:eastAsia="宋体"/>
                 <w:b w:val="0"/>
                 <w:sz w:val="18"/>
               </w:rPr>
@@ -1149,6 +1296,7 @@
             </w:pPr>
             <w:r>
               <w:rPr>
+                <w:rFonts w:ascii="Times New Roman" w:hAnsi="Times New Roman" w:cs="Times New Roman" w:eastAsia="宋体"/>
                 <w:b w:val="0"/>
                 <w:sz w:val="18"/>
               </w:rPr>
@@ -1166,6 +1314,7 @@
             </w:pPr>
             <w:r>
               <w:rPr>
+                <w:rFonts w:ascii="Times New Roman" w:hAnsi="Times New Roman" w:cs="Times New Roman" w:eastAsia="宋体"/>
                 <w:b w:val="0"/>
                 <w:sz w:val="18"/>
               </w:rPr>
@@ -1183,6 +1332,7 @@
             </w:pPr>
             <w:r>
               <w:rPr>
+                <w:rFonts w:ascii="Times New Roman" w:hAnsi="Times New Roman" w:cs="Times New Roman" w:eastAsia="宋体"/>
                 <w:b w:val="0"/>
                 <w:sz w:val="18"/>
               </w:rPr>
@@ -1202,6 +1352,7 @@
             </w:pPr>
             <w:r>
               <w:rPr>
+                <w:rFonts w:ascii="Times New Roman" w:hAnsi="Times New Roman" w:cs="Times New Roman" w:eastAsia="宋体"/>
                 <w:b w:val="0"/>
                 <w:sz w:val="18"/>
               </w:rPr>
@@ -1219,6 +1370,7 @@
             </w:pPr>
             <w:r>
               <w:rPr>
+                <w:rFonts w:ascii="Times New Roman" w:hAnsi="Times New Roman" w:cs="Times New Roman" w:eastAsia="宋体"/>
                 <w:b w:val="0"/>
                 <w:sz w:val="18"/>
               </w:rPr>
@@ -1236,6 +1388,7 @@
             </w:pPr>
             <w:r>
               <w:rPr>
+                <w:rFonts w:ascii="Times New Roman" w:hAnsi="Times New Roman" w:cs="Times New Roman" w:eastAsia="宋体"/>
                 <w:b w:val="0"/>
                 <w:sz w:val="18"/>
               </w:rPr>
@@ -1255,6 +1408,7 @@
             </w:pPr>
             <w:r>
               <w:rPr>
+                <w:rFonts w:ascii="Times New Roman" w:hAnsi="Times New Roman" w:cs="Times New Roman" w:eastAsia="宋体"/>
                 <w:b w:val="0"/>
                 <w:sz w:val="18"/>
               </w:rPr>
@@ -1272,6 +1426,7 @@
             </w:pPr>
             <w:r>
               <w:rPr>
+                <w:rFonts w:ascii="Times New Roman" w:hAnsi="Times New Roman" w:cs="Times New Roman" w:eastAsia="宋体"/>
                 <w:b w:val="0"/>
                 <w:sz w:val="18"/>
               </w:rPr>
@@ -1289,6 +1444,7 @@
             </w:pPr>
             <w:r>
               <w:rPr>
+                <w:rFonts w:ascii="Times New Roman" w:hAnsi="Times New Roman" w:cs="Times New Roman" w:eastAsia="宋体"/>
                 <w:b w:val="0"/>
                 <w:sz w:val="18"/>
               </w:rPr>
@@ -1304,6 +1460,10 @@
         <w:spacing w:before="200" w:after="100"/>
       </w:pPr>
       <w:r>
+        <w:rPr>
+          <w:rFonts w:ascii="Times New Roman" w:hAnsi="Times New Roman" w:cs="Times New Roman" w:eastAsia="黑体"/>
+          <w:b w:val="0"/>
+        </w:rPr>
         <w:t>五 测试与兼容性验证</w:t>
       </w:r>
     </w:p>
@@ -1314,6 +1474,9 @@
         <w:ind w:firstLine="420"/>
       </w:pPr>
       <w:r>
+        <w:rPr>
+          <w:rFonts w:ascii="Times New Roman" w:hAnsi="Times New Roman" w:cs="Times New Roman" w:eastAsia="宋体"/>
+        </w:rPr>
         <w:t>测试采用Python assert、真实MongoDB API测试和Playwright浏览器检查。自动测试创建随机survey_test_数据库，结束时清理；浏览器使用独立测试库，不清空原业务库。2026年10月28日本轮52项测试全部通过，其中原第一阶段38项保留，新增14项覆盖题库与统计；实际时间和逐项结果在tests/results/stage2-latest.json。</w:t>
       </w:r>
     </w:p>
@@ -1324,6 +1487,7 @@
       </w:pPr>
       <w:r>
         <w:rPr>
+          <w:rFonts w:ascii="Times New Roman" w:hAnsi="Times New Roman" w:cs="Times New Roman" w:eastAsia="宋体"/>
           <w:sz w:val="19"/>
         </w:rPr>
         <w:t>表4 第二阶段的主要验证</w:t>
@@ -1361,11 +1525,13 @@
           </w:tcPr>
           <w:p>
             <w:pPr>
+              <w:keepNext/>
               <w:spacing w:after="60" w:before="60" w:line="324" w:lineRule="auto"/>
             </w:pPr>
             <w:r>
               <w:rPr>
-                <w:b/>
+                <w:rFonts w:ascii="Times New Roman" w:hAnsi="Times New Roman" w:cs="Times New Roman" w:eastAsia="黑体"/>
+                <w:b w:val="0"/>
                 <w:sz w:val="18"/>
               </w:rPr>
               <w:t>场景与输入</w:t>
@@ -1381,11 +1547,13 @@
           </w:tcPr>
           <w:p>
             <w:pPr>
+              <w:keepNext/>
               <w:spacing w:after="60" w:before="60" w:line="324" w:lineRule="auto"/>
             </w:pPr>
             <w:r>
               <w:rPr>
-                <w:b/>
+                <w:rFonts w:ascii="Times New Roman" w:hAnsi="Times New Roman" w:cs="Times New Roman" w:eastAsia="黑体"/>
+                <w:b w:val="0"/>
                 <w:sz w:val="18"/>
               </w:rPr>
               <w:t>期望结果</w:t>
@@ -1401,11 +1569,13 @@
           </w:tcPr>
           <w:p>
             <w:pPr>
+              <w:keepNext/>
               <w:spacing w:after="60" w:before="60" w:line="324" w:lineRule="auto"/>
             </w:pPr>
             <w:r>
               <w:rPr>
-                <w:b/>
+                <w:rFonts w:ascii="Times New Roman" w:hAnsi="Times New Roman" w:cs="Times New Roman" w:eastAsia="黑体"/>
+                <w:b w:val="0"/>
                 <w:sz w:val="18"/>
               </w:rPr>
               <w:t>实际结果</w:t>
@@ -1424,6 +1594,7 @@
             </w:pPr>
             <w:r>
               <w:rPr>
+                <w:rFonts w:ascii="Times New Roman" w:hAnsi="Times New Roman" w:cs="Times New Roman" w:eastAsia="宋体"/>
                 <w:b w:val="0"/>
                 <w:sz w:val="18"/>
               </w:rPr>
@@ -1441,6 +1612,7 @@
             </w:pPr>
             <w:r>
               <w:rPr>
+                <w:rFonts w:ascii="Times New Roman" w:hAnsi="Times New Roman" w:cs="Times New Roman" w:eastAsia="宋体"/>
                 <w:b w:val="0"/>
                 <w:sz w:val="18"/>
               </w:rPr>
@@ -1458,6 +1630,7 @@
             </w:pPr>
             <w:r>
               <w:rPr>
+                <w:rFonts w:ascii="Times New Roman" w:hAnsi="Times New Roman" w:cs="Times New Roman" w:eastAsia="宋体"/>
                 <w:b w:val="0"/>
                 <w:sz w:val="18"/>
               </w:rPr>
@@ -1477,6 +1650,7 @@
             </w:pPr>
             <w:r>
               <w:rPr>
+                <w:rFonts w:ascii="Times New Roman" w:hAnsi="Times New Roman" w:cs="Times New Roman" w:eastAsia="宋体"/>
                 <w:b w:val="0"/>
                 <w:sz w:val="18"/>
               </w:rPr>
@@ -1494,6 +1668,7 @@
             </w:pPr>
             <w:r>
               <w:rPr>
+                <w:rFonts w:ascii="Times New Roman" w:hAnsi="Times New Roman" w:cs="Times New Roman" w:eastAsia="宋体"/>
                 <w:b w:val="0"/>
                 <w:sz w:val="18"/>
               </w:rPr>
@@ -1511,6 +1686,7 @@
             </w:pPr>
             <w:r>
               <w:rPr>
+                <w:rFonts w:ascii="Times New Roman" w:hAnsi="Times New Roman" w:cs="Times New Roman" w:eastAsia="宋体"/>
                 <w:b w:val="0"/>
                 <w:sz w:val="18"/>
               </w:rPr>
@@ -1530,6 +1706,7 @@
             </w:pPr>
             <w:r>
               <w:rPr>
+                <w:rFonts w:ascii="Times New Roman" w:hAnsi="Times New Roman" w:cs="Times New Roman" w:eastAsia="宋体"/>
                 <w:b w:val="0"/>
                 <w:sz w:val="18"/>
               </w:rPr>
@@ -1547,6 +1724,7 @@
             </w:pPr>
             <w:r>
               <w:rPr>
+                <w:rFonts w:ascii="Times New Roman" w:hAnsi="Times New Roman" w:cs="Times New Roman" w:eastAsia="宋体"/>
                 <w:b w:val="0"/>
                 <w:sz w:val="18"/>
               </w:rPr>
@@ -1564,6 +1742,7 @@
             </w:pPr>
             <w:r>
               <w:rPr>
+                <w:rFonts w:ascii="Times New Roman" w:hAnsi="Times New Roman" w:cs="Times New Roman" w:eastAsia="宋体"/>
                 <w:b w:val="0"/>
                 <w:sz w:val="18"/>
               </w:rPr>
@@ -1583,6 +1762,7 @@
             </w:pPr>
             <w:r>
               <w:rPr>
+                <w:rFonts w:ascii="Times New Roman" w:hAnsi="Times New Roman" w:cs="Times New Roman" w:eastAsia="宋体"/>
                 <w:b w:val="0"/>
                 <w:sz w:val="18"/>
               </w:rPr>
@@ -1600,6 +1780,7 @@
             </w:pPr>
             <w:r>
               <w:rPr>
+                <w:rFonts w:ascii="Times New Roman" w:hAnsi="Times New Roman" w:cs="Times New Roman" w:eastAsia="宋体"/>
                 <w:b w:val="0"/>
                 <w:sz w:val="18"/>
               </w:rPr>
@@ -1617,6 +1798,7 @@
             </w:pPr>
             <w:r>
               <w:rPr>
+                <w:rFonts w:ascii="Times New Roman" w:hAnsi="Times New Roman" w:cs="Times New Roman" w:eastAsia="宋体"/>
                 <w:b w:val="0"/>
                 <w:sz w:val="18"/>
               </w:rPr>
@@ -1636,6 +1818,7 @@
             </w:pPr>
             <w:r>
               <w:rPr>
+                <w:rFonts w:ascii="Times New Roman" w:hAnsi="Times New Roman" w:cs="Times New Roman" w:eastAsia="宋体"/>
                 <w:b w:val="0"/>
                 <w:sz w:val="18"/>
               </w:rPr>
@@ -1653,6 +1836,7 @@
             </w:pPr>
             <w:r>
               <w:rPr>
+                <w:rFonts w:ascii="Times New Roman" w:hAnsi="Times New Roman" w:cs="Times New Roman" w:eastAsia="宋体"/>
                 <w:b w:val="0"/>
                 <w:sz w:val="18"/>
               </w:rPr>
@@ -1670,6 +1854,7 @@
             </w:pPr>
             <w:r>
               <w:rPr>
+                <w:rFonts w:ascii="Times New Roman" w:hAnsi="Times New Roman" w:cs="Times New Roman" w:eastAsia="宋体"/>
                 <w:b w:val="0"/>
                 <w:sz w:val="18"/>
               </w:rPr>
@@ -1689,6 +1874,7 @@
             </w:pPr>
             <w:r>
               <w:rPr>
+                <w:rFonts w:ascii="Times New Roman" w:hAnsi="Times New Roman" w:cs="Times New Roman" w:eastAsia="宋体"/>
                 <w:b w:val="0"/>
                 <w:sz w:val="18"/>
               </w:rPr>
@@ -1706,6 +1892,7 @@
             </w:pPr>
             <w:r>
               <w:rPr>
+                <w:rFonts w:ascii="Times New Roman" w:hAnsi="Times New Roman" w:cs="Times New Roman" w:eastAsia="宋体"/>
                 <w:b w:val="0"/>
                 <w:sz w:val="18"/>
               </w:rPr>
@@ -1723,6 +1910,7 @@
             </w:pPr>
             <w:r>
               <w:rPr>
+                <w:rFonts w:ascii="Times New Roman" w:hAnsi="Times New Roman" w:cs="Times New Roman" w:eastAsia="宋体"/>
                 <w:b w:val="0"/>
                 <w:sz w:val="18"/>
               </w:rPr>
@@ -1742,6 +1930,7 @@
             </w:pPr>
             <w:r>
               <w:rPr>
+                <w:rFonts w:ascii="Times New Roman" w:hAnsi="Times New Roman" w:cs="Times New Roman" w:eastAsia="宋体"/>
                 <w:b w:val="0"/>
                 <w:sz w:val="18"/>
               </w:rPr>
@@ -1759,6 +1948,7 @@
             </w:pPr>
             <w:r>
               <w:rPr>
+                <w:rFonts w:ascii="Times New Roman" w:hAnsi="Times New Roman" w:cs="Times New Roman" w:eastAsia="宋体"/>
                 <w:b w:val="0"/>
                 <w:sz w:val="18"/>
               </w:rPr>
@@ -1776,6 +1966,7 @@
             </w:pPr>
             <w:r>
               <w:rPr>
+                <w:rFonts w:ascii="Times New Roman" w:hAnsi="Times New Roman" w:cs="Times New Roman" w:eastAsia="宋体"/>
                 <w:b w:val="0"/>
                 <w:sz w:val="18"/>
               </w:rPr>
@@ -1795,6 +1986,7 @@
             </w:pPr>
             <w:r>
               <w:rPr>
+                <w:rFonts w:ascii="Times New Roman" w:hAnsi="Times New Roman" w:cs="Times New Roman" w:eastAsia="宋体"/>
                 <w:b w:val="0"/>
                 <w:sz w:val="18"/>
               </w:rPr>
@@ -1812,6 +2004,7 @@
             </w:pPr>
             <w:r>
               <w:rPr>
+                <w:rFonts w:ascii="Times New Roman" w:hAnsi="Times New Roman" w:cs="Times New Roman" w:eastAsia="宋体"/>
                 <w:b w:val="0"/>
                 <w:sz w:val="18"/>
               </w:rPr>
@@ -1829,6 +2022,7 @@
             </w:pPr>
             <w:r>
               <w:rPr>
+                <w:rFonts w:ascii="Times New Roman" w:hAnsi="Times New Roman" w:cs="Times New Roman" w:eastAsia="宋体"/>
                 <w:b w:val="0"/>
                 <w:sz w:val="18"/>
               </w:rPr>
@@ -1845,6 +2039,9 @@
         <w:ind w:firstLine="420"/>
       </w:pPr>
       <w:r>
+        <w:rPr>
+          <w:rFonts w:ascii="Times New Roman" w:hAnsi="Times New Roman" w:cs="Times New Roman" w:eastAsia="宋体"/>
+        </w:rPr>
         <w:t>浏览器检查分为单账号题库流程和双账号连续验收。前者验证创建、工作稿、历史恢复、数字分布、文本翻页及390px宽度布局；后者使用两个隔离会话，通过页面完成共享、旧版本导入、发布填写、改版、撤销和恢复。接收者旧问卷保持原内容，双方分别得到自己的统计结果，题主看不到外部问卷名称。检查由Playwright执行，结果分别保存于stage2-browser.json和stage2-acceptance.json。</w:t>
       </w:r>
     </w:p>
@@ -1855,6 +2052,9 @@
         <w:ind w:firstLine="420"/>
       </w:pPr>
       <w:r>
+        <w:rPr>
+          <w:rFonts w:ascii="Times New Roman" w:hAnsi="Times New Roman" w:cs="Times New Roman" w:eastAsia="宋体"/>
+        </w:rPr>
         <w:t>另从Git导出独立源码，在全新虚拟环境执行requirements.txt安装，连接空的独立MongoDB数据目录启动服务。健康检查和七集合初始化通过，随后在该环境完成52项回归与双账号验收。环境及依赖明细见tests/results/stage2-reproduction.json。兼容性通过原接口、无来源问卷、发布冻结和提交路径的回归测试验证。旧答卷不因本次初始化或题库更新被迁移覆盖。当前验证未覆盖大规模题目引用、高并发压测或全部浏览器；不能由52项通过推断这些范围也已验证。</w:t>
       </w:r>
     </w:p>
@@ -1864,6 +2064,10 @@
         <w:spacing w:before="200" w:after="100"/>
       </w:pPr>
       <w:r>
+        <w:rPr>
+          <w:rFonts w:ascii="Times New Roman" w:hAnsi="Times New Roman" w:cs="Times New Roman" w:eastAsia="黑体"/>
+          <w:b w:val="0"/>
+        </w:rPr>
         <w:t>六 AI使用过程与问题修正</w:t>
       </w:r>
     </w:p>
@@ -1873,6 +2077,10 @@
         <w:spacing w:before="180" w:after="100"/>
       </w:pPr>
       <w:r>
+        <w:rPr>
+          <w:rFonts w:ascii="Times New Roman" w:hAnsi="Times New Roman" w:cs="Times New Roman" w:eastAsia="黑体"/>
+          <w:b w:val="0"/>
+        </w:rPr>
         <w:t>6.1 需求引导与任务拆分</w:t>
       </w:r>
     </w:p>
@@ -1883,6 +2091,9 @@
         <w:ind w:firstLine="420"/>
       </w:pPr>
       <w:r>
+        <w:rPr>
+          <w:rFonts w:ascii="Times New Roman" w:hAnsi="Times New Roman" w:cs="Times New Roman" w:eastAsia="宋体"/>
+        </w:rPr>
         <w:t>本项目使用Codex辅助需求分析、数据库设计、接口实现和测试。我先提供作业文件及课堂补充，要求后端和MongoDB优先、保留第一阶段功能与旧数据，并按阶段交付。第二阶段以八项变更需求为输入，把题目复用、历史关系、旧问卷保护、共享权限和统计分别列为验收条件，避免只给出“做一个题库”的笼统目标。</w:t>
       </w:r>
     </w:p>
@@ -1893,6 +2104,9 @@
         <w:ind w:firstLine="420"/>
       </w:pPr>
       <w:r>
+        <w:rPr>
+          <w:rFonts w:ascii="Times New Roman" w:hAnsi="Times New Roman" w:cs="Times New Roman" w:eastAsia="宋体"/>
+        </w:rPr>
         <w:t>在这些约束下，AI提出两个新增集合、工作稿与已提交版本分离、导入时复制定义并记录来源等方案，并承担主要编码工作。我的参与集中在提供课程要求、确定阶段顺序、要求保留已有成果和反馈交付内容；具体字段设计、程序修改及自动测试执行由AI完成。原始指令、修改位置与结果在ai_logs中保留，报告按技术问题归纳协作过程。</w:t>
       </w:r>
     </w:p>
@@ -1902,6 +2116,10 @@
         <w:spacing w:before="180" w:after="100"/>
       </w:pPr>
       <w:r>
+        <w:rPr>
+          <w:rFonts w:ascii="Times New Roman" w:hAnsi="Times New Roman" w:cs="Times New Roman" w:eastAsia="黑体"/>
+          <w:b w:val="0"/>
+        </w:rPr>
         <w:t>6.2 方案调整与验证依据</w:t>
       </w:r>
     </w:p>
@@ -1912,6 +2130,9 @@
         <w:ind w:firstLine="420"/>
       </w:pPr>
       <w:r>
+        <w:rPr>
+          <w:rFonts w:ascii="Times New Roman" w:hAnsi="Times New Roman" w:cs="Times New Roman" w:eastAsia="宋体"/>
+        </w:rPr>
         <w:t>版本管理需要同时回答两个问题：修改历史能否保留，已经收集的答案是否仍按原含义解释。若问卷显示时直接读取源题，题库改版会影响旧问卷；若完全复制而不记来源，又难以查使用位置和跨卷汇总。AI据此采用“题库保留不可变版本，问卷保存独立副本和来源”的结构，通过同文档条件更新保护历史，通过内容副本保护已发布问卷。</w:t>
       </w:r>
     </w:p>
@@ -1922,6 +2143,9 @@
         <w:ind w:firstLine="420"/>
       </w:pPr>
       <w:r>
+        <w:rPr>
+          <w:rFonts w:ascii="Times New Roman" w:hAnsi="Times New Roman" w:cs="Times New Roman" w:eastAsia="宋体"/>
+        </w:rPr>
         <w:t>共享的边界也需要单独检查。能够导入他人的题目，不代表可以查看其答卷。因此接口先限制问卷所有者，再处理来源题的统计；使用位置只向题主返回外部引用数。自动测试让两个账号各提交不同选项，验证彼此的统计不混入对方数据；双浏览器验收进一步检查共享、填写、改版和撤销后的连续行为。</w:t>
       </w:r>
     </w:p>
@@ -1932,6 +2156,9 @@
         <w:ind w:firstLine="420"/>
       </w:pPr>
       <w:r>
+        <w:rPr>
+          <w:rFonts w:ascii="Times New Roman" w:hAnsi="Times New Roman" w:cs="Times New Roman" w:eastAsia="宋体"/>
+        </w:rPr>
         <w:t>对未明确的细节，设计文档说明当前约定：不建新版时只保存私有工作稿；恢复通过追加版本保留过程；不同版本和本卷改动的定义分组统计。这些是AI辅助实现时采用的方案，保留在文档中供后续需求变化时调整。</w:t>
       </w:r>
     </w:p>
@@ -1941,6 +2168,10 @@
         <w:spacing w:before="180" w:after="100"/>
       </w:pPr>
       <w:r>
+        <w:rPr>
+          <w:rFonts w:ascii="Times New Roman" w:hAnsi="Times New Roman" w:cs="Times New Roman" w:eastAsia="黑体"/>
+          <w:b w:val="0"/>
+        </w:rPr>
         <w:t>6.3 AI输出中发现的问题</w:t>
       </w:r>
     </w:p>
@@ -1951,6 +2182,9 @@
         <w:ind w:firstLine="420"/>
       </w:pPr>
       <w:r>
+        <w:rPr>
+          <w:rFonts w:ascii="Times New Roman" w:hAnsi="Times New Roman" w:cs="Times New Roman" w:eastAsia="宋体"/>
+        </w:rPr>
         <w:t>首轮数字题跨卷统计只返回平均值，用0与8验证平均为4后便通过了测试。但正式需求以“年龄分布”为例，仅有均值无法反映分布。重新核对后，AI补充最小值、最大值和MongoDB自动分桶，并增加空组、空答和分桶次数合计测试。这一修正将检查范围从计算正确扩展到返回内容能否回答业务问题。</w:t>
       </w:r>
     </w:p>
@@ -1961,6 +2195,9 @@
         <w:ind w:firstLine="420"/>
       </w:pPr>
       <w:r>
+        <w:rPr>
+          <w:rFonts w:ascii="Times New Roman" w:hAnsi="Times New Roman" w:cs="Times New Roman" w:eastAsia="宋体"/>
+        </w:rPr>
         <w:t>文本回答最初通过聚合一次收集全部内容，选项汇总分支也接收了文本回答。只在页面截取前20条，仍不能解决后端返回量的问题。AI将文本分页放入聚合分支，按时间和答卷ID稳定排序，同时限制选项分支只处理选择题。23条答卷验证了20条和3条两页的内容及顺序；该测试验证功能正确性，未用于推算大规模性能。</w:t>
       </w:r>
     </w:p>
@@ -1971,6 +2208,9 @@
         <w:ind w:firstLine="420"/>
       </w:pPr>
       <w:r>
+        <w:rPr>
+          <w:rFonts w:ascii="Times New Roman" w:hAnsi="Times New Roman" w:cs="Times New Roman" w:eastAsia="宋体"/>
+        </w:rPr>
         <w:t>页面检查发现，共享接收者的编辑表单隐藏后，没有独立的题目预览。AI补上只读版本预览，使接收者能够看清内容后再导入。测试脚本也出现过将注册视为自动登录的错误，等待账号标识超时；核对应用的“注册后登录”流程后，脚本增加登录步骤再执行通过。代码和测试都需要核对，测试失败应先分清产品行为与脚本假设。</w:t>
       </w:r>
     </w:p>
@@ -1980,6 +2220,10 @@
         <w:spacing w:before="180" w:after="100"/>
       </w:pPr>
       <w:r>
+        <w:rPr>
+          <w:rFonts w:ascii="Times New Roman" w:hAnsi="Times New Roman" w:cs="Times New Roman" w:eastAsia="黑体"/>
+          <w:b w:val="0"/>
+        </w:rPr>
         <w:t>6.4 分工与后续改进</w:t>
       </w:r>
     </w:p>
@@ -1990,6 +2234,9 @@
         <w:ind w:firstLine="420"/>
       </w:pPr>
       <w:r>
+        <w:rPr>
+          <w:rFonts w:ascii="Times New Roman" w:hAnsi="Times New Roman" w:cs="Times New Roman" w:eastAsia="宋体"/>
+        </w:rPr>
         <w:t>AI帮助较大的是将需求拆成接口、Schema和可执行用例，并在修正后重复验证。需要保留人工约束的地方是业务范围和交付目标，例如后端优先、旧成果兼容、测试与报告对应。一次正常请求或一段完整说明都不足以代替验收，后续修改仍应检查数据库实际结果、权限边界和测试输入。</w:t>
       </w:r>
     </w:p>
@@ -2000,6 +2247,9 @@
         <w:ind w:firstLine="420"/>
       </w:pPr>
       <w:r>
+        <w:rPr>
+          <w:rFonts w:ascii="Times New Roman" w:hAnsi="Times New Roman" w:cs="Times New Roman" w:eastAsia="宋体"/>
+        </w:rPr>
         <w:t>版本、权限与旧答卷保护的检查依据及修正记录见ai_logs中的阶段二开发和验收日志。</w:t>
       </w:r>
     </w:p>
@@ -2009,6 +2259,10 @@
         <w:spacing w:before="200" w:after="100"/>
       </w:pPr>
       <w:r>
+        <w:rPr>
+          <w:rFonts w:ascii="Times New Roman" w:hAnsi="Times New Roman" w:cs="Times New Roman" w:eastAsia="黑体"/>
+          <w:b w:val="0"/>
+        </w:rPr>
         <w:t>七 总结与当前限制</w:t>
       </w:r>
     </w:p>
@@ -2019,6 +2273,9 @@
         <w:ind w:firstLine="420"/>
       </w:pPr>
       <w:r>
+        <w:rPr>
+          <w:rFonts w:ascii="Times New Roman" w:hAnsi="Times New Roman" w:cs="Times New Roman" w:eastAsia="宋体"/>
+        </w:rPr>
         <w:t>本阶段通过题库来源和版本历史支持复用与共享，用条件更新保护历史、内容副本保护旧问卷、定义分组保持统计口径。MongoDB嵌套查询、聚合、分桶、验证器及索引对应具体业务，并有实际测试记录。</w:t>
       </w:r>
     </w:p>
@@ -2029,6 +2286,9 @@
         <w:ind w:firstLine="420"/>
       </w:pPr>
       <w:r>
+        <w:rPr>
+          <w:rFonts w:ascii="Times New Roman" w:hAnsi="Times New Roman" w:cs="Times New Roman" w:eastAsia="宋体"/>
+        </w:rPr>
         <w:t>当前每题最多100版，跨卷统计限本人问卷，数字分布自适应分桶，不提供删除引用源题的入口；扩展这些边界需先明确授权和数据量。源码、设计、API、测试及可编辑报告在同一仓库，后续可继续调整。</w:t>
       </w:r>
     </w:p>
@@ -2039,6 +2299,10 @@
         <w:spacing w:before="200" w:after="100"/>
       </w:pPr>
       <w:r>
+        <w:rPr>
+          <w:rFonts w:ascii="Times New Roman" w:hAnsi="Times New Roman" w:cs="Times New Roman" w:eastAsia="黑体"/>
+          <w:b w:val="0"/>
+        </w:rPr>
         <w:t>附录 页面与结果展示</w:t>
       </w:r>
     </w:p>
@@ -2049,6 +2313,9 @@
         <w:ind w:firstLine="420"/>
       </w:pPr>
       <w:r>
+        <w:rPr>
+          <w:rFonts w:ascii="Times New Roman" w:hAnsi="Times New Roman" w:cs="Times New Roman" w:eastAsia="宋体"/>
+        </w:rPr>
         <w:t>以下为2026年10月29日双账号验收时的真实页面局部截图，使用独立测试库和合成账号。截图只截取相关界面区域，未改动页面文字或统计结果；同一题目分别用于创建者与接收者各自的问卷，答卷统计不因题目共享而相互开放。</w:t>
       </w:r>
     </w:p>
@@ -2059,6 +2326,7 @@
       </w:pPr>
       <w:r>
         <w:rPr>
+          <w:rFonts w:ascii="Times New Roman" w:hAnsi="Times New Roman" w:cs="Times New Roman" w:eastAsia="宋体"/>
           <w:sz w:val="19"/>
         </w:rPr>
         <w:t>图3 题库版本管理页面</w:t>
@@ -2070,6 +2338,9 @@
         <w:ind w:firstLine="0"/>
       </w:pPr>
       <w:r>
+        <w:rPr>
+          <w:rFonts w:ascii="Times New Roman" w:hAnsi="Times New Roman" w:cs="Times New Roman" w:eastAsia="宋体"/>
+        </w:rPr>
         <w:drawing>
           <wp:inline xmlns:a="http://schemas.openxmlformats.org/drawingml/2006/main" xmlns:pic="http://schemas.openxmlformats.org/drawingml/2006/picture">
             <wp:extent cx="6120000" cy="2202460"/>
@@ -2111,6 +2382,9 @@
         <w:ind w:firstLine="420"/>
       </w:pPr>
       <w:r>
+        <w:rPr>
+          <w:rFonts w:ascii="Times New Roman" w:hAnsi="Times New Roman" w:cs="Times New Roman" w:eastAsia="宋体"/>
+        </w:rPr>
         <w:t>页面显示当前第2版、父版本及题目预览，可选择历史版本、恢复并查看使用位置。导入按钮需从本人草稿问卷进入后使用，避免未选择目标问卷时误导入。</w:t>
       </w:r>
     </w:p>
@@ -2121,6 +2395,7 @@
       </w:pPr>
       <w:r>
         <w:rPr>
+          <w:rFonts w:ascii="Times New Roman" w:hAnsi="Times New Roman" w:cs="Times New Roman" w:eastAsia="宋体"/>
           <w:sz w:val="19"/>
         </w:rPr>
         <w:t>图4 本人问卷中的跨卷统计页面</w:t>
@@ -2132,6 +2407,9 @@
         <w:ind w:firstLine="0"/>
       </w:pPr>
       <w:r>
+        <w:rPr>
+          <w:rFonts w:ascii="Times New Roman" w:hAnsi="Times New Roman" w:cs="Times New Roman" w:eastAsia="宋体"/>
+        </w:rPr>
         <w:drawing>
           <wp:inline xmlns:a="http://schemas.openxmlformats.org/drawingml/2006/main" xmlns:pic="http://schemas.openxmlformats.org/drawingml/2006/picture">
             <wp:extent cx="6120000" cy="2540255"/>
@@ -2173,6 +2451,9 @@
         <w:ind w:firstLine="420"/>
       </w:pPr>
       <w:r>
+        <w:rPr>
+          <w:rFonts w:ascii="Times New Roman" w:hAnsi="Times New Roman" w:cs="Times New Roman" w:eastAsia="宋体"/>
+        </w:rPr>
         <w:t>该组来自作者问卷的一次有效回答8，均值、最小值和最大值均为8，区间[8,8]计1次。接收者另一问卷的回答2单独统计，未混入此结果；版本ID与图3相同。不同版本或本卷内容变化后的题目另分组，图中数据为验收样本，不作为实际调查结论。</w:t>
       </w:r>
     </w:p>
@@ -2197,7 +2478,7 @@
     </w:pPr>
     <w:r>
       <w:rPr>
-        <w:rFonts w:ascii="Times New Roman" w:hAnsi="Times New Roman"/>
+        <w:rFonts w:ascii="Times New Roman" w:hAnsi="Times New Roman" w:cs="Times New Roman" w:eastAsia="宋体"/>
         <w:color w:val="555555"/>
         <w:sz w:val="18"/>
       </w:rPr>
@@ -2207,7 +2488,7 @@
     </w:r>
     <w:r>
       <w:rPr>
-        <w:rFonts w:ascii="Times New Roman" w:hAnsi="Times New Roman"/>
+        <w:rFonts w:ascii="Times New Roman" w:hAnsi="Times New Roman" w:cs="Times New Roman" w:eastAsia="宋体"/>
         <w:color w:val="555555"/>
         <w:sz w:val="18"/>
       </w:rPr>
@@ -2215,7 +2496,7 @@
     </w:r>
     <w:r>
       <w:rPr>
-        <w:rFonts w:ascii="Times New Roman" w:hAnsi="Times New Roman"/>
+        <w:rFonts w:ascii="Times New Roman" w:hAnsi="Times New Roman" w:cs="Times New Roman" w:eastAsia="宋体"/>
         <w:color w:val="555555"/>
         <w:sz w:val="18"/>
       </w:rPr>
@@ -2240,6 +2521,7 @@
     </w:pPr>
     <w:r>
       <w:rPr>
+        <w:rFonts w:ascii="Times New Roman" w:hAnsi="Times New Roman" w:cs="Times New Roman" w:eastAsia="宋体"/>
         <w:color w:val="555555"/>
         <w:sz w:val="16"/>
       </w:rPr>

</xml_diff>

<commit_message>
Improve report readability and table proportions
</commit_message>
<xml_diff>
--- a/第二阶段/提交材料/2026_ECNU_PJ1_2_温正泽-可编辑.docx
+++ b/第二阶段/提交材料/2026_ECNU_PJ1_2_温正泽-可编辑.docx
@@ -18,11 +18,13 @@
       <w:pPr>
         <w:pStyle w:val="Title"/>
         <w:ind w:firstLine="0"/>
+        <w:jc w:val="center"/>
       </w:pPr>
       <w:r>
         <w:rPr>
           <w:rFonts w:ascii="Times New Roman" w:hAnsi="Times New Roman" w:cs="Times New Roman" w:eastAsia="黑体"/>
           <w:b w:val="0"/>
+          <w:sz w:val="32"/>
         </w:rPr>
         <w:t>MongoDB问卷系统第二阶段项目报告</w:t>
       </w:r>
@@ -42,12 +44,13 @@
     <w:p>
       <w:pPr>
         <w:pStyle w:val="Heading1"/>
-        <w:spacing w:before="200" w:after="100"/>
+        <w:spacing w:before="240" w:after="100"/>
       </w:pPr>
       <w:r>
         <w:rPr>
           <w:rFonts w:ascii="Times New Roman" w:hAnsi="Times New Roman" w:cs="Times New Roman" w:eastAsia="黑体"/>
           <w:b w:val="0"/>
+          <w:sz w:val="27"/>
         </w:rPr>
         <w:t>一 需求变化与实现范围</w:t>
       </w:r>
@@ -55,12 +58,13 @@
     <w:p>
       <w:pPr>
         <w:widowControl/>
-        <w:spacing w:line="360" w:lineRule="auto" w:after="60"/>
-        <w:ind w:firstLine="420"/>
+        <w:spacing w:line="348" w:lineRule="auto" w:after="40"/>
+        <w:ind w:firstLine="460"/>
       </w:pPr>
       <w:r>
         <w:rPr>
           <w:rFonts w:ascii="Times New Roman" w:hAnsi="Times New Roman" w:cs="Times New Roman" w:eastAsia="宋体"/>
+          <w:sz w:val="23"/>
         </w:rPr>
         <w:t>第二阶段在原有账号、问卷、跳转、填写和统计功能上增加题目复用。常用题能够跨卷使用、共享、改版和恢复，并追踪引用与汇总答卷。问卷仍保存发布内容，另增独立的题库来源和版本历史。</w:t>
       </w:r>
@@ -68,12 +72,13 @@
     <w:p>
       <w:pPr>
         <w:widowControl/>
-        <w:spacing w:line="360" w:lineRule="auto" w:after="60"/>
-        <w:ind w:firstLine="420"/>
+        <w:spacing w:line="348" w:lineRule="auto" w:after="40"/>
+        <w:ind w:firstLine="460"/>
       </w:pPr>
       <w:r>
         <w:rPr>
           <w:rFonts w:ascii="Times New Roman" w:hAnsi="Times New Roman" w:cs="Times New Roman" w:eastAsia="宋体"/>
+          <w:sz w:val="23"/>
         </w:rPr>
         <w:t>本次在原Flask、PyMongo和原生网页上扩展，没有替换第一阶段技术栈。新增两个MongoDB集合及12个API，系统共有七个集合、35个API。第一阶段提交快照保留为stage1-submission-20261023，旧报告及38项测试记录保持原样。本阶段52项自动化测试通过，另完成真实浏览器流程；这些结果覆盖已执行的场景，不代表已完成大规模性能验证。</w:t>
       </w:r>
@@ -82,11 +87,12 @@
       <w:pPr>
         <w:keepNext/>
         <w:ind w:firstLine="0"/>
+        <w:jc w:val="center"/>
       </w:pPr>
       <w:r>
         <w:rPr>
           <w:rFonts w:ascii="Times New Roman" w:hAnsi="Times New Roman" w:cs="Times New Roman" w:eastAsia="宋体"/>
-          <w:sz w:val="19"/>
+          <w:sz w:val="20"/>
         </w:rPr>
         <w:t>表1 第二阶段需求与处理方式</w:t>
       </w:r>
@@ -106,16 +112,17 @@
         </w:tblBorders>
       </w:tblPr>
       <w:tblGrid>
-        <w:gridCol w:w="4819"/>
-        <w:gridCol w:w="4819"/>
+        <w:gridCol w:w="1814"/>
+        <w:gridCol w:w="7824"/>
       </w:tblGrid>
       <w:tr>
         <w:trPr>
           <w:tblHeader/>
+          <w:cantSplit/>
         </w:trPr>
         <w:tc>
           <w:tcPr>
-            <w:tcW w:type="dxa" w:w="4819"/>
+            <w:tcW w:type="dxa" w:w="1814"/>
             <w:tcBorders>
               <w:bottom w:val="single" w:sz="4"/>
             </w:tcBorders>
@@ -123,13 +130,13 @@
           <w:p>
             <w:pPr>
               <w:keepNext/>
-              <w:spacing w:after="60" w:before="60" w:line="324" w:lineRule="auto"/>
+              <w:spacing w:after="60" w:before="60" w:line="300" w:lineRule="auto"/>
             </w:pPr>
             <w:r>
               <w:rPr>
                 <w:rFonts w:ascii="Times New Roman" w:hAnsi="Times New Roman" w:cs="Times New Roman" w:eastAsia="黑体"/>
                 <w:b w:val="0"/>
-                <w:sz w:val="18"/>
+                <w:sz w:val="20"/>
               </w:rPr>
               <w:t>需求</w:t>
             </w:r>
@@ -137,7 +144,7 @@
         </w:tc>
         <w:tc>
           <w:tcPr>
-            <w:tcW w:type="dxa" w:w="4819"/>
+            <w:tcW w:type="dxa" w:w="7824"/>
             <w:tcBorders>
               <w:bottom w:val="single" w:sz="4"/>
             </w:tcBorders>
@@ -145,13 +152,13 @@
           <w:p>
             <w:pPr>
               <w:keepNext/>
-              <w:spacing w:after="60" w:before="60" w:line="324" w:lineRule="auto"/>
+              <w:spacing w:after="60" w:before="60" w:line="300" w:lineRule="auto"/>
             </w:pPr>
             <w:r>
               <w:rPr>
                 <w:rFonts w:ascii="Times New Roman" w:hAnsi="Times New Roman" w:cs="Times New Roman" w:eastAsia="黑体"/>
                 <w:b w:val="0"/>
-                <w:sz w:val="18"/>
+                <w:sz w:val="20"/>
               </w:rPr>
               <w:t>实现与设计考虑</w:t>
             </w:r>
@@ -159,19 +166,22 @@
         </w:tc>
       </w:tr>
       <w:tr>
+        <w:trPr>
+          <w:cantSplit/>
+        </w:trPr>
         <w:tc>
           <w:tcPr>
-            <w:tcW w:type="dxa" w:w="4819"/>
+            <w:tcW w:type="dxa" w:w="1814"/>
           </w:tcPr>
           <w:p>
             <w:pPr>
-              <w:spacing w:after="60" w:before="60" w:line="324" w:lineRule="auto"/>
+              <w:spacing w:after="60" w:before="60" w:line="300" w:lineRule="auto"/>
             </w:pPr>
             <w:r>
               <w:rPr>
                 <w:rFonts w:ascii="Times New Roman" w:hAnsi="Times New Roman" w:cs="Times New Roman" w:eastAsia="宋体"/>
                 <w:b w:val="0"/>
-                <w:sz w:val="18"/>
+                <w:sz w:val="20"/>
               </w:rPr>
               <w:t>常用题保存与题库管理</w:t>
             </w:r>
@@ -179,17 +189,17 @@
         </w:tc>
         <w:tc>
           <w:tcPr>
-            <w:tcW w:type="dxa" w:w="4819"/>
+            <w:tcW w:type="dxa" w:w="7824"/>
           </w:tcPr>
           <w:p>
             <w:pPr>
-              <w:spacing w:after="60" w:before="60" w:line="324" w:lineRule="auto"/>
+              <w:spacing w:after="60" w:before="60" w:line="300" w:lineRule="auto"/>
             </w:pPr>
             <w:r>
               <w:rPr>
                 <w:rFonts w:ascii="Times New Roman" w:hAnsi="Times New Roman" w:cs="Times New Roman" w:eastAsia="宋体"/>
                 <w:b w:val="0"/>
-                <w:sz w:val="18"/>
+                <w:sz w:val="20"/>
               </w:rPr>
               <w:t>支持独立建题、本人问卷题入库、题库分组及重命名，导入时明确选择版本</w:t>
             </w:r>
@@ -197,19 +207,22 @@
         </w:tc>
       </w:tr>
       <w:tr>
+        <w:trPr>
+          <w:cantSplit/>
+        </w:trPr>
         <w:tc>
           <w:tcPr>
-            <w:tcW w:type="dxa" w:w="4819"/>
+            <w:tcW w:type="dxa" w:w="1814"/>
           </w:tcPr>
           <w:p>
             <w:pPr>
-              <w:spacing w:after="60" w:before="60" w:line="324" w:lineRule="auto"/>
+              <w:spacing w:after="60" w:before="60" w:line="300" w:lineRule="auto"/>
             </w:pPr>
             <w:r>
               <w:rPr>
                 <w:rFonts w:ascii="Times New Roman" w:hAnsi="Times New Roman" w:cs="Times New Roman" w:eastAsia="宋体"/>
                 <w:b w:val="0"/>
-                <w:sz w:val="18"/>
+                <w:sz w:val="20"/>
               </w:rPr>
               <w:t>题目共享</w:t>
             </w:r>
@@ -217,17 +230,17 @@
         </w:tc>
         <w:tc>
           <w:tcPr>
-            <w:tcW w:type="dxa" w:w="4819"/>
+            <w:tcW w:type="dxa" w:w="7824"/>
           </w:tcPr>
           <w:p>
             <w:pPr>
-              <w:spacing w:after="60" w:before="60" w:line="324" w:lineRule="auto"/>
+              <w:spacing w:after="60" w:before="60" w:line="300" w:lineRule="auto"/>
             </w:pPr>
             <w:r>
               <w:rPr>
                 <w:rFonts w:ascii="Times New Roman" w:hAnsi="Times New Roman" w:cs="Times New Roman" w:eastAsia="宋体"/>
                 <w:b w:val="0"/>
-                <w:sz w:val="18"/>
+                <w:sz w:val="20"/>
               </w:rPr>
               <w:t>按已有账号授予读取和使用权，接收者不能修改源题；撤销不破坏已经保存的问卷副本</w:t>
             </w:r>
@@ -235,19 +248,22 @@
         </w:tc>
       </w:tr>
       <w:tr>
+        <w:trPr>
+          <w:cantSplit/>
+        </w:trPr>
         <w:tc>
           <w:tcPr>
-            <w:tcW w:type="dxa" w:w="4819"/>
+            <w:tcW w:type="dxa" w:w="1814"/>
           </w:tcPr>
           <w:p>
             <w:pPr>
-              <w:spacing w:after="60" w:before="60" w:line="324" w:lineRule="auto"/>
+              <w:spacing w:after="60" w:before="60" w:line="300" w:lineRule="auto"/>
             </w:pPr>
             <w:r>
               <w:rPr>
                 <w:rFonts w:ascii="Times New Roman" w:hAnsi="Times New Roman" w:cs="Times New Roman" w:eastAsia="宋体"/>
                 <w:b w:val="0"/>
-                <w:sz w:val="18"/>
+                <w:sz w:val="20"/>
               </w:rPr>
               <w:t>保护旧问卷</w:t>
             </w:r>
@@ -255,17 +271,17 @@
         </w:tc>
         <w:tc>
           <w:tcPr>
-            <w:tcW w:type="dxa" w:w="4819"/>
+            <w:tcW w:type="dxa" w:w="7824"/>
           </w:tcPr>
           <w:p>
             <w:pPr>
-              <w:spacing w:after="60" w:before="60" w:line="324" w:lineRule="auto"/>
+              <w:spacing w:after="60" w:before="60" w:line="300" w:lineRule="auto"/>
             </w:pPr>
             <w:r>
               <w:rPr>
                 <w:rFonts w:ascii="Times New Roman" w:hAnsi="Times New Roman" w:cs="Times New Roman" w:eastAsia="宋体"/>
                 <w:b w:val="0"/>
-                <w:sz w:val="18"/>
+                <w:sz w:val="20"/>
               </w:rPr>
               <w:t>导入时复制定义，发布后冻结；修改题库内容不反向覆盖旧问卷</w:t>
             </w:r>
@@ -273,19 +289,22 @@
         </w:tc>
       </w:tr>
       <w:tr>
+        <w:trPr>
+          <w:cantSplit/>
+        </w:trPr>
         <w:tc>
           <w:tcPr>
-            <w:tcW w:type="dxa" w:w="4819"/>
+            <w:tcW w:type="dxa" w:w="1814"/>
           </w:tcPr>
           <w:p>
             <w:pPr>
-              <w:spacing w:after="60" w:before="60" w:line="324" w:lineRule="auto"/>
+              <w:spacing w:after="60" w:before="60" w:line="300" w:lineRule="auto"/>
             </w:pPr>
             <w:r>
               <w:rPr>
                 <w:rFonts w:ascii="Times New Roman" w:hAnsi="Times New Roman" w:cs="Times New Roman" w:eastAsia="宋体"/>
                 <w:b w:val="0"/>
-                <w:sz w:val="18"/>
+                <w:sz w:val="20"/>
               </w:rPr>
               <w:t>历史与多版本</w:t>
             </w:r>
@@ -293,17 +312,17 @@
         </w:tc>
         <w:tc>
           <w:tcPr>
-            <w:tcW w:type="dxa" w:w="4819"/>
+            <w:tcW w:type="dxa" w:w="7824"/>
           </w:tcPr>
           <w:p>
             <w:pPr>
-              <w:spacing w:after="60" w:before="60" w:line="324" w:lineRule="auto"/>
+              <w:spacing w:after="60" w:before="60" w:line="300" w:lineRule="auto"/>
             </w:pPr>
             <w:r>
               <w:rPr>
                 <w:rFonts w:ascii="Times New Roman" w:hAnsi="Times New Roman" w:cs="Times New Roman" w:eastAsia="宋体"/>
                 <w:b w:val="0"/>
-                <w:sz w:val="18"/>
+                <w:sz w:val="20"/>
               </w:rPr>
               <w:t>每版保存内容和父版本，允许从旧版本分支；恢复追加版本，保留恢复来源</w:t>
             </w:r>
@@ -311,19 +330,22 @@
         </w:tc>
       </w:tr>
       <w:tr>
+        <w:trPr>
+          <w:cantSplit/>
+        </w:trPr>
         <w:tc>
           <w:tcPr>
-            <w:tcW w:type="dxa" w:w="4819"/>
+            <w:tcW w:type="dxa" w:w="1814"/>
           </w:tcPr>
           <w:p>
             <w:pPr>
-              <w:spacing w:after="60" w:before="60" w:line="324" w:lineRule="auto"/>
+              <w:spacing w:after="60" w:before="60" w:line="300" w:lineRule="auto"/>
             </w:pPr>
             <w:r>
               <w:rPr>
                 <w:rFonts w:ascii="Times New Roman" w:hAnsi="Times New Roman" w:cs="Times New Roman" w:eastAsia="宋体"/>
                 <w:b w:val="0"/>
-                <w:sz w:val="18"/>
+                <w:sz w:val="20"/>
               </w:rPr>
               <w:t>使用追踪</w:t>
             </w:r>
@@ -331,17 +353,17 @@
         </w:tc>
         <w:tc>
           <w:tcPr>
-            <w:tcW w:type="dxa" w:w="4819"/>
+            <w:tcW w:type="dxa" w:w="7824"/>
           </w:tcPr>
           <w:p>
             <w:pPr>
-              <w:spacing w:after="60" w:before="60" w:line="324" w:lineRule="auto"/>
+              <w:spacing w:after="60" w:before="60" w:line="300" w:lineRule="auto"/>
             </w:pPr>
             <w:r>
               <w:rPr>
                 <w:rFonts w:ascii="Times New Roman" w:hAnsi="Times New Roman" w:cs="Times New Roman" w:eastAsia="宋体"/>
                 <w:b w:val="0"/>
-                <w:sz w:val="18"/>
+                <w:sz w:val="20"/>
               </w:rPr>
               <w:t>来源字段记录题目与版本，本人查看引用位置，外部引用仅显示数量</w:t>
             </w:r>
@@ -349,19 +371,22 @@
         </w:tc>
       </w:tr>
       <w:tr>
+        <w:trPr>
+          <w:cantSplit/>
+        </w:trPr>
         <w:tc>
           <w:tcPr>
-            <w:tcW w:type="dxa" w:w="4819"/>
+            <w:tcW w:type="dxa" w:w="1814"/>
           </w:tcPr>
           <w:p>
             <w:pPr>
-              <w:spacing w:after="60" w:before="60" w:line="324" w:lineRule="auto"/>
+              <w:spacing w:after="60" w:before="60" w:line="300" w:lineRule="auto"/>
             </w:pPr>
             <w:r>
               <w:rPr>
                 <w:rFonts w:ascii="Times New Roman" w:hAnsi="Times New Roman" w:cs="Times New Roman" w:eastAsia="宋体"/>
                 <w:b w:val="0"/>
-                <w:sz w:val="18"/>
+                <w:sz w:val="20"/>
               </w:rPr>
               <w:t>跨问卷统计</w:t>
             </w:r>
@@ -369,17 +394,17 @@
         </w:tc>
         <w:tc>
           <w:tcPr>
-            <w:tcW w:type="dxa" w:w="4819"/>
+            <w:tcW w:type="dxa" w:w="7824"/>
           </w:tcPr>
           <w:p>
             <w:pPr>
-              <w:spacing w:after="60" w:before="60" w:line="324" w:lineRule="auto"/>
+              <w:spacing w:after="60" w:before="60" w:line="300" w:lineRule="auto"/>
             </w:pPr>
             <w:r>
               <w:rPr>
                 <w:rFonts w:ascii="Times New Roman" w:hAnsi="Times New Roman" w:cs="Times New Roman" w:eastAsia="宋体"/>
                 <w:b w:val="0"/>
-                <w:sz w:val="18"/>
+                <w:sz w:val="20"/>
               </w:rPr>
               <w:t>按来源版本与实际定义分组；保留单卷统计，增加数字分布与文本分页</w:t>
             </w:r>
@@ -390,12 +415,13 @@
     <w:p>
       <w:pPr>
         <w:pStyle w:val="Heading1"/>
-        <w:spacing w:before="200" w:after="100"/>
+        <w:spacing w:before="240" w:after="100"/>
       </w:pPr>
       <w:r>
         <w:rPr>
           <w:rFonts w:ascii="Times New Roman" w:hAnsi="Times New Roman" w:cs="Times New Roman" w:eastAsia="黑体"/>
           <w:b w:val="0"/>
+          <w:sz w:val="27"/>
         </w:rPr>
         <w:t>二 数据库结构与扩展理由</w:t>
       </w:r>
@@ -403,12 +429,13 @@
     <w:p>
       <w:pPr>
         <w:pStyle w:val="Heading2"/>
-        <w:spacing w:before="180" w:after="100"/>
+        <w:spacing w:before="160" w:after="100"/>
       </w:pPr>
       <w:r>
         <w:rPr>
           <w:rFonts w:ascii="Times New Roman" w:hAnsi="Times New Roman" w:cs="Times New Roman" w:eastAsia="黑体"/>
           <w:b w:val="0"/>
+          <w:sz w:val="24"/>
         </w:rPr>
         <w:t>2.1 保留原有集合 增加题库来源</w:t>
       </w:r>
@@ -416,12 +443,13 @@
     <w:p>
       <w:pPr>
         <w:widowControl/>
-        <w:spacing w:line="360" w:lineRule="auto" w:after="60"/>
-        <w:ind w:firstLine="420"/>
+        <w:spacing w:line="348" w:lineRule="auto" w:after="40"/>
+        <w:ind w:firstLine="460"/>
       </w:pPr>
       <w:r>
         <w:rPr>
           <w:rFonts w:ascii="Times New Roman" w:hAnsi="Times New Roman" w:cs="Times New Roman" w:eastAsia="宋体"/>
+          <w:sz w:val="23"/>
         </w:rPr>
         <w:t>原五集合继续保存账户、会话、问卷、进度与正式答卷。题型、校验和跳转仍嵌入surveys.questions，随问卷一起读取；答卷独立存储，避免问卷文档随提交量持续增长。</w:t>
       </w:r>
@@ -429,12 +457,13 @@
     <w:p>
       <w:pPr>
         <w:widowControl/>
-        <w:spacing w:line="360" w:lineRule="auto" w:after="60"/>
-        <w:ind w:firstLine="420"/>
+        <w:spacing w:line="348" w:lineRule="auto" w:after="40"/>
+        <w:ind w:firstLine="460"/>
       </w:pPr>
       <w:r>
         <w:rPr>
           <w:rFonts w:ascii="Times New Roman" w:hAnsi="Times New Roman" w:cs="Times New Roman" w:eastAsia="宋体"/>
+          <w:sz w:val="23"/>
         </w:rPr>
         <w:t>新增question_banks保存题库名称、说明及所有者。library_questions保存题目所属题库、共享名单、工作稿、历史版本和当前版本指针。题库用于分组管理，题目用于独立共享；分享某一道题不自动开放整座题库。</w:t>
       </w:r>
@@ -443,11 +472,12 @@
       <w:pPr>
         <w:keepNext/>
         <w:ind w:firstLine="0"/>
+        <w:jc w:val="center"/>
       </w:pPr>
       <w:r>
         <w:rPr>
           <w:rFonts w:ascii="Times New Roman" w:hAnsi="Times New Roman" w:cs="Times New Roman" w:eastAsia="宋体"/>
-          <w:sz w:val="19"/>
+          <w:sz w:val="20"/>
         </w:rPr>
         <w:t>表2 新增集合的主要字段</w:t>
       </w:r>
@@ -467,17 +497,18 @@
         </w:tblBorders>
       </w:tblPr>
       <w:tblGrid>
-        <w:gridCol w:w="3213"/>
-        <w:gridCol w:w="3213"/>
-        <w:gridCol w:w="3213"/>
+        <w:gridCol w:w="2381"/>
+        <w:gridCol w:w="3572"/>
+        <w:gridCol w:w="3685"/>
       </w:tblGrid>
       <w:tr>
         <w:trPr>
           <w:tblHeader/>
+          <w:cantSplit/>
         </w:trPr>
         <w:tc>
           <w:tcPr>
-            <w:tcW w:type="dxa" w:w="3213"/>
+            <w:tcW w:type="dxa" w:w="2381"/>
             <w:tcBorders>
               <w:bottom w:val="single" w:sz="4"/>
             </w:tcBorders>
@@ -485,13 +516,13 @@
           <w:p>
             <w:pPr>
               <w:keepNext/>
-              <w:spacing w:after="60" w:before="60" w:line="324" w:lineRule="auto"/>
+              <w:spacing w:after="60" w:before="60" w:line="300" w:lineRule="auto"/>
             </w:pPr>
             <w:r>
               <w:rPr>
                 <w:rFonts w:ascii="Times New Roman" w:hAnsi="Times New Roman" w:cs="Times New Roman" w:eastAsia="黑体"/>
                 <w:b w:val="0"/>
-                <w:sz w:val="18"/>
+                <w:sz w:val="20"/>
               </w:rPr>
               <w:t>集合</w:t>
             </w:r>
@@ -499,7 +530,7 @@
         </w:tc>
         <w:tc>
           <w:tcPr>
-            <w:tcW w:type="dxa" w:w="3213"/>
+            <w:tcW w:type="dxa" w:w="3572"/>
             <w:tcBorders>
               <w:bottom w:val="single" w:sz="4"/>
             </w:tcBorders>
@@ -507,13 +538,13 @@
           <w:p>
             <w:pPr>
               <w:keepNext/>
-              <w:spacing w:after="60" w:before="60" w:line="324" w:lineRule="auto"/>
+              <w:spacing w:after="60" w:before="60" w:line="300" w:lineRule="auto"/>
             </w:pPr>
             <w:r>
               <w:rPr>
                 <w:rFonts w:ascii="Times New Roman" w:hAnsi="Times New Roman" w:cs="Times New Roman" w:eastAsia="黑体"/>
                 <w:b w:val="0"/>
-                <w:sz w:val="18"/>
+                <w:sz w:val="20"/>
               </w:rPr>
               <w:t>主要字段</w:t>
             </w:r>
@@ -521,7 +552,7 @@
         </w:tc>
         <w:tc>
           <w:tcPr>
-            <w:tcW w:type="dxa" w:w="3213"/>
+            <w:tcW w:type="dxa" w:w="3685"/>
             <w:tcBorders>
               <w:bottom w:val="single" w:sz="4"/>
             </w:tcBorders>
@@ -529,13 +560,13 @@
           <w:p>
             <w:pPr>
               <w:keepNext/>
-              <w:spacing w:after="60" w:before="60" w:line="324" w:lineRule="auto"/>
+              <w:spacing w:after="60" w:before="60" w:line="300" w:lineRule="auto"/>
             </w:pPr>
             <w:r>
               <w:rPr>
                 <w:rFonts w:ascii="Times New Roman" w:hAnsi="Times New Roman" w:cs="Times New Roman" w:eastAsia="黑体"/>
                 <w:b w:val="0"/>
-                <w:sz w:val="18"/>
+                <w:sz w:val="20"/>
               </w:rPr>
               <w:t>作用与约束</w:t>
             </w:r>
@@ -543,19 +574,23 @@
         </w:tc>
       </w:tr>
       <w:tr>
+        <w:trPr>
+          <w:cantSplit/>
+        </w:trPr>
         <w:tc>
           <w:tcPr>
-            <w:tcW w:type="dxa" w:w="3213"/>
+            <w:tcW w:type="dxa" w:w="2381"/>
           </w:tcPr>
           <w:p>
             <w:pPr>
-              <w:spacing w:after="60" w:before="60" w:line="324" w:lineRule="auto"/>
+              <w:keepNext/>
+              <w:spacing w:after="60" w:before="60" w:line="300" w:lineRule="auto"/>
             </w:pPr>
             <w:r>
               <w:rPr>
                 <w:rFonts w:ascii="Times New Roman" w:hAnsi="Times New Roman" w:cs="Times New Roman" w:eastAsia="宋体"/>
                 <w:b w:val="0"/>
-                <w:sz w:val="18"/>
+                <w:sz w:val="20"/>
               </w:rPr>
               <w:t>question_banks</w:t>
             </w:r>
@@ -563,17 +598,18 @@
         </w:tc>
         <w:tc>
           <w:tcPr>
-            <w:tcW w:type="dxa" w:w="3213"/>
+            <w:tcW w:type="dxa" w:w="3572"/>
           </w:tcPr>
           <w:p>
             <w:pPr>
-              <w:spacing w:after="60" w:before="60" w:line="324" w:lineRule="auto"/>
+              <w:keepNext/>
+              <w:spacing w:after="60" w:before="60" w:line="300" w:lineRule="auto"/>
             </w:pPr>
             <w:r>
               <w:rPr>
                 <w:rFonts w:ascii="Times New Roman" w:hAnsi="Times New Roman" w:cs="Times New Roman" w:eastAsia="宋体"/>
                 <w:b w:val="0"/>
-                <w:sz w:val="18"/>
+                <w:sz w:val="20"/>
               </w:rPr>
               <w:t>_id、owner_id、title、description、created_at</w:t>
             </w:r>
@@ -581,17 +617,18 @@
         </w:tc>
         <w:tc>
           <w:tcPr>
-            <w:tcW w:type="dxa" w:w="3213"/>
+            <w:tcW w:type="dxa" w:w="3685"/>
           </w:tcPr>
           <w:p>
             <w:pPr>
-              <w:spacing w:after="60" w:before="60" w:line="324" w:lineRule="auto"/>
+              <w:keepNext/>
+              <w:spacing w:after="60" w:before="60" w:line="300" w:lineRule="auto"/>
             </w:pPr>
             <w:r>
               <w:rPr>
                 <w:rFonts w:ascii="Times New Roman" w:hAnsi="Times New Roman" w:cs="Times New Roman" w:eastAsia="宋体"/>
                 <w:b w:val="0"/>
-                <w:sz w:val="18"/>
+                <w:sz w:val="20"/>
               </w:rPr>
               <w:t>题库归属于创建者；按所有者查询并管理</w:t>
             </w:r>
@@ -599,19 +636,23 @@
         </w:tc>
       </w:tr>
       <w:tr>
+        <w:trPr>
+          <w:cantSplit/>
+        </w:trPr>
         <w:tc>
           <w:tcPr>
-            <w:tcW w:type="dxa" w:w="3213"/>
+            <w:tcW w:type="dxa" w:w="2381"/>
           </w:tcPr>
           <w:p>
             <w:pPr>
-              <w:spacing w:after="60" w:before="60" w:line="324" w:lineRule="auto"/>
+              <w:keepNext/>
+              <w:spacing w:after="60" w:before="60" w:line="300" w:lineRule="auto"/>
             </w:pPr>
             <w:r>
               <w:rPr>
                 <w:rFonts w:ascii="Times New Roman" w:hAnsi="Times New Roman" w:cs="Times New Roman" w:eastAsia="宋体"/>
                 <w:b w:val="0"/>
-                <w:sz w:val="18"/>
+                <w:sz w:val="20"/>
               </w:rPr>
               <w:t>library_questions</w:t>
             </w:r>
@@ -619,17 +660,18 @@
         </w:tc>
         <w:tc>
           <w:tcPr>
-            <w:tcW w:type="dxa" w:w="3213"/>
+            <w:tcW w:type="dxa" w:w="3572"/>
           </w:tcPr>
           <w:p>
             <w:pPr>
-              <w:spacing w:after="60" w:before="60" w:line="324" w:lineRule="auto"/>
+              <w:keepNext/>
+              <w:spacing w:after="60" w:before="60" w:line="300" w:lineRule="auto"/>
             </w:pPr>
             <w:r>
               <w:rPr>
                 <w:rFonts w:ascii="Times New Roman" w:hAnsi="Times New Roman" w:cs="Times New Roman" w:eastAsia="宋体"/>
                 <w:b w:val="0"/>
-                <w:sz w:val="18"/>
+                <w:sz w:val="20"/>
               </w:rPr>
               <w:t>owner_id、bank_id、shared_with、working_copy、versions、current_version、revision</w:t>
             </w:r>
@@ -637,17 +679,18 @@
         </w:tc>
         <w:tc>
           <w:tcPr>
-            <w:tcW w:type="dxa" w:w="3213"/>
+            <w:tcW w:type="dxa" w:w="3685"/>
           </w:tcPr>
           <w:p>
             <w:pPr>
-              <w:spacing w:after="60" w:before="60" w:line="324" w:lineRule="auto"/>
+              <w:keepNext/>
+              <w:spacing w:after="60" w:before="60" w:line="300" w:lineRule="auto"/>
             </w:pPr>
             <w:r>
               <w:rPr>
                 <w:rFonts w:ascii="Times New Roman" w:hAnsi="Times New Roman" w:cs="Times New Roman" w:eastAsia="宋体"/>
                 <w:b w:val="0"/>
-                <w:sz w:val="18"/>
+                <w:sz w:val="20"/>
               </w:rPr>
               <w:t>题目、权限与版本同文档保存；revision用于条件更新</w:t>
             </w:r>
@@ -655,19 +698,23 @@
         </w:tc>
       </w:tr>
       <w:tr>
+        <w:trPr>
+          <w:cantSplit/>
+        </w:trPr>
         <w:tc>
           <w:tcPr>
-            <w:tcW w:type="dxa" w:w="3213"/>
+            <w:tcW w:type="dxa" w:w="2381"/>
           </w:tcPr>
           <w:p>
             <w:pPr>
-              <w:spacing w:after="60" w:before="60" w:line="324" w:lineRule="auto"/>
+              <w:keepNext/>
+              <w:spacing w:after="60" w:before="60" w:line="300" w:lineRule="auto"/>
             </w:pPr>
             <w:r>
               <w:rPr>
                 <w:rFonts w:ascii="Times New Roman" w:hAnsi="Times New Roman" w:cs="Times New Roman" w:eastAsia="宋体"/>
                 <w:b w:val="0"/>
-                <w:sz w:val="18"/>
+                <w:sz w:val="20"/>
               </w:rPr>
               <w:t>versions内嵌条目</w:t>
             </w:r>
@@ -675,17 +722,18 @@
         </w:tc>
         <w:tc>
           <w:tcPr>
-            <w:tcW w:type="dxa" w:w="3213"/>
+            <w:tcW w:type="dxa" w:w="3572"/>
           </w:tcPr>
           <w:p>
             <w:pPr>
-              <w:spacing w:after="60" w:before="60" w:line="324" w:lineRule="auto"/>
+              <w:keepNext/>
+              <w:spacing w:after="60" w:before="60" w:line="300" w:lineRule="auto"/>
             </w:pPr>
             <w:r>
               <w:rPr>
                 <w:rFonts w:ascii="Times New Roman" w:hAnsi="Times New Roman" w:cs="Times New Roman" w:eastAsia="宋体"/>
                 <w:b w:val="0"/>
-                <w:sz w:val="18"/>
+                <w:sz w:val="20"/>
               </w:rPr>
               <w:t>id、number、parent_version、restored_from、question、created_at</w:t>
             </w:r>
@@ -693,17 +741,18 @@
         </w:tc>
         <w:tc>
           <w:tcPr>
-            <w:tcW w:type="dxa" w:w="3213"/>
+            <w:tcW w:type="dxa" w:w="3685"/>
           </w:tcPr>
           <w:p>
             <w:pPr>
-              <w:spacing w:after="60" w:before="60" w:line="324" w:lineRule="auto"/>
+              <w:keepNext/>
+              <w:spacing w:after="60" w:before="60" w:line="300" w:lineRule="auto"/>
             </w:pPr>
             <w:r>
               <w:rPr>
                 <w:rFonts w:ascii="Times New Roman" w:hAnsi="Times New Roman" w:cs="Times New Roman" w:eastAsia="宋体"/>
                 <w:b w:val="0"/>
-                <w:sz w:val="18"/>
+                <w:sz w:val="20"/>
               </w:rPr>
               <w:t>版本ID独立稳定；已提交内容不覆盖，记录分支与恢复来源</w:t>
             </w:r>
@@ -711,19 +760,22 @@
         </w:tc>
       </w:tr>
       <w:tr>
+        <w:trPr>
+          <w:cantSplit/>
+        </w:trPr>
         <w:tc>
           <w:tcPr>
-            <w:tcW w:type="dxa" w:w="3213"/>
+            <w:tcW w:type="dxa" w:w="2381"/>
           </w:tcPr>
           <w:p>
             <w:pPr>
-              <w:spacing w:after="60" w:before="60" w:line="324" w:lineRule="auto"/>
+              <w:spacing w:after="60" w:before="60" w:line="300" w:lineRule="auto"/>
             </w:pPr>
             <w:r>
               <w:rPr>
                 <w:rFonts w:ascii="Times New Roman" w:hAnsi="Times New Roman" w:cs="Times New Roman" w:eastAsia="宋体"/>
                 <w:b w:val="0"/>
-                <w:sz w:val="18"/>
+                <w:sz w:val="20"/>
               </w:rPr>
               <w:t>surveys.questions.source</w:t>
             </w:r>
@@ -731,17 +783,17 @@
         </w:tc>
         <w:tc>
           <w:tcPr>
-            <w:tcW w:type="dxa" w:w="3213"/>
+            <w:tcW w:type="dxa" w:w="3572"/>
           </w:tcPr>
           <w:p>
             <w:pPr>
-              <w:spacing w:after="60" w:before="60" w:line="324" w:lineRule="auto"/>
+              <w:spacing w:after="60" w:before="60" w:line="300" w:lineRule="auto"/>
             </w:pPr>
             <w:r>
               <w:rPr>
                 <w:rFonts w:ascii="Times New Roman" w:hAnsi="Times New Roman" w:cs="Times New Roman" w:eastAsia="宋体"/>
                 <w:b w:val="0"/>
-                <w:sz w:val="18"/>
+                <w:sz w:val="20"/>
               </w:rPr>
               <w:t>library_id、version、definition_hash</w:t>
             </w:r>
@@ -749,17 +801,17 @@
         </w:tc>
         <w:tc>
           <w:tcPr>
-            <w:tcW w:type="dxa" w:w="3213"/>
+            <w:tcW w:type="dxa" w:w="3685"/>
           </w:tcPr>
           <w:p>
             <w:pPr>
-              <w:spacing w:after="60" w:before="60" w:line="324" w:lineRule="auto"/>
+              <w:spacing w:after="60" w:before="60" w:line="300" w:lineRule="auto"/>
             </w:pPr>
             <w:r>
               <w:rPr>
                 <w:rFonts w:ascii="Times New Roman" w:hAnsi="Times New Roman" w:cs="Times New Roman" w:eastAsia="宋体"/>
                 <w:b w:val="0"/>
-                <w:sz w:val="18"/>
+                <w:sz w:val="20"/>
               </w:rPr>
               <w:t>保存导入来源及定义摘要；问卷副本不依赖实时读取题库</w:t>
             </w:r>
@@ -771,11 +823,12 @@
       <w:pPr>
         <w:keepNext/>
         <w:ind w:firstLine="0"/>
+        <w:jc w:val="center"/>
       </w:pPr>
       <w:r>
         <w:rPr>
           <w:rFonts w:ascii="Times New Roman" w:hAnsi="Times New Roman" w:cs="Times New Roman" w:eastAsia="宋体"/>
-          <w:sz w:val="19"/>
+          <w:sz w:val="20"/>
         </w:rPr>
         <w:t>图1 题库来源与问卷快照关系</w:t>
       </w:r>
@@ -826,12 +879,13 @@
     <w:p>
       <w:pPr>
         <w:pStyle w:val="Heading2"/>
-        <w:spacing w:before="180" w:after="100"/>
+        <w:spacing w:before="160" w:after="100"/>
       </w:pPr>
       <w:r>
         <w:rPr>
           <w:rFonts w:ascii="Times New Roman" w:hAnsi="Times New Roman" w:cs="Times New Roman" w:eastAsia="黑体"/>
           <w:b w:val="0"/>
+          <w:sz w:val="24"/>
         </w:rPr>
         <w:t>2.2 历史版本内嵌的取舍</w:t>
       </w:r>
@@ -839,12 +893,13 @@
     <w:p>
       <w:pPr>
         <w:widowControl/>
-        <w:spacing w:line="360" w:lineRule="auto" w:after="60"/>
-        <w:ind w:firstLine="420"/>
+        <w:spacing w:line="348" w:lineRule="auto" w:after="40"/>
+        <w:ind w:firstLine="460"/>
       </w:pPr>
       <w:r>
         <w:rPr>
           <w:rFonts w:ascii="Times New Roman" w:hAnsi="Times New Roman" w:cs="Times New Roman" w:eastAsia="宋体"/>
+          <w:sz w:val="23"/>
         </w:rPr>
         <w:t>版本、当前指针和修订号同文档保存，以所有者和原revision为更新条件，一次写入历史和指针。两个请求使用同一修订号时，一个成功，另一个返回409，避免覆盖修改。</w:t>
       </w:r>
@@ -852,12 +907,13 @@
     <w:p>
       <w:pPr>
         <w:widowControl/>
-        <w:spacing w:line="360" w:lineRule="auto" w:after="60"/>
-        <w:ind w:firstLine="420"/>
+        <w:spacing w:line="348" w:lineRule="auto" w:after="40"/>
+        <w:ind w:firstLine="460"/>
       </w:pPr>
       <w:r>
         <w:rPr>
           <w:rFonts w:ascii="Times New Roman" w:hAnsi="Times New Roman" w:cs="Times New Roman" w:eastAsia="宋体"/>
+          <w:sz w:val="23"/>
         </w:rPr>
         <w:t>内嵌历史便于整体读取和原子更新，但不能无限增长。当前每题最多保留100个已提交版本，达到上限时明确拒绝继续追加；如果后续版本量明显增加，可将历史拆成独立集合。这个限制是本项目的实现选择，不是课程指定的MongoDB结构。</w:t>
       </w:r>
@@ -865,12 +921,13 @@
     <w:p>
       <w:pPr>
         <w:widowControl/>
-        <w:spacing w:line="360" w:lineRule="auto" w:after="60"/>
-        <w:ind w:firstLine="420"/>
+        <w:spacing w:line="348" w:lineRule="auto" w:after="40"/>
+        <w:ind w:firstLine="460"/>
       </w:pPr>
       <w:r>
         <w:rPr>
           <w:rFonts w:ascii="Times New Roman" w:hAnsi="Times New Roman" w:cs="Times New Roman" w:eastAsia="宋体"/>
+          <w:sz w:val="23"/>
         </w:rPr>
         <w:t>新增集合使用JSON Schema约束字段类型和必需字段；索引覆盖题库所有者、题目所有者、共享名单、题库分组及问卷中的来源题ID。旧五集合的验证器不在初始化时被替换，旧问卷不要求补齐source。当前完整结构导出为database/schema-stage2.json，第一阶段schema.json保留为历史证据。</w:t>
       </w:r>
@@ -878,12 +935,13 @@
     <w:p>
       <w:pPr>
         <w:pStyle w:val="Heading1"/>
-        <w:spacing w:before="200" w:after="100"/>
+        <w:spacing w:before="240" w:after="100"/>
       </w:pPr>
       <w:r>
         <w:rPr>
           <w:rFonts w:ascii="Times New Roman" w:hAnsi="Times New Roman" w:cs="Times New Roman" w:eastAsia="黑体"/>
           <w:b w:val="0"/>
+          <w:sz w:val="27"/>
         </w:rPr>
         <w:t>三 版本管理与旧数据保护</w:t>
       </w:r>
@@ -891,12 +949,13 @@
     <w:p>
       <w:pPr>
         <w:pStyle w:val="Heading2"/>
-        <w:spacing w:before="180" w:after="100"/>
+        <w:spacing w:before="160" w:after="100"/>
       </w:pPr>
       <w:r>
         <w:rPr>
           <w:rFonts w:ascii="Times New Roman" w:hAnsi="Times New Roman" w:cs="Times New Roman" w:eastAsia="黑体"/>
           <w:b w:val="0"/>
+          <w:sz w:val="24"/>
         </w:rPr>
         <w:t>3.1 工作稿 提交与恢复</w:t>
       </w:r>
@@ -904,12 +963,13 @@
     <w:p>
       <w:pPr>
         <w:widowControl/>
-        <w:spacing w:line="360" w:lineRule="auto" w:after="60"/>
-        <w:ind w:firstLine="420"/>
+        <w:spacing w:line="348" w:lineRule="auto" w:after="40"/>
+        <w:ind w:firstLine="460"/>
       </w:pPr>
       <w:r>
         <w:rPr>
           <w:rFonts w:ascii="Times New Roman" w:hAnsi="Times New Roman" w:cs="Times New Roman" w:eastAsia="宋体"/>
+          <w:sz w:val="23"/>
         </w:rPr>
         <w:t>工作稿用于保存尚未提交为版本的修改，仅作者可见。保存工作稿不更改当前版本，其他用户和问卷只能选择已提交版本。提交时可指定任意已有版本作为父版本，因此同一来源题能够形成分支，而不是只能沿当前版本顺序覆盖。</w:t>
       </w:r>
@@ -917,12 +977,13 @@
     <w:p>
       <w:pPr>
         <w:widowControl/>
-        <w:spacing w:line="360" w:lineRule="auto" w:after="60"/>
-        <w:ind w:firstLine="420"/>
+        <w:spacing w:line="348" w:lineRule="auto" w:after="40"/>
+        <w:ind w:firstLine="460"/>
       </w:pPr>
       <w:r>
         <w:rPr>
           <w:rFonts w:ascii="Times New Roman" w:hAnsi="Times New Roman" w:cs="Times New Roman" w:eastAsia="宋体"/>
+          <w:sz w:val="23"/>
         </w:rPr>
         <w:t>恢复操作把选定历史内容复制为一个新版本，parent_version记录恢复操作前的当前版本，restored_from记录恢复内容来自哪一版。这样既可以恢复旧题，又不丢掉恢复前的修改过程。revision表示并发修订次数，版本ID表示题目内容历史，两者没有混用。</w:t>
       </w:r>
@@ -931,11 +992,12 @@
       <w:pPr>
         <w:keepNext/>
         <w:ind w:firstLine="0"/>
+        <w:jc w:val="center"/>
       </w:pPr>
       <w:r>
         <w:rPr>
           <w:rFonts w:ascii="Times New Roman" w:hAnsi="Times New Roman" w:cs="Times New Roman" w:eastAsia="宋体"/>
-          <w:sz w:val="19"/>
+          <w:sz w:val="20"/>
         </w:rPr>
         <w:t>图2 题目版本分支与恢复</w:t>
       </w:r>
@@ -986,12 +1048,13 @@
     <w:p>
       <w:pPr>
         <w:pStyle w:val="Heading2"/>
-        <w:spacing w:before="180" w:after="100"/>
+        <w:spacing w:before="160" w:after="100"/>
       </w:pPr>
       <w:r>
         <w:rPr>
           <w:rFonts w:ascii="Times New Roman" w:hAnsi="Times New Roman" w:cs="Times New Roman" w:eastAsia="黑体"/>
           <w:b w:val="0"/>
+          <w:sz w:val="24"/>
         </w:rPr>
         <w:t>3.2 复制题目与记录来源</w:t>
       </w:r>
@@ -999,12 +1062,13 @@
     <w:p>
       <w:pPr>
         <w:widowControl/>
-        <w:spacing w:line="360" w:lineRule="auto" w:after="60"/>
-        <w:ind w:firstLine="420"/>
+        <w:spacing w:line="348" w:lineRule="auto" w:after="40"/>
+        <w:ind w:firstLine="460"/>
       </w:pPr>
       <w:r>
         <w:rPr>
           <w:rFonts w:ascii="Times New Roman" w:hAnsi="Times New Roman" w:cs="Times New Roman" w:eastAsia="宋体"/>
+          <w:sz w:val="23"/>
         </w:rPr>
         <w:t>导入时复制指定版本内容，设置本卷题号并记录来源ID、版本和定义摘要。题库改版不更新副本，旧问卷继续按原题解释答卷；采用新版由创建者明确选择。</w:t>
       </w:r>
@@ -1012,12 +1076,13 @@
     <w:p>
       <w:pPr>
         <w:widowControl/>
-        <w:spacing w:line="360" w:lineRule="auto" w:after="60"/>
-        <w:ind w:firstLine="420"/>
+        <w:spacing w:line="348" w:lineRule="auto" w:after="40"/>
+        <w:ind w:firstLine="460"/>
       </w:pPr>
       <w:r>
         <w:rPr>
           <w:rFonts w:ascii="Times New Roman" w:hAnsi="Times New Roman" w:cs="Times New Roman" w:eastAsia="宋体"/>
+          <w:sz w:val="23"/>
         </w:rPr>
         <w:t>如果在草稿问卷内调整了已导入题，来源信息由服务器保留，实际题目定义重新参与统计分组。题目标题、选项、题型、必答和校验变化都按定义变化处理，避免不同含义的答案被合并。局部题号和本卷跳转不属于定义摘要；跳转只改变路径，不改变这个来源题的内容。</w:t>
       </w:r>
@@ -1025,12 +1090,13 @@
     <w:p>
       <w:pPr>
         <w:widowControl/>
-        <w:spacing w:line="360" w:lineRule="auto" w:after="60"/>
-        <w:ind w:firstLine="420"/>
+        <w:spacing w:line="348" w:lineRule="auto" w:after="40"/>
+        <w:ind w:firstLine="460"/>
       </w:pPr>
       <w:r>
         <w:rPr>
           <w:rFonts w:ascii="Times New Roman" w:hAnsi="Times New Roman" w:cs="Times New Roman" w:eastAsia="宋体"/>
+          <w:sz w:val="23"/>
         </w:rPr>
         <w:t>从问卷存入题库时，指向本卷其他题号的跳转会被移除，接口和页面明确提示。直接把这些跳转复制到另一问卷，可能产生不存在的目标或错误路径，所以导入后由创建者在目标问卷重新配置。原有后端路径计算、必答检查和发布校验继续执行。</w:t>
       </w:r>
@@ -1038,12 +1104,13 @@
     <w:p>
       <w:pPr>
         <w:pStyle w:val="Heading2"/>
-        <w:spacing w:before="180" w:after="100"/>
+        <w:spacing w:before="160" w:after="100"/>
       </w:pPr>
       <w:r>
         <w:rPr>
           <w:rFonts w:ascii="Times New Roman" w:hAnsi="Times New Roman" w:cs="Times New Roman" w:eastAsia="黑体"/>
           <w:b w:val="0"/>
+          <w:sz w:val="24"/>
         </w:rPr>
         <w:t>3.3 共享边界</w:t>
       </w:r>
@@ -1051,12 +1118,13 @@
     <w:p>
       <w:pPr>
         <w:widowControl/>
-        <w:spacing w:line="360" w:lineRule="auto" w:after="60"/>
-        <w:ind w:firstLine="420"/>
+        <w:spacing w:line="348" w:lineRule="auto" w:after="40"/>
+        <w:ind w:firstLine="460"/>
       </w:pPr>
       <w:r>
         <w:rPr>
           <w:rFonts w:ascii="Times New Roman" w:hAnsi="Times New Roman" w:cs="Times New Roman" w:eastAsia="宋体"/>
+          <w:sz w:val="23"/>
         </w:rPr>
         <w:t>共享授予题目读取和导入权限，不授予修改原题或读取别人答卷的权限。共享对象使用已注册用户名，未知账号被拒绝；作者可以替换或清空名单。撤销后阻止新的读取和导入，已经导入的问卷副本继续可用。</w:t>
       </w:r>
@@ -1064,12 +1132,13 @@
     <w:p>
       <w:pPr>
         <w:widowControl/>
-        <w:spacing w:line="360" w:lineRule="auto" w:after="60"/>
-        <w:ind w:firstLine="420"/>
+        <w:spacing w:line="348" w:lineRule="auto" w:after="40"/>
+        <w:ind w:firstLine="460"/>
       </w:pPr>
       <w:r>
         <w:rPr>
           <w:rFonts w:ascii="Times New Roman" w:hAnsi="Times New Roman" w:cs="Times New Roman" w:eastAsia="宋体"/>
+          <w:sz w:val="23"/>
         </w:rPr>
         <w:t>题主可查本人问卷名称、题号、版本和本卷修改标识；外部引用只显示次数。跨卷统计先限制问卷所有者，再按来源查答卷，不返回他人标题、链接或答案。全局统计需另行明确授权及匿名汇总规则。</w:t>
       </w:r>
@@ -1077,12 +1146,13 @@
     <w:p>
       <w:pPr>
         <w:pStyle w:val="Heading1"/>
-        <w:spacing w:before="200" w:after="100"/>
+        <w:spacing w:before="240" w:after="100"/>
       </w:pPr>
       <w:r>
         <w:rPr>
           <w:rFonts w:ascii="Times New Roman" w:hAnsi="Times New Roman" w:cs="Times New Roman" w:eastAsia="黑体"/>
           <w:b w:val="0"/>
+          <w:sz w:val="27"/>
         </w:rPr>
         <w:t>四 MongoDB操作与统计口径</w:t>
       </w:r>
@@ -1090,12 +1160,13 @@
     <w:p>
       <w:pPr>
         <w:widowControl/>
-        <w:spacing w:line="360" w:lineRule="auto" w:after="60"/>
-        <w:ind w:firstLine="420"/>
+        <w:spacing w:line="348" w:lineRule="auto" w:after="40"/>
+        <w:ind w:firstLine="460"/>
       </w:pPr>
       <w:r>
         <w:rPr>
           <w:rFonts w:ascii="Times New Roman" w:hAnsi="Times New Roman" w:cs="Times New Roman" w:eastAsia="宋体"/>
+          <w:sz w:val="23"/>
         </w:rPr>
         <w:t>跨卷统计沿用MongoDB聚合，由问卷中的source查找同一来源题的使用位置，再从本人问卷的正式答卷展开answers。每个回答按“来源版本ID与实际定义摘要”分组。同一题在两份问卷中各回答一次计为两次作答，分母不是去重人数；跳过题和明确空答不会生成有效答案记录。</w:t>
       </w:r>
@@ -1103,12 +1174,13 @@
     <w:p>
       <w:pPr>
         <w:widowControl/>
-        <w:spacing w:line="360" w:lineRule="auto" w:after="60"/>
-        <w:ind w:firstLine="420"/>
+        <w:spacing w:line="348" w:lineRule="auto" w:after="40"/>
+        <w:ind w:firstLine="460"/>
       </w:pPr>
       <w:r>
         <w:rPr>
           <w:rFonts w:ascii="Times New Roman" w:hAnsi="Times New Roman" w:cs="Times New Roman" w:eastAsia="宋体"/>
+          <w:sz w:val="23"/>
         </w:rPr>
         <w:t>单选和多选使用展开与分组计算各选项次数。多选每项占比除以该题有效作答次数，合计可以超过100%。数字题使用平均、最小、最大聚合，并通过$bucketAuto生成最多10个自适应区间；区间左端包含、右端不含，最后区间包含右端。不同分组的区间由各自数据生成，不能把它们当作统一年龄段直接比较。</w:t>
       </w:r>
@@ -1116,12 +1188,13 @@
     <w:p>
       <w:pPr>
         <w:widowControl/>
-        <w:spacing w:line="360" w:lineRule="auto" w:after="60"/>
-        <w:ind w:firstLine="420"/>
+        <w:spacing w:line="348" w:lineRule="auto" w:after="40"/>
+        <w:ind w:firstLine="460"/>
       </w:pPr>
       <w:r>
         <w:rPr>
           <w:rFonts w:ascii="Times New Roman" w:hAnsi="Times New Roman" w:cs="Times New Roman" w:eastAsia="宋体"/>
+          <w:sz w:val="23"/>
         </w:rPr>
         <w:t>文本题按提交时间及答卷ID排序，每页20条；总作答次数与当前页内容分开返回。数字0参与平均，空数字组返回null均值和空分布。统计使用同一个$facet输入完成分支汇总，避免为总数与选项次数分别读取带来的结果差异。选项分支只处理选择题，文本不会进入无意义的选项汇总。</w:t>
       </w:r>
@@ -1130,11 +1203,12 @@
       <w:pPr>
         <w:keepNext/>
         <w:ind w:firstLine="0"/>
+        <w:jc w:val="center"/>
       </w:pPr>
       <w:r>
         <w:rPr>
           <w:rFonts w:ascii="Times New Roman" w:hAnsi="Times New Roman" w:cs="Times New Roman" w:eastAsia="宋体"/>
-          <w:sz w:val="19"/>
+          <w:sz w:val="20"/>
         </w:rPr>
         <w:t>表3 本次扩展实际使用的MongoDB能力</w:t>
       </w:r>
@@ -1154,17 +1228,18 @@
         </w:tblBorders>
       </w:tblPr>
       <w:tblGrid>
-        <w:gridCol w:w="3213"/>
-        <w:gridCol w:w="3213"/>
-        <w:gridCol w:w="3213"/>
+        <w:gridCol w:w="1928"/>
+        <w:gridCol w:w="3515"/>
+        <w:gridCol w:w="4195"/>
       </w:tblGrid>
       <w:tr>
         <w:trPr>
           <w:tblHeader/>
+          <w:cantSplit/>
         </w:trPr>
         <w:tc>
           <w:tcPr>
-            <w:tcW w:type="dxa" w:w="3213"/>
+            <w:tcW w:type="dxa" w:w="1928"/>
             <w:tcBorders>
               <w:bottom w:val="single" w:sz="4"/>
             </w:tcBorders>
@@ -1172,13 +1247,13 @@
           <w:p>
             <w:pPr>
               <w:keepNext/>
-              <w:spacing w:after="60" w:before="60" w:line="324" w:lineRule="auto"/>
+              <w:spacing w:after="60" w:before="60" w:line="300" w:lineRule="auto"/>
             </w:pPr>
             <w:r>
               <w:rPr>
                 <w:rFonts w:ascii="Times New Roman" w:hAnsi="Times New Roman" w:cs="Times New Roman" w:eastAsia="黑体"/>
                 <w:b w:val="0"/>
-                <w:sz w:val="18"/>
+                <w:sz w:val="20"/>
               </w:rPr>
               <w:t>操作</w:t>
             </w:r>
@@ -1186,7 +1261,7 @@
         </w:tc>
         <w:tc>
           <w:tcPr>
-            <w:tcW w:type="dxa" w:w="3213"/>
+            <w:tcW w:type="dxa" w:w="3515"/>
             <w:tcBorders>
               <w:bottom w:val="single" w:sz="4"/>
             </w:tcBorders>
@@ -1194,13 +1269,13 @@
           <w:p>
             <w:pPr>
               <w:keepNext/>
-              <w:spacing w:after="60" w:before="60" w:line="324" w:lineRule="auto"/>
+              <w:spacing w:after="60" w:before="60" w:line="300" w:lineRule="auto"/>
             </w:pPr>
             <w:r>
               <w:rPr>
                 <w:rFonts w:ascii="Times New Roman" w:hAnsi="Times New Roman" w:cs="Times New Roman" w:eastAsia="黑体"/>
                 <w:b w:val="0"/>
-                <w:sz w:val="18"/>
+                <w:sz w:val="20"/>
               </w:rPr>
               <w:t>用途</w:t>
             </w:r>
@@ -1208,7 +1283,7 @@
         </w:tc>
         <w:tc>
           <w:tcPr>
-            <w:tcW w:type="dxa" w:w="3213"/>
+            <w:tcW w:type="dxa" w:w="4195"/>
             <w:tcBorders>
               <w:bottom w:val="single" w:sz="4"/>
             </w:tcBorders>
@@ -1216,13 +1291,13 @@
           <w:p>
             <w:pPr>
               <w:keepNext/>
-              <w:spacing w:after="60" w:before="60" w:line="324" w:lineRule="auto"/>
+              <w:spacing w:after="60" w:before="60" w:line="300" w:lineRule="auto"/>
             </w:pPr>
             <w:r>
               <w:rPr>
                 <w:rFonts w:ascii="Times New Roman" w:hAnsi="Times New Roman" w:cs="Times New Roman" w:eastAsia="黑体"/>
                 <w:b w:val="0"/>
-                <w:sz w:val="18"/>
+                <w:sz w:val="20"/>
               </w:rPr>
               <w:t>实现依据</w:t>
             </w:r>
@@ -1230,19 +1305,22 @@
         </w:tc>
       </w:tr>
       <w:tr>
+        <w:trPr>
+          <w:cantSplit/>
+        </w:trPr>
         <w:tc>
           <w:tcPr>
-            <w:tcW w:type="dxa" w:w="3213"/>
+            <w:tcW w:type="dxa" w:w="1928"/>
           </w:tcPr>
           <w:p>
             <w:pPr>
-              <w:spacing w:after="60" w:before="60" w:line="324" w:lineRule="auto"/>
+              <w:spacing w:after="60" w:before="60" w:line="300" w:lineRule="auto"/>
             </w:pPr>
             <w:r>
               <w:rPr>
                 <w:rFonts w:ascii="Times New Roman" w:hAnsi="Times New Roman" w:cs="Times New Roman" w:eastAsia="宋体"/>
                 <w:b w:val="0"/>
-                <w:sz w:val="18"/>
+                <w:sz w:val="20"/>
               </w:rPr>
               <w:t>插入与条件更新</w:t>
             </w:r>
@@ -1250,17 +1328,17 @@
         </w:tc>
         <w:tc>
           <w:tcPr>
-            <w:tcW w:type="dxa" w:w="3213"/>
+            <w:tcW w:type="dxa" w:w="3515"/>
           </w:tcPr>
           <w:p>
             <w:pPr>
-              <w:spacing w:after="60" w:before="60" w:line="324" w:lineRule="auto"/>
+              <w:spacing w:after="60" w:before="60" w:line="300" w:lineRule="auto"/>
             </w:pPr>
             <w:r>
               <w:rPr>
                 <w:rFonts w:ascii="Times New Roman" w:hAnsi="Times New Roman" w:cs="Times New Roman" w:eastAsia="宋体"/>
                 <w:b w:val="0"/>
-                <w:sz w:val="18"/>
+                <w:sz w:val="20"/>
               </w:rPr>
               <w:t>创建题库、题目及版本，拒绝过期修订号</w:t>
             </w:r>
@@ -1268,17 +1346,17 @@
         </w:tc>
         <w:tc>
           <w:tcPr>
-            <w:tcW w:type="dxa" w:w="3213"/>
+            <w:tcW w:type="dxa" w:w="4195"/>
           </w:tcPr>
           <w:p>
             <w:pPr>
-              <w:spacing w:after="60" w:before="60" w:line="324" w:lineRule="auto"/>
+              <w:spacing w:after="60" w:before="60" w:line="300" w:lineRule="auto"/>
             </w:pPr>
             <w:r>
               <w:rPr>
                 <w:rFonts w:ascii="Times New Roman" w:hAnsi="Times New Roman" w:cs="Times New Roman" w:eastAsia="宋体"/>
                 <w:b w:val="0"/>
-                <w:sz w:val="18"/>
+                <w:sz w:val="20"/>
               </w:rPr>
               <w:t>insert_one、带revision条件的update_one</w:t>
             </w:r>
@@ -1286,19 +1364,22 @@
         </w:tc>
       </w:tr>
       <w:tr>
+        <w:trPr>
+          <w:cantSplit/>
+        </w:trPr>
         <w:tc>
           <w:tcPr>
-            <w:tcW w:type="dxa" w:w="3213"/>
+            <w:tcW w:type="dxa" w:w="1928"/>
           </w:tcPr>
           <w:p>
             <w:pPr>
-              <w:spacing w:after="60" w:before="60" w:line="324" w:lineRule="auto"/>
+              <w:spacing w:after="60" w:before="60" w:line="300" w:lineRule="auto"/>
             </w:pPr>
             <w:r>
               <w:rPr>
                 <w:rFonts w:ascii="Times New Roman" w:hAnsi="Times New Roman" w:cs="Times New Roman" w:eastAsia="宋体"/>
                 <w:b w:val="0"/>
-                <w:sz w:val="18"/>
+                <w:sz w:val="20"/>
               </w:rPr>
               <w:t>嵌套字段和数组查询</w:t>
             </w:r>
@@ -1306,17 +1387,17 @@
         </w:tc>
         <w:tc>
           <w:tcPr>
-            <w:tcW w:type="dxa" w:w="3213"/>
+            <w:tcW w:type="dxa" w:w="3515"/>
           </w:tcPr>
           <w:p>
             <w:pPr>
-              <w:spacing w:after="60" w:before="60" w:line="324" w:lineRule="auto"/>
+              <w:spacing w:after="60" w:before="60" w:line="300" w:lineRule="auto"/>
             </w:pPr>
             <w:r>
               <w:rPr>
                 <w:rFonts w:ascii="Times New Roman" w:hAnsi="Times New Roman" w:cs="Times New Roman" w:eastAsia="宋体"/>
                 <w:b w:val="0"/>
-                <w:sz w:val="18"/>
+                <w:sz w:val="20"/>
               </w:rPr>
               <w:t>查找来源题与共享对象、定位问卷题目</w:t>
             </w:r>
@@ -1324,17 +1405,17 @@
         </w:tc>
         <w:tc>
           <w:tcPr>
-            <w:tcW w:type="dxa" w:w="3213"/>
+            <w:tcW w:type="dxa" w:w="4195"/>
           </w:tcPr>
           <w:p>
             <w:pPr>
-              <w:spacing w:after="60" w:before="60" w:line="324" w:lineRule="auto"/>
+              <w:spacing w:after="60" w:before="60" w:line="300" w:lineRule="auto"/>
             </w:pPr>
             <w:r>
               <w:rPr>
                 <w:rFonts w:ascii="Times New Roman" w:hAnsi="Times New Roman" w:cs="Times New Roman" w:eastAsia="宋体"/>
                 <w:b w:val="0"/>
-                <w:sz w:val="18"/>
+                <w:sz w:val="20"/>
               </w:rPr>
               <w:t>questions.source.library_id、shared_with</w:t>
             </w:r>
@@ -1342,19 +1423,22 @@
         </w:tc>
       </w:tr>
       <w:tr>
+        <w:trPr>
+          <w:cantSplit/>
+        </w:trPr>
         <w:tc>
           <w:tcPr>
-            <w:tcW w:type="dxa" w:w="3213"/>
+            <w:tcW w:type="dxa" w:w="1928"/>
           </w:tcPr>
           <w:p>
             <w:pPr>
-              <w:spacing w:after="60" w:before="60" w:line="324" w:lineRule="auto"/>
+              <w:spacing w:after="60" w:before="60" w:line="300" w:lineRule="auto"/>
             </w:pPr>
             <w:r>
               <w:rPr>
                 <w:rFonts w:ascii="Times New Roman" w:hAnsi="Times New Roman" w:cs="Times New Roman" w:eastAsia="宋体"/>
                 <w:b w:val="0"/>
-                <w:sz w:val="18"/>
+                <w:sz w:val="20"/>
               </w:rPr>
               <w:t>聚合与分桶</w:t>
             </w:r>
@@ -1362,17 +1446,17 @@
         </w:tc>
         <w:tc>
           <w:tcPr>
-            <w:tcW w:type="dxa" w:w="3213"/>
+            <w:tcW w:type="dxa" w:w="3515"/>
           </w:tcPr>
           <w:p>
             <w:pPr>
-              <w:spacing w:after="60" w:before="60" w:line="324" w:lineRule="auto"/>
+              <w:spacing w:after="60" w:before="60" w:line="300" w:lineRule="auto"/>
             </w:pPr>
             <w:r>
               <w:rPr>
                 <w:rFonts w:ascii="Times New Roman" w:hAnsi="Times New Roman" w:cs="Times New Roman" w:eastAsia="宋体"/>
                 <w:b w:val="0"/>
-                <w:sz w:val="18"/>
+                <w:sz w:val="20"/>
               </w:rPr>
               <w:t>跨卷次数、平均、范围、数字分布和文本分页</w:t>
             </w:r>
@@ -1380,17 +1464,17 @@
         </w:tc>
         <w:tc>
           <w:tcPr>
-            <w:tcW w:type="dxa" w:w="3213"/>
+            <w:tcW w:type="dxa" w:w="4195"/>
           </w:tcPr>
           <w:p>
             <w:pPr>
-              <w:spacing w:after="60" w:before="60" w:line="324" w:lineRule="auto"/>
+              <w:spacing w:after="60" w:before="60" w:line="300" w:lineRule="auto"/>
             </w:pPr>
             <w:r>
               <w:rPr>
                 <w:rFonts w:ascii="Times New Roman" w:hAnsi="Times New Roman" w:cs="Times New Roman" w:eastAsia="宋体"/>
                 <w:b w:val="0"/>
-                <w:sz w:val="18"/>
+                <w:sz w:val="20"/>
               </w:rPr>
               <w:t>$match、$unwind、$group、$facet、$avg、$bucketAuto、$skip、$limit</w:t>
             </w:r>
@@ -1398,19 +1482,22 @@
         </w:tc>
       </w:tr>
       <w:tr>
+        <w:trPr>
+          <w:cantSplit/>
+        </w:trPr>
         <w:tc>
           <w:tcPr>
-            <w:tcW w:type="dxa" w:w="3213"/>
+            <w:tcW w:type="dxa" w:w="1928"/>
           </w:tcPr>
           <w:p>
             <w:pPr>
-              <w:spacing w:after="60" w:before="60" w:line="324" w:lineRule="auto"/>
+              <w:spacing w:after="60" w:before="60" w:line="300" w:lineRule="auto"/>
             </w:pPr>
             <w:r>
               <w:rPr>
                 <w:rFonts w:ascii="Times New Roman" w:hAnsi="Times New Roman" w:cs="Times New Roman" w:eastAsia="宋体"/>
                 <w:b w:val="0"/>
-                <w:sz w:val="18"/>
+                <w:sz w:val="20"/>
               </w:rPr>
               <w:t>验证器与索引</w:t>
             </w:r>
@@ -1418,17 +1505,17 @@
         </w:tc>
         <w:tc>
           <w:tcPr>
-            <w:tcW w:type="dxa" w:w="3213"/>
+            <w:tcW w:type="dxa" w:w="3515"/>
           </w:tcPr>
           <w:p>
             <w:pPr>
-              <w:spacing w:after="60" w:before="60" w:line="324" w:lineRule="auto"/>
+              <w:spacing w:after="60" w:before="60" w:line="300" w:lineRule="auto"/>
             </w:pPr>
             <w:r>
               <w:rPr>
                 <w:rFonts w:ascii="Times New Roman" w:hAnsi="Times New Roman" w:cs="Times New Roman" w:eastAsia="宋体"/>
                 <w:b w:val="0"/>
-                <w:sz w:val="18"/>
+                <w:sz w:val="20"/>
               </w:rPr>
               <w:t>约束新增数据类型，支持权限及引用查询</w:t>
             </w:r>
@@ -1436,17 +1523,17 @@
         </w:tc>
         <w:tc>
           <w:tcPr>
-            <w:tcW w:type="dxa" w:w="3213"/>
+            <w:tcW w:type="dxa" w:w="4195"/>
           </w:tcPr>
           <w:p>
             <w:pPr>
-              <w:spacing w:after="60" w:before="60" w:line="324" w:lineRule="auto"/>
+              <w:spacing w:after="60" w:before="60" w:line="300" w:lineRule="auto"/>
             </w:pPr>
             <w:r>
               <w:rPr>
                 <w:rFonts w:ascii="Times New Roman" w:hAnsi="Times New Roman" w:cs="Times New Roman" w:eastAsia="宋体"/>
                 <w:b w:val="0"/>
-                <w:sz w:val="18"/>
+                <w:sz w:val="20"/>
               </w:rPr>
               <w:t>backend/database.py中的Schema和新增索引</w:t>
             </w:r>
@@ -1457,12 +1544,13 @@
     <w:p>
       <w:pPr>
         <w:pStyle w:val="Heading1"/>
-        <w:spacing w:before="200" w:after="100"/>
+        <w:spacing w:before="240" w:after="100"/>
       </w:pPr>
       <w:r>
         <w:rPr>
           <w:rFonts w:ascii="Times New Roman" w:hAnsi="Times New Roman" w:cs="Times New Roman" w:eastAsia="黑体"/>
           <w:b w:val="0"/>
+          <w:sz w:val="27"/>
         </w:rPr>
         <w:t>五 测试与兼容性验证</w:t>
       </w:r>
@@ -1470,12 +1558,13 @@
     <w:p>
       <w:pPr>
         <w:widowControl/>
-        <w:spacing w:line="360" w:lineRule="auto" w:after="60"/>
-        <w:ind w:firstLine="420"/>
+        <w:spacing w:line="348" w:lineRule="auto" w:after="40"/>
+        <w:ind w:firstLine="460"/>
       </w:pPr>
       <w:r>
         <w:rPr>
           <w:rFonts w:ascii="Times New Roman" w:hAnsi="Times New Roman" w:cs="Times New Roman" w:eastAsia="宋体"/>
+          <w:sz w:val="23"/>
         </w:rPr>
         <w:t>测试采用Python assert、真实MongoDB API测试和Playwright浏览器检查。自动测试创建随机survey_test_数据库，结束时清理；浏览器使用独立测试库，不清空原业务库。2026年10月28日本轮52项测试全部通过，其中原第一阶段38项保留，新增14项覆盖题库与统计；实际时间和逐项结果在tests/results/stage2-latest.json。</w:t>
       </w:r>
@@ -1484,11 +1573,12 @@
       <w:pPr>
         <w:keepNext/>
         <w:ind w:firstLine="0"/>
+        <w:jc w:val="center"/>
       </w:pPr>
       <w:r>
         <w:rPr>
           <w:rFonts w:ascii="Times New Roman" w:hAnsi="Times New Roman" w:cs="Times New Roman" w:eastAsia="宋体"/>
-          <w:sz w:val="19"/>
+          <w:sz w:val="20"/>
         </w:rPr>
         <w:t>表4 第二阶段的主要验证</w:t>
       </w:r>
@@ -1508,17 +1598,18 @@
         </w:tblBorders>
       </w:tblPr>
       <w:tblGrid>
-        <w:gridCol w:w="3213"/>
-        <w:gridCol w:w="3213"/>
-        <w:gridCol w:w="3213"/>
+        <w:gridCol w:w="2835"/>
+        <w:gridCol w:w="4535"/>
+        <w:gridCol w:w="2268"/>
       </w:tblGrid>
       <w:tr>
         <w:trPr>
           <w:tblHeader/>
+          <w:cantSplit/>
         </w:trPr>
         <w:tc>
           <w:tcPr>
-            <w:tcW w:type="dxa" w:w="3213"/>
+            <w:tcW w:type="dxa" w:w="2835"/>
             <w:tcBorders>
               <w:bottom w:val="single" w:sz="4"/>
             </w:tcBorders>
@@ -1526,13 +1617,13 @@
           <w:p>
             <w:pPr>
               <w:keepNext/>
-              <w:spacing w:after="60" w:before="60" w:line="324" w:lineRule="auto"/>
+              <w:spacing w:after="60" w:before="60" w:line="300" w:lineRule="auto"/>
             </w:pPr>
             <w:r>
               <w:rPr>
                 <w:rFonts w:ascii="Times New Roman" w:hAnsi="Times New Roman" w:cs="Times New Roman" w:eastAsia="黑体"/>
                 <w:b w:val="0"/>
-                <w:sz w:val="18"/>
+                <w:sz w:val="20"/>
               </w:rPr>
               <w:t>场景与输入</w:t>
             </w:r>
@@ -1540,7 +1631,7 @@
         </w:tc>
         <w:tc>
           <w:tcPr>
-            <w:tcW w:type="dxa" w:w="3213"/>
+            <w:tcW w:type="dxa" w:w="4535"/>
             <w:tcBorders>
               <w:bottom w:val="single" w:sz="4"/>
             </w:tcBorders>
@@ -1548,13 +1639,13 @@
           <w:p>
             <w:pPr>
               <w:keepNext/>
-              <w:spacing w:after="60" w:before="60" w:line="324" w:lineRule="auto"/>
+              <w:spacing w:after="60" w:before="60" w:line="300" w:lineRule="auto"/>
             </w:pPr>
             <w:r>
               <w:rPr>
                 <w:rFonts w:ascii="Times New Roman" w:hAnsi="Times New Roman" w:cs="Times New Roman" w:eastAsia="黑体"/>
                 <w:b w:val="0"/>
-                <w:sz w:val="18"/>
+                <w:sz w:val="20"/>
               </w:rPr>
               <w:t>期望结果</w:t>
             </w:r>
@@ -1562,7 +1653,7 @@
         </w:tc>
         <w:tc>
           <w:tcPr>
-            <w:tcW w:type="dxa" w:w="3213"/>
+            <w:tcW w:type="dxa" w:w="2268"/>
             <w:tcBorders>
               <w:bottom w:val="single" w:sz="4"/>
             </w:tcBorders>
@@ -1570,13 +1661,13 @@
           <w:p>
             <w:pPr>
               <w:keepNext/>
-              <w:spacing w:after="60" w:before="60" w:line="324" w:lineRule="auto"/>
+              <w:spacing w:after="60" w:before="60" w:line="300" w:lineRule="auto"/>
             </w:pPr>
             <w:r>
               <w:rPr>
                 <w:rFonts w:ascii="Times New Roman" w:hAnsi="Times New Roman" w:cs="Times New Roman" w:eastAsia="黑体"/>
                 <w:b w:val="0"/>
-                <w:sz w:val="18"/>
+                <w:sz w:val="20"/>
               </w:rPr>
               <w:t>实际结果</w:t>
             </w:r>
@@ -1584,19 +1675,22 @@
         </w:tc>
       </w:tr>
       <w:tr>
+        <w:trPr>
+          <w:cantSplit/>
+        </w:trPr>
         <w:tc>
           <w:tcPr>
-            <w:tcW w:type="dxa" w:w="3213"/>
+            <w:tcW w:type="dxa" w:w="2835"/>
           </w:tcPr>
           <w:p>
             <w:pPr>
-              <w:spacing w:after="60" w:before="60" w:line="324" w:lineRule="auto"/>
+              <w:spacing w:after="60" w:before="60" w:line="300" w:lineRule="auto"/>
             </w:pPr>
             <w:r>
               <w:rPr>
                 <w:rFonts w:ascii="Times New Roman" w:hAnsi="Times New Roman" w:cs="Times New Roman" w:eastAsia="宋体"/>
                 <w:b w:val="0"/>
-                <w:sz w:val="18"/>
+                <w:sz w:val="20"/>
               </w:rPr>
               <w:t>工作稿保存 再提交并从旧版分支恢复</w:t>
             </w:r>
@@ -1604,17 +1698,17 @@
         </w:tc>
         <w:tc>
           <w:tcPr>
-            <w:tcW w:type="dxa" w:w="3213"/>
+            <w:tcW w:type="dxa" w:w="4535"/>
           </w:tcPr>
           <w:p>
             <w:pPr>
-              <w:spacing w:after="60" w:before="60" w:line="324" w:lineRule="auto"/>
+              <w:spacing w:after="60" w:before="60" w:line="300" w:lineRule="auto"/>
             </w:pPr>
             <w:r>
               <w:rPr>
                 <w:rFonts w:ascii="Times New Roman" w:hAnsi="Times New Roman" w:cs="Times New Roman" w:eastAsia="宋体"/>
                 <w:b w:val="0"/>
-                <w:sz w:val="18"/>
+                <w:sz w:val="20"/>
               </w:rPr>
               <w:t>原版本不改，父版本和恢复来源准确</w:t>
             </w:r>
@@ -1622,17 +1716,17 @@
         </w:tc>
         <w:tc>
           <w:tcPr>
-            <w:tcW w:type="dxa" w:w="3213"/>
+            <w:tcW w:type="dxa" w:w="2268"/>
           </w:tcPr>
           <w:p>
             <w:pPr>
-              <w:spacing w:after="60" w:before="60" w:line="324" w:lineRule="auto"/>
+              <w:spacing w:after="60" w:before="60" w:line="300" w:lineRule="auto"/>
             </w:pPr>
             <w:r>
               <w:rPr>
                 <w:rFonts w:ascii="Times New Roman" w:hAnsi="Times New Roman" w:cs="Times New Roman" w:eastAsia="宋体"/>
                 <w:b w:val="0"/>
-                <w:sz w:val="18"/>
+                <w:sz w:val="20"/>
               </w:rPr>
               <w:t>通过</w:t>
             </w:r>
@@ -1640,19 +1734,22 @@
         </w:tc>
       </w:tr>
       <w:tr>
+        <w:trPr>
+          <w:cantSplit/>
+        </w:trPr>
         <w:tc>
           <w:tcPr>
-            <w:tcW w:type="dxa" w:w="3213"/>
+            <w:tcW w:type="dxa" w:w="2835"/>
           </w:tcPr>
           <w:p>
             <w:pPr>
-              <w:spacing w:after="60" w:before="60" w:line="324" w:lineRule="auto"/>
+              <w:spacing w:after="60" w:before="60" w:line="300" w:lineRule="auto"/>
             </w:pPr>
             <w:r>
               <w:rPr>
                 <w:rFonts w:ascii="Times New Roman" w:hAnsi="Times New Roman" w:cs="Times New Roman" w:eastAsia="宋体"/>
                 <w:b w:val="0"/>
-                <w:sz w:val="18"/>
+                <w:sz w:val="20"/>
               </w:rPr>
               <w:t>发布旧版问卷后修改题库</w:t>
             </w:r>
@@ -1660,17 +1757,17 @@
         </w:tc>
         <w:tc>
           <w:tcPr>
-            <w:tcW w:type="dxa" w:w="3213"/>
+            <w:tcW w:type="dxa" w:w="4535"/>
           </w:tcPr>
           <w:p>
             <w:pPr>
-              <w:spacing w:after="60" w:before="60" w:line="324" w:lineRule="auto"/>
+              <w:spacing w:after="60" w:before="60" w:line="300" w:lineRule="auto"/>
             </w:pPr>
             <w:r>
               <w:rPr>
                 <w:rFonts w:ascii="Times New Roman" w:hAnsi="Times New Roman" w:cs="Times New Roman" w:eastAsia="宋体"/>
                 <w:b w:val="0"/>
-                <w:sz w:val="18"/>
+                <w:sz w:val="20"/>
               </w:rPr>
               <w:t>原问卷内容不变，仍可选择旧版</w:t>
             </w:r>
@@ -1678,17 +1775,17 @@
         </w:tc>
         <w:tc>
           <w:tcPr>
-            <w:tcW w:type="dxa" w:w="3213"/>
+            <w:tcW w:type="dxa" w:w="2268"/>
           </w:tcPr>
           <w:p>
             <w:pPr>
-              <w:spacing w:after="60" w:before="60" w:line="324" w:lineRule="auto"/>
+              <w:spacing w:after="60" w:before="60" w:line="300" w:lineRule="auto"/>
             </w:pPr>
             <w:r>
               <w:rPr>
                 <w:rFonts w:ascii="Times New Roman" w:hAnsi="Times New Roman" w:cs="Times New Roman" w:eastAsia="宋体"/>
                 <w:b w:val="0"/>
-                <w:sz w:val="18"/>
+                <w:sz w:val="20"/>
               </w:rPr>
               <w:t>通过</w:t>
             </w:r>
@@ -1696,19 +1793,22 @@
         </w:tc>
       </w:tr>
       <w:tr>
+        <w:trPr>
+          <w:cantSplit/>
+        </w:trPr>
         <w:tc>
           <w:tcPr>
-            <w:tcW w:type="dxa" w:w="3213"/>
+            <w:tcW w:type="dxa" w:w="2835"/>
           </w:tcPr>
           <w:p>
             <w:pPr>
-              <w:spacing w:after="60" w:before="60" w:line="324" w:lineRule="auto"/>
+              <w:spacing w:after="60" w:before="60" w:line="300" w:lineRule="auto"/>
             </w:pPr>
             <w:r>
               <w:rPr>
                 <w:rFonts w:ascii="Times New Roman" w:hAnsi="Times New Roman" w:cs="Times New Roman" w:eastAsia="宋体"/>
                 <w:b w:val="0"/>
-                <w:sz w:val="18"/>
+                <w:sz w:val="20"/>
               </w:rPr>
               <w:t>两个请求携相同revision改题</w:t>
             </w:r>
@@ -1716,17 +1816,17 @@
         </w:tc>
         <w:tc>
           <w:tcPr>
-            <w:tcW w:type="dxa" w:w="3213"/>
+            <w:tcW w:type="dxa" w:w="4535"/>
           </w:tcPr>
           <w:p>
             <w:pPr>
-              <w:spacing w:after="60" w:before="60" w:line="324" w:lineRule="auto"/>
+              <w:spacing w:after="60" w:before="60" w:line="300" w:lineRule="auto"/>
             </w:pPr>
             <w:r>
               <w:rPr>
                 <w:rFonts w:ascii="Times New Roman" w:hAnsi="Times New Roman" w:cs="Times New Roman" w:eastAsia="宋体"/>
                 <w:b w:val="0"/>
-                <w:sz w:val="18"/>
+                <w:sz w:val="20"/>
               </w:rPr>
               <w:t>一个200，另一个409，不丢历史</w:t>
             </w:r>
@@ -1734,17 +1834,17 @@
         </w:tc>
         <w:tc>
           <w:tcPr>
-            <w:tcW w:type="dxa" w:w="3213"/>
+            <w:tcW w:type="dxa" w:w="2268"/>
           </w:tcPr>
           <w:p>
             <w:pPr>
-              <w:spacing w:after="60" w:before="60" w:line="324" w:lineRule="auto"/>
+              <w:spacing w:after="60" w:before="60" w:line="300" w:lineRule="auto"/>
             </w:pPr>
             <w:r>
               <w:rPr>
                 <w:rFonts w:ascii="Times New Roman" w:hAnsi="Times New Roman" w:cs="Times New Roman" w:eastAsia="宋体"/>
                 <w:b w:val="0"/>
-                <w:sz w:val="18"/>
+                <w:sz w:val="20"/>
               </w:rPr>
               <w:t>通过</w:t>
             </w:r>
@@ -1752,19 +1852,22 @@
         </w:tc>
       </w:tr>
       <w:tr>
+        <w:trPr>
+          <w:cantSplit/>
+        </w:trPr>
         <w:tc>
           <w:tcPr>
-            <w:tcW w:type="dxa" w:w="3213"/>
+            <w:tcW w:type="dxa" w:w="2835"/>
           </w:tcPr>
           <w:p>
             <w:pPr>
-              <w:spacing w:after="60" w:before="60" w:line="324" w:lineRule="auto"/>
+              <w:spacing w:after="60" w:before="60" w:line="300" w:lineRule="auto"/>
             </w:pPr>
             <w:r>
               <w:rPr>
                 <w:rFonts w:ascii="Times New Roman" w:hAnsi="Times New Roman" w:cs="Times New Roman" w:eastAsia="宋体"/>
                 <w:b w:val="0"/>
-                <w:sz w:val="18"/>
+                <w:sz w:val="20"/>
               </w:rPr>
               <w:t>共享双方各提交不同选项</w:t>
             </w:r>
@@ -1772,17 +1875,17 @@
         </w:tc>
         <w:tc>
           <w:tcPr>
-            <w:tcW w:type="dxa" w:w="3213"/>
+            <w:tcW w:type="dxa" w:w="4535"/>
           </w:tcPr>
           <w:p>
             <w:pPr>
-              <w:spacing w:after="60" w:before="60" w:line="324" w:lineRule="auto"/>
+              <w:spacing w:after="60" w:before="60" w:line="300" w:lineRule="auto"/>
             </w:pPr>
             <w:r>
               <w:rPr>
                 <w:rFonts w:ascii="Times New Roman" w:hAnsi="Times New Roman" w:cs="Times New Roman" w:eastAsia="宋体"/>
                 <w:b w:val="0"/>
-                <w:sz w:val="18"/>
+                <w:sz w:val="20"/>
               </w:rPr>
               <w:t>每人只汇总自己的问卷和答卷</w:t>
             </w:r>
@@ -1790,17 +1893,17 @@
         </w:tc>
         <w:tc>
           <w:tcPr>
-            <w:tcW w:type="dxa" w:w="3213"/>
+            <w:tcW w:type="dxa" w:w="2268"/>
           </w:tcPr>
           <w:p>
             <w:pPr>
-              <w:spacing w:after="60" w:before="60" w:line="324" w:lineRule="auto"/>
+              <w:spacing w:after="60" w:before="60" w:line="300" w:lineRule="auto"/>
             </w:pPr>
             <w:r>
               <w:rPr>
                 <w:rFonts w:ascii="Times New Roman" w:hAnsi="Times New Roman" w:cs="Times New Roman" w:eastAsia="宋体"/>
                 <w:b w:val="0"/>
-                <w:sz w:val="18"/>
+                <w:sz w:val="20"/>
               </w:rPr>
               <w:t>通过</w:t>
             </w:r>
@@ -1808,19 +1911,22 @@
         </w:tc>
       </w:tr>
       <w:tr>
+        <w:trPr>
+          <w:cantSplit/>
+        </w:trPr>
         <w:tc>
           <w:tcPr>
-            <w:tcW w:type="dxa" w:w="3213"/>
+            <w:tcW w:type="dxa" w:w="2835"/>
           </w:tcPr>
           <w:p>
             <w:pPr>
-              <w:spacing w:after="60" w:before="60" w:line="324" w:lineRule="auto"/>
+              <w:spacing w:after="60" w:before="60" w:line="300" w:lineRule="auto"/>
             </w:pPr>
             <w:r>
               <w:rPr>
                 <w:rFonts w:ascii="Times New Roman" w:hAnsi="Times New Roman" w:cs="Times New Roman" w:eastAsia="宋体"/>
                 <w:b w:val="0"/>
-                <w:sz w:val="18"/>
+                <w:sz w:val="20"/>
               </w:rPr>
               <w:t>数字答案0与8及一份空答</w:t>
             </w:r>
@@ -1828,17 +1934,17 @@
         </w:tc>
         <w:tc>
           <w:tcPr>
-            <w:tcW w:type="dxa" w:w="3213"/>
+            <w:tcW w:type="dxa" w:w="4535"/>
           </w:tcPr>
           <w:p>
             <w:pPr>
-              <w:spacing w:after="60" w:before="60" w:line="324" w:lineRule="auto"/>
+              <w:spacing w:after="60" w:before="60" w:line="300" w:lineRule="auto"/>
             </w:pPr>
             <w:r>
               <w:rPr>
                 <w:rFonts w:ascii="Times New Roman" w:hAnsi="Times New Roman" w:cs="Times New Roman" w:eastAsia="宋体"/>
                 <w:b w:val="0"/>
-                <w:sz w:val="18"/>
+                <w:sz w:val="20"/>
               </w:rPr>
               <w:t>有效次数2，平均4，分桶次数合计2</w:t>
             </w:r>
@@ -1846,17 +1952,17 @@
         </w:tc>
         <w:tc>
           <w:tcPr>
-            <w:tcW w:type="dxa" w:w="3213"/>
+            <w:tcW w:type="dxa" w:w="2268"/>
           </w:tcPr>
           <w:p>
             <w:pPr>
-              <w:spacing w:after="60" w:before="60" w:line="324" w:lineRule="auto"/>
+              <w:spacing w:after="60" w:before="60" w:line="300" w:lineRule="auto"/>
             </w:pPr>
             <w:r>
               <w:rPr>
                 <w:rFonts w:ascii="Times New Roman" w:hAnsi="Times New Roman" w:cs="Times New Roman" w:eastAsia="宋体"/>
                 <w:b w:val="0"/>
-                <w:sz w:val="18"/>
+                <w:sz w:val="20"/>
               </w:rPr>
               <w:t>通过</w:t>
             </w:r>
@@ -1864,19 +1970,22 @@
         </w:tc>
       </w:tr>
       <w:tr>
+        <w:trPr>
+          <w:cantSplit/>
+        </w:trPr>
         <w:tc>
           <w:tcPr>
-            <w:tcW w:type="dxa" w:w="3213"/>
+            <w:tcW w:type="dxa" w:w="2835"/>
           </w:tcPr>
           <w:p>
             <w:pPr>
-              <w:spacing w:after="60" w:before="60" w:line="324" w:lineRule="auto"/>
+              <w:spacing w:after="60" w:before="60" w:line="300" w:lineRule="auto"/>
             </w:pPr>
             <w:r>
               <w:rPr>
                 <w:rFonts w:ascii="Times New Roman" w:hAnsi="Times New Roman" w:cs="Times New Roman" w:eastAsia="宋体"/>
                 <w:b w:val="0"/>
-                <w:sz w:val="18"/>
+                <w:sz w:val="20"/>
               </w:rPr>
               <w:t>23条文本答卷分页</w:t>
             </w:r>
@@ -1884,17 +1993,17 @@
         </w:tc>
         <w:tc>
           <w:tcPr>
-            <w:tcW w:type="dxa" w:w="3213"/>
+            <w:tcW w:type="dxa" w:w="4535"/>
           </w:tcPr>
           <w:p>
             <w:pPr>
-              <w:spacing w:after="60" w:before="60" w:line="324" w:lineRule="auto"/>
+              <w:spacing w:after="60" w:before="60" w:line="300" w:lineRule="auto"/>
             </w:pPr>
             <w:r>
               <w:rPr>
                 <w:rFonts w:ascii="Times New Roman" w:hAnsi="Times New Roman" w:cs="Times New Roman" w:eastAsia="宋体"/>
                 <w:b w:val="0"/>
-                <w:sz w:val="18"/>
+                <w:sz w:val="20"/>
               </w:rPr>
               <w:t>第一页20条，第二页3条，顺序稳定</w:t>
             </w:r>
@@ -1902,17 +2011,17 @@
         </w:tc>
         <w:tc>
           <w:tcPr>
-            <w:tcW w:type="dxa" w:w="3213"/>
+            <w:tcW w:type="dxa" w:w="2268"/>
           </w:tcPr>
           <w:p>
             <w:pPr>
-              <w:spacing w:after="60" w:before="60" w:line="324" w:lineRule="auto"/>
+              <w:spacing w:after="60" w:before="60" w:line="300" w:lineRule="auto"/>
             </w:pPr>
             <w:r>
               <w:rPr>
                 <w:rFonts w:ascii="Times New Roman" w:hAnsi="Times New Roman" w:cs="Times New Roman" w:eastAsia="宋体"/>
                 <w:b w:val="0"/>
-                <w:sz w:val="18"/>
+                <w:sz w:val="20"/>
               </w:rPr>
               <w:t>通过</w:t>
             </w:r>
@@ -1920,19 +2029,22 @@
         </w:tc>
       </w:tr>
       <w:tr>
+        <w:trPr>
+          <w:cantSplit/>
+        </w:trPr>
         <w:tc>
           <w:tcPr>
-            <w:tcW w:type="dxa" w:w="3213"/>
+            <w:tcW w:type="dxa" w:w="2835"/>
           </w:tcPr>
           <w:p>
             <w:pPr>
-              <w:spacing w:after="60" w:before="60" w:line="324" w:lineRule="auto"/>
+              <w:spacing w:after="60" w:before="60" w:line="300" w:lineRule="auto"/>
             </w:pPr>
             <w:r>
               <w:rPr>
                 <w:rFonts w:ascii="Times New Roman" w:hAnsi="Times New Roman" w:cs="Times New Roman" w:eastAsia="宋体"/>
                 <w:b w:val="0"/>
-                <w:sz w:val="18"/>
+                <w:sz w:val="20"/>
               </w:rPr>
               <w:t>重复局部题号 未知版本与过期revision</w:t>
             </w:r>
@@ -1940,17 +2052,17 @@
         </w:tc>
         <w:tc>
           <w:tcPr>
-            <w:tcW w:type="dxa" w:w="3213"/>
+            <w:tcW w:type="dxa" w:w="4535"/>
           </w:tcPr>
           <w:p>
             <w:pPr>
-              <w:spacing w:after="60" w:before="60" w:line="324" w:lineRule="auto"/>
+              <w:spacing w:after="60" w:before="60" w:line="300" w:lineRule="auto"/>
             </w:pPr>
             <w:r>
               <w:rPr>
                 <w:rFonts w:ascii="Times New Roman" w:hAnsi="Times New Roman" w:cs="Times New Roman" w:eastAsia="宋体"/>
                 <w:b w:val="0"/>
-                <w:sz w:val="18"/>
+                <w:sz w:val="20"/>
               </w:rPr>
               <w:t>拒绝且问卷题目不变</w:t>
             </w:r>
@@ -1958,17 +2070,17 @@
         </w:tc>
         <w:tc>
           <w:tcPr>
-            <w:tcW w:type="dxa" w:w="3213"/>
+            <w:tcW w:type="dxa" w:w="2268"/>
           </w:tcPr>
           <w:p>
             <w:pPr>
-              <w:spacing w:after="60" w:before="60" w:line="324" w:lineRule="auto"/>
+              <w:spacing w:after="60" w:before="60" w:line="300" w:lineRule="auto"/>
             </w:pPr>
             <w:r>
               <w:rPr>
                 <w:rFonts w:ascii="Times New Roman" w:hAnsi="Times New Roman" w:cs="Times New Roman" w:eastAsia="宋体"/>
                 <w:b w:val="0"/>
-                <w:sz w:val="18"/>
+                <w:sz w:val="20"/>
               </w:rPr>
               <w:t>通过</w:t>
             </w:r>
@@ -1976,19 +2088,22 @@
         </w:tc>
       </w:tr>
       <w:tr>
+        <w:trPr>
+          <w:cantSplit/>
+        </w:trPr>
         <w:tc>
           <w:tcPr>
-            <w:tcW w:type="dxa" w:w="3213"/>
+            <w:tcW w:type="dxa" w:w="2835"/>
           </w:tcPr>
           <w:p>
             <w:pPr>
-              <w:spacing w:after="60" w:before="60" w:line="324" w:lineRule="auto"/>
+              <w:spacing w:after="60" w:before="60" w:line="300" w:lineRule="auto"/>
             </w:pPr>
             <w:r>
               <w:rPr>
                 <w:rFonts w:ascii="Times New Roman" w:hAnsi="Times New Roman" w:cs="Times New Roman" w:eastAsia="宋体"/>
                 <w:b w:val="0"/>
-                <w:sz w:val="18"/>
+                <w:sz w:val="20"/>
               </w:rPr>
               <w:t>未知共享账号及撤销共享</w:t>
             </w:r>
@@ -1996,17 +2111,17 @@
         </w:tc>
         <w:tc>
           <w:tcPr>
-            <w:tcW w:type="dxa" w:w="3213"/>
+            <w:tcW w:type="dxa" w:w="4535"/>
           </w:tcPr>
           <w:p>
             <w:pPr>
-              <w:spacing w:after="60" w:before="60" w:line="324" w:lineRule="auto"/>
+              <w:spacing w:after="60" w:before="60" w:line="300" w:lineRule="auto"/>
             </w:pPr>
             <w:r>
               <w:rPr>
                 <w:rFonts w:ascii="Times New Roman" w:hAnsi="Times New Roman" w:cs="Times New Roman" w:eastAsia="宋体"/>
                 <w:b w:val="0"/>
-                <w:sz w:val="18"/>
+                <w:sz w:val="20"/>
               </w:rPr>
               <w:t>非法变更不落库，撤销后不能再读取源题</w:t>
             </w:r>
@@ -2014,17 +2129,17 @@
         </w:tc>
         <w:tc>
           <w:tcPr>
-            <w:tcW w:type="dxa" w:w="3213"/>
+            <w:tcW w:type="dxa" w:w="2268"/>
           </w:tcPr>
           <w:p>
             <w:pPr>
-              <w:spacing w:after="60" w:before="60" w:line="324" w:lineRule="auto"/>
+              <w:spacing w:after="60" w:before="60" w:line="300" w:lineRule="auto"/>
             </w:pPr>
             <w:r>
               <w:rPr>
                 <w:rFonts w:ascii="Times New Roman" w:hAnsi="Times New Roman" w:cs="Times New Roman" w:eastAsia="宋体"/>
                 <w:b w:val="0"/>
-                <w:sz w:val="18"/>
+                <w:sz w:val="20"/>
               </w:rPr>
               <w:t>通过</w:t>
             </w:r>
@@ -2035,12 +2150,13 @@
     <w:p>
       <w:pPr>
         <w:widowControl/>
-        <w:spacing w:line="360" w:lineRule="auto" w:after="60"/>
-        <w:ind w:firstLine="420"/>
+        <w:spacing w:line="348" w:lineRule="auto" w:after="40"/>
+        <w:ind w:firstLine="460"/>
       </w:pPr>
       <w:r>
         <w:rPr>
           <w:rFonts w:ascii="Times New Roman" w:hAnsi="Times New Roman" w:cs="Times New Roman" w:eastAsia="宋体"/>
+          <w:sz w:val="23"/>
         </w:rPr>
         <w:t>浏览器检查分为单账号题库流程和双账号连续验收。前者验证创建、工作稿、历史恢复、数字分布、文本翻页及390px宽度布局；后者使用两个隔离会话，通过页面完成共享、旧版本导入、发布填写、改版、撤销和恢复。接收者旧问卷保持原内容，双方分别得到自己的统计结果，题主看不到外部问卷名称。检查由Playwright执行，结果分别保存于stage2-browser.json和stage2-acceptance.json。</w:t>
       </w:r>
@@ -2048,12 +2164,13 @@
     <w:p>
       <w:pPr>
         <w:widowControl/>
-        <w:spacing w:line="360" w:lineRule="auto" w:after="60"/>
-        <w:ind w:firstLine="420"/>
+        <w:spacing w:line="348" w:lineRule="auto" w:after="40"/>
+        <w:ind w:firstLine="460"/>
       </w:pPr>
       <w:r>
         <w:rPr>
           <w:rFonts w:ascii="Times New Roman" w:hAnsi="Times New Roman" w:cs="Times New Roman" w:eastAsia="宋体"/>
+          <w:sz w:val="23"/>
         </w:rPr>
         <w:t>另从Git导出独立源码，在全新虚拟环境执行requirements.txt安装，连接空的独立MongoDB数据目录启动服务。健康检查和七集合初始化通过，随后在该环境完成52项回归与双账号验收。环境及依赖明细见tests/results/stage2-reproduction.json。兼容性通过原接口、无来源问卷、发布冻结和提交路径的回归测试验证。旧答卷不因本次初始化或题库更新被迁移覆盖。当前验证未覆盖大规模题目引用、高并发压测或全部浏览器；不能由52项通过推断这些范围也已验证。</w:t>
       </w:r>
@@ -2061,12 +2178,13 @@
     <w:p>
       <w:pPr>
         <w:pStyle w:val="Heading1"/>
-        <w:spacing w:before="200" w:after="100"/>
+        <w:spacing w:before="240" w:after="100"/>
       </w:pPr>
       <w:r>
         <w:rPr>
           <w:rFonts w:ascii="Times New Roman" w:hAnsi="Times New Roman" w:cs="Times New Roman" w:eastAsia="黑体"/>
           <w:b w:val="0"/>
+          <w:sz w:val="27"/>
         </w:rPr>
         <w:t>六 AI使用过程与问题修正</w:t>
       </w:r>
@@ -2074,12 +2192,13 @@
     <w:p>
       <w:pPr>
         <w:pStyle w:val="Heading2"/>
-        <w:spacing w:before="180" w:after="100"/>
+        <w:spacing w:before="160" w:after="100"/>
       </w:pPr>
       <w:r>
         <w:rPr>
           <w:rFonts w:ascii="Times New Roman" w:hAnsi="Times New Roman" w:cs="Times New Roman" w:eastAsia="黑体"/>
           <w:b w:val="0"/>
+          <w:sz w:val="24"/>
         </w:rPr>
         <w:t>6.1 需求引导与任务拆分</w:t>
       </w:r>
@@ -2087,12 +2206,13 @@
     <w:p>
       <w:pPr>
         <w:widowControl/>
-        <w:spacing w:line="360" w:lineRule="auto" w:after="60"/>
-        <w:ind w:firstLine="420"/>
+        <w:spacing w:line="348" w:lineRule="auto" w:after="40"/>
+        <w:ind w:firstLine="460"/>
       </w:pPr>
       <w:r>
         <w:rPr>
           <w:rFonts w:ascii="Times New Roman" w:hAnsi="Times New Roman" w:cs="Times New Roman" w:eastAsia="宋体"/>
+          <w:sz w:val="23"/>
         </w:rPr>
         <w:t>本项目使用Codex辅助需求分析、数据库设计、接口实现和测试。我先提供作业文件及课堂补充，要求后端和MongoDB优先、保留第一阶段功能与旧数据，并按阶段交付。第二阶段以八项变更需求为输入，把题目复用、历史关系、旧问卷保护、共享权限和统计分别列为验收条件，避免只给出“做一个题库”的笼统目标。</w:t>
       </w:r>
@@ -2100,12 +2220,13 @@
     <w:p>
       <w:pPr>
         <w:widowControl/>
-        <w:spacing w:line="360" w:lineRule="auto" w:after="60"/>
-        <w:ind w:firstLine="420"/>
+        <w:spacing w:line="348" w:lineRule="auto" w:after="40"/>
+        <w:ind w:firstLine="460"/>
       </w:pPr>
       <w:r>
         <w:rPr>
           <w:rFonts w:ascii="Times New Roman" w:hAnsi="Times New Roman" w:cs="Times New Roman" w:eastAsia="宋体"/>
+          <w:sz w:val="23"/>
         </w:rPr>
         <w:t>在这些约束下，AI提出两个新增集合、工作稿与已提交版本分离、导入时复制定义并记录来源等方案，并承担主要编码工作。我的参与集中在提供课程要求、确定阶段顺序、要求保留已有成果和反馈交付内容；具体字段设计、程序修改及自动测试执行由AI完成。原始指令、修改位置与结果在ai_logs中保留，报告按技术问题归纳协作过程。</w:t>
       </w:r>
@@ -2113,12 +2234,13 @@
     <w:p>
       <w:pPr>
         <w:pStyle w:val="Heading2"/>
-        <w:spacing w:before="180" w:after="100"/>
+        <w:spacing w:before="160" w:after="100"/>
       </w:pPr>
       <w:r>
         <w:rPr>
           <w:rFonts w:ascii="Times New Roman" w:hAnsi="Times New Roman" w:cs="Times New Roman" w:eastAsia="黑体"/>
           <w:b w:val="0"/>
+          <w:sz w:val="24"/>
         </w:rPr>
         <w:t>6.2 方案调整与验证依据</w:t>
       </w:r>
@@ -2126,12 +2248,13 @@
     <w:p>
       <w:pPr>
         <w:widowControl/>
-        <w:spacing w:line="360" w:lineRule="auto" w:after="60"/>
-        <w:ind w:firstLine="420"/>
+        <w:spacing w:line="348" w:lineRule="auto" w:after="40"/>
+        <w:ind w:firstLine="460"/>
       </w:pPr>
       <w:r>
         <w:rPr>
           <w:rFonts w:ascii="Times New Roman" w:hAnsi="Times New Roman" w:cs="Times New Roman" w:eastAsia="宋体"/>
+          <w:sz w:val="23"/>
         </w:rPr>
         <w:t>版本管理需要同时回答两个问题：修改历史能否保留，已经收集的答案是否仍按原含义解释。若问卷显示时直接读取源题，题库改版会影响旧问卷；若完全复制而不记来源，又难以查使用位置和跨卷汇总。AI据此采用“题库保留不可变版本，问卷保存独立副本和来源”的结构，通过同文档条件更新保护历史，通过内容副本保护已发布问卷。</w:t>
       </w:r>
@@ -2139,12 +2262,13 @@
     <w:p>
       <w:pPr>
         <w:widowControl/>
-        <w:spacing w:line="360" w:lineRule="auto" w:after="60"/>
-        <w:ind w:firstLine="420"/>
+        <w:spacing w:line="348" w:lineRule="auto" w:after="40"/>
+        <w:ind w:firstLine="460"/>
       </w:pPr>
       <w:r>
         <w:rPr>
           <w:rFonts w:ascii="Times New Roman" w:hAnsi="Times New Roman" w:cs="Times New Roman" w:eastAsia="宋体"/>
+          <w:sz w:val="23"/>
         </w:rPr>
         <w:t>共享的边界也需要单独检查。能够导入他人的题目，不代表可以查看其答卷。因此接口先限制问卷所有者，再处理来源题的统计；使用位置只向题主返回外部引用数。自动测试让两个账号各提交不同选项，验证彼此的统计不混入对方数据；双浏览器验收进一步检查共享、填写、改版和撤销后的连续行为。</w:t>
       </w:r>
@@ -2152,12 +2276,13 @@
     <w:p>
       <w:pPr>
         <w:widowControl/>
-        <w:spacing w:line="360" w:lineRule="auto" w:after="60"/>
-        <w:ind w:firstLine="420"/>
+        <w:spacing w:line="348" w:lineRule="auto" w:after="40"/>
+        <w:ind w:firstLine="460"/>
       </w:pPr>
       <w:r>
         <w:rPr>
           <w:rFonts w:ascii="Times New Roman" w:hAnsi="Times New Roman" w:cs="Times New Roman" w:eastAsia="宋体"/>
+          <w:sz w:val="23"/>
         </w:rPr>
         <w:t>对未明确的细节，设计文档说明当前约定：不建新版时只保存私有工作稿；恢复通过追加版本保留过程；不同版本和本卷改动的定义分组统计。这些是AI辅助实现时采用的方案，保留在文档中供后续需求变化时调整。</w:t>
       </w:r>
@@ -2165,12 +2290,13 @@
     <w:p>
       <w:pPr>
         <w:pStyle w:val="Heading2"/>
-        <w:spacing w:before="180" w:after="100"/>
+        <w:spacing w:before="160" w:after="100"/>
       </w:pPr>
       <w:r>
         <w:rPr>
           <w:rFonts w:ascii="Times New Roman" w:hAnsi="Times New Roman" w:cs="Times New Roman" w:eastAsia="黑体"/>
           <w:b w:val="0"/>
+          <w:sz w:val="24"/>
         </w:rPr>
         <w:t>6.3 AI输出中发现的问题</w:t>
       </w:r>
@@ -2178,12 +2304,13 @@
     <w:p>
       <w:pPr>
         <w:widowControl/>
-        <w:spacing w:line="360" w:lineRule="auto" w:after="60"/>
-        <w:ind w:firstLine="420"/>
+        <w:spacing w:line="348" w:lineRule="auto" w:after="40"/>
+        <w:ind w:firstLine="460"/>
       </w:pPr>
       <w:r>
         <w:rPr>
           <w:rFonts w:ascii="Times New Roman" w:hAnsi="Times New Roman" w:cs="Times New Roman" w:eastAsia="宋体"/>
+          <w:sz w:val="23"/>
         </w:rPr>
         <w:t>首轮数字题跨卷统计只返回平均值，用0与8验证平均为4后便通过了测试。但正式需求以“年龄分布”为例，仅有均值无法反映分布。重新核对后，AI补充最小值、最大值和MongoDB自动分桶，并增加空组、空答和分桶次数合计测试。这一修正将检查范围从计算正确扩展到返回内容能否回答业务问题。</w:t>
       </w:r>
@@ -2191,12 +2318,13 @@
     <w:p>
       <w:pPr>
         <w:widowControl/>
-        <w:spacing w:line="360" w:lineRule="auto" w:after="60"/>
-        <w:ind w:firstLine="420"/>
+        <w:spacing w:line="348" w:lineRule="auto" w:after="40"/>
+        <w:ind w:firstLine="460"/>
       </w:pPr>
       <w:r>
         <w:rPr>
           <w:rFonts w:ascii="Times New Roman" w:hAnsi="Times New Roman" w:cs="Times New Roman" w:eastAsia="宋体"/>
+          <w:sz w:val="23"/>
         </w:rPr>
         <w:t>文本回答最初通过聚合一次收集全部内容，选项汇总分支也接收了文本回答。只在页面截取前20条，仍不能解决后端返回量的问题。AI将文本分页放入聚合分支，按时间和答卷ID稳定排序，同时限制选项分支只处理选择题。23条答卷验证了20条和3条两页的内容及顺序；该测试验证功能正确性，未用于推算大规模性能。</w:t>
       </w:r>
@@ -2204,12 +2332,13 @@
     <w:p>
       <w:pPr>
         <w:widowControl/>
-        <w:spacing w:line="360" w:lineRule="auto" w:after="60"/>
-        <w:ind w:firstLine="420"/>
+        <w:spacing w:line="348" w:lineRule="auto" w:after="40"/>
+        <w:ind w:firstLine="460"/>
       </w:pPr>
       <w:r>
         <w:rPr>
           <w:rFonts w:ascii="Times New Roman" w:hAnsi="Times New Roman" w:cs="Times New Roman" w:eastAsia="宋体"/>
+          <w:sz w:val="23"/>
         </w:rPr>
         <w:t>页面检查发现，共享接收者的编辑表单隐藏后，没有独立的题目预览。AI补上只读版本预览，使接收者能够看清内容后再导入。测试脚本也出现过将注册视为自动登录的错误，等待账号标识超时；核对应用的“注册后登录”流程后，脚本增加登录步骤再执行通过。代码和测试都需要核对，测试失败应先分清产品行为与脚本假设。</w:t>
       </w:r>
@@ -2217,12 +2346,13 @@
     <w:p>
       <w:pPr>
         <w:pStyle w:val="Heading2"/>
-        <w:spacing w:before="180" w:after="100"/>
+        <w:spacing w:before="160" w:after="100"/>
       </w:pPr>
       <w:r>
         <w:rPr>
           <w:rFonts w:ascii="Times New Roman" w:hAnsi="Times New Roman" w:cs="Times New Roman" w:eastAsia="黑体"/>
           <w:b w:val="0"/>
+          <w:sz w:val="24"/>
         </w:rPr>
         <w:t>6.4 分工与后续改进</w:t>
       </w:r>
@@ -2230,12 +2360,13 @@
     <w:p>
       <w:pPr>
         <w:widowControl/>
-        <w:spacing w:line="360" w:lineRule="auto" w:after="60"/>
-        <w:ind w:firstLine="420"/>
+        <w:spacing w:line="348" w:lineRule="auto" w:after="40"/>
+        <w:ind w:firstLine="460"/>
       </w:pPr>
       <w:r>
         <w:rPr>
           <w:rFonts w:ascii="Times New Roman" w:hAnsi="Times New Roman" w:cs="Times New Roman" w:eastAsia="宋体"/>
+          <w:sz w:val="23"/>
         </w:rPr>
         <w:t>AI帮助较大的是将需求拆成接口、Schema和可执行用例，并在修正后重复验证。需要保留人工约束的地方是业务范围和交付目标，例如后端优先、旧成果兼容、测试与报告对应。一次正常请求或一段完整说明都不足以代替验收，后续修改仍应检查数据库实际结果、权限边界和测试输入。</w:t>
       </w:r>
@@ -2243,12 +2374,13 @@
     <w:p>
       <w:pPr>
         <w:widowControl/>
-        <w:spacing w:line="360" w:lineRule="auto" w:after="60"/>
-        <w:ind w:firstLine="420"/>
+        <w:spacing w:line="348" w:lineRule="auto" w:after="40"/>
+        <w:ind w:firstLine="460"/>
       </w:pPr>
       <w:r>
         <w:rPr>
           <w:rFonts w:ascii="Times New Roman" w:hAnsi="Times New Roman" w:cs="Times New Roman" w:eastAsia="宋体"/>
+          <w:sz w:val="23"/>
         </w:rPr>
         <w:t>版本、权限与旧答卷保护的检查依据及修正记录见ai_logs中的阶段二开发和验收日志。</w:t>
       </w:r>
@@ -2256,12 +2388,13 @@
     <w:p>
       <w:pPr>
         <w:pStyle w:val="Heading1"/>
-        <w:spacing w:before="200" w:after="100"/>
+        <w:spacing w:before="240" w:after="100"/>
       </w:pPr>
       <w:r>
         <w:rPr>
           <w:rFonts w:ascii="Times New Roman" w:hAnsi="Times New Roman" w:cs="Times New Roman" w:eastAsia="黑体"/>
           <w:b w:val="0"/>
+          <w:sz w:val="27"/>
         </w:rPr>
         <w:t>七 总结与当前限制</w:t>
       </w:r>
@@ -2269,12 +2402,13 @@
     <w:p>
       <w:pPr>
         <w:widowControl/>
-        <w:spacing w:line="360" w:lineRule="auto" w:after="60"/>
-        <w:ind w:firstLine="420"/>
+        <w:spacing w:line="348" w:lineRule="auto" w:after="40"/>
+        <w:ind w:firstLine="460"/>
       </w:pPr>
       <w:r>
         <w:rPr>
           <w:rFonts w:ascii="Times New Roman" w:hAnsi="Times New Roman" w:cs="Times New Roman" w:eastAsia="宋体"/>
+          <w:sz w:val="23"/>
         </w:rPr>
         <w:t>本阶段通过题库来源和版本历史支持复用与共享，用条件更新保护历史、内容副本保护旧问卷、定义分组保持统计口径。MongoDB嵌套查询、聚合、分桶、验证器及索引对应具体业务，并有实际测试记录。</w:t>
       </w:r>
@@ -2282,12 +2416,13 @@
     <w:p>
       <w:pPr>
         <w:widowControl/>
-        <w:spacing w:line="360" w:lineRule="auto" w:after="60"/>
-        <w:ind w:firstLine="420"/>
+        <w:spacing w:line="348" w:lineRule="auto" w:after="40"/>
+        <w:ind w:firstLine="460"/>
       </w:pPr>
       <w:r>
         <w:rPr>
           <w:rFonts w:ascii="Times New Roman" w:hAnsi="Times New Roman" w:cs="Times New Roman" w:eastAsia="宋体"/>
+          <w:sz w:val="23"/>
         </w:rPr>
         <w:t>当前每题最多100版，跨卷统计限本人问卷，数字分布自适应分桶，不提供删除引用源题的入口；扩展这些边界需先明确授权和数据量。源码、设计、API、测试及可编辑报告在同一仓库，后续可继续调整。</w:t>
       </w:r>
@@ -2295,13 +2430,14 @@
     <w:p>
       <w:pPr>
         <w:pStyle w:val="Heading1"/>
-        <w:pageBreakBefore/>
-        <w:spacing w:before="200" w:after="100"/>
+        <w:pageBreakBefore w:val="0"/>
+        <w:spacing w:before="240" w:after="100"/>
       </w:pPr>
       <w:r>
         <w:rPr>
           <w:rFonts w:ascii="Times New Roman" w:hAnsi="Times New Roman" w:cs="Times New Roman" w:eastAsia="黑体"/>
           <w:b w:val="0"/>
+          <w:sz w:val="27"/>
         </w:rPr>
         <w:t>附录 页面与结果展示</w:t>
       </w:r>
@@ -2309,12 +2445,13 @@
     <w:p>
       <w:pPr>
         <w:widowControl/>
-        <w:spacing w:line="360" w:lineRule="auto" w:after="60"/>
-        <w:ind w:firstLine="420"/>
+        <w:spacing w:line="348" w:lineRule="auto" w:after="40"/>
+        <w:ind w:firstLine="460"/>
       </w:pPr>
       <w:r>
         <w:rPr>
           <w:rFonts w:ascii="Times New Roman" w:hAnsi="Times New Roman" w:cs="Times New Roman" w:eastAsia="宋体"/>
+          <w:sz w:val="23"/>
         </w:rPr>
         <w:t>以下为2026年10月29日双账号验收时的真实页面局部截图，使用独立测试库和合成账号。截图只截取相关界面区域，未改动页面文字或统计结果；同一题目分别用于创建者与接收者各自的问卷，答卷统计不因题目共享而相互开放。</w:t>
       </w:r>
@@ -2323,11 +2460,12 @@
       <w:pPr>
         <w:keepNext/>
         <w:ind w:firstLine="0"/>
+        <w:jc w:val="center"/>
       </w:pPr>
       <w:r>
         <w:rPr>
           <w:rFonts w:ascii="Times New Roman" w:hAnsi="Times New Roman" w:cs="Times New Roman" w:eastAsia="宋体"/>
-          <w:sz w:val="19"/>
+          <w:sz w:val="20"/>
         </w:rPr>
         <w:t>图3 题库版本管理页面</w:t>
       </w:r>
@@ -2378,12 +2516,13 @@
     <w:p>
       <w:pPr>
         <w:widowControl/>
-        <w:spacing w:line="360" w:lineRule="auto" w:after="60"/>
-        <w:ind w:firstLine="420"/>
+        <w:spacing w:line="348" w:lineRule="auto" w:after="40"/>
+        <w:ind w:firstLine="460"/>
       </w:pPr>
       <w:r>
         <w:rPr>
           <w:rFonts w:ascii="Times New Roman" w:hAnsi="Times New Roman" w:cs="Times New Roman" w:eastAsia="宋体"/>
+          <w:sz w:val="23"/>
         </w:rPr>
         <w:t>页面显示当前第2版、父版本及题目预览，可选择历史版本、恢复并查看使用位置。导入按钮需从本人草稿问卷进入后使用，避免未选择目标问卷时误导入。</w:t>
       </w:r>
@@ -2392,11 +2531,12 @@
       <w:pPr>
         <w:keepNext/>
         <w:ind w:firstLine="0"/>
+        <w:jc w:val="center"/>
       </w:pPr>
       <w:r>
         <w:rPr>
           <w:rFonts w:ascii="Times New Roman" w:hAnsi="Times New Roman" w:cs="Times New Roman" w:eastAsia="宋体"/>
-          <w:sz w:val="19"/>
+          <w:sz w:val="20"/>
         </w:rPr>
         <w:t>图4 本人问卷中的跨卷统计页面</w:t>
       </w:r>
@@ -2447,12 +2587,13 @@
     <w:p>
       <w:pPr>
         <w:widowControl/>
-        <w:spacing w:line="360" w:lineRule="auto" w:after="60"/>
-        <w:ind w:firstLine="420"/>
+        <w:spacing w:line="348" w:lineRule="auto" w:after="40"/>
+        <w:ind w:firstLine="460"/>
       </w:pPr>
       <w:r>
         <w:rPr>
           <w:rFonts w:ascii="Times New Roman" w:hAnsi="Times New Roman" w:cs="Times New Roman" w:eastAsia="宋体"/>
+          <w:sz w:val="23"/>
         </w:rPr>
         <w:t>该组来自作者问卷的一次有效回答8，均值、最小值和最大值均为8，区间[8,8]计1次。接收者另一问卷的回答2单独统计，未混入此结果；版本ID与图3相同。不同版本或本卷内容变化后的题目另分组，图中数据为验收样本，不作为实际调查结论。</w:t>
       </w:r>

</xml_diff>

<commit_message>
Clarify AI guidance design reasoning and verification in stage-two report
</commit_message>
<xml_diff>
--- a/第二阶段/提交材料/2026_ECNU_PJ1_2_温正泽-可编辑.docx
+++ b/第二阶段/提交材料/2026_ECNU_PJ1_2_温正泽-可编辑.docx
@@ -2214,7 +2214,7 @@
           <w:rFonts w:ascii="Times New Roman" w:hAnsi="Times New Roman" w:cs="Times New Roman" w:eastAsia="宋体"/>
           <w:sz w:val="23"/>
         </w:rPr>
-        <w:t>本项目使用Codex辅助需求分析、数据库设计、接口实现和测试。我先提供作业文件及课堂补充，要求后端和MongoDB优先、保留第一阶段功能与旧数据，并按阶段交付。第二阶段以八项变更需求为输入，把题目复用、历史关系、旧问卷保护、共享权限和统计分别列为验收条件，避免只给出“做一个题库”的笼统目标。</w:t>
+        <w:t>本项目使用Codex辅助需求分析、数据库设计、接口实现和测试。我先提供作业文件及课堂补充，要求后端和MongoDB优先、保留第一阶段功能与旧数据，并按阶段交付。第二阶段以八项变更需求为输入，分别核对题目复用、版本关系、旧问卷保护、共享权限和统计，要求每项能够找到实现和验证依据。</w:t>
       </w:r>
     </w:p>
     <w:p>
@@ -2228,7 +2228,21 @@
           <w:rFonts w:ascii="Times New Roman" w:hAnsi="Times New Roman" w:cs="Times New Roman" w:eastAsia="宋体"/>
           <w:sz w:val="23"/>
         </w:rPr>
-        <w:t>在这些约束下，AI提出两个新增集合、工作稿与已提交版本分离、导入时复制定义并记录来源等方案，并承担主要编码工作。我的参与集中在提供课程要求、确定阶段顺序、要求保留已有成果和反馈交付内容；具体字段设计、程序修改及自动测试执行由AI完成。原始指令、修改位置与结果在ai_logs中保留，报告按技术问题归纳协作过程。</w:t>
+        <w:t>引导时，我提出“先按照现有的做吧，没有的话以文件为准”，限定需求依据；要求先完成第一阶段再接续第二阶段，避免覆盖已交成果；又强调“同时仓库和报告的东西需要对的上”，要求交付说明与实际代码一致。对应产物为需求验收表、第一阶段基线标签，以及Schema、API、测试结果和报告文件的核对。关键指令片段与对应文件见ai_logs/阶段二引导与产物.md。</w:t>
+      </w:r>
+    </w:p>
+    <w:p>
+      <w:pPr>
+        <w:widowControl/>
+        <w:spacing w:line="348" w:lineRule="auto" w:after="40"/>
+        <w:ind w:firstLine="460"/>
+      </w:pPr>
+      <w:r>
+        <w:rPr>
+          <w:rFonts w:ascii="Times New Roman" w:hAnsi="Times New Roman" w:cs="Times New Roman" w:eastAsia="宋体"/>
+          <w:sz w:val="23"/>
+        </w:rPr>
+        <w:t>这些指令没有预先确定所有字段。两个新增集合、工作稿与正式版本分离、导入时复制并记录来源等方案由AI提出，具体字段设计、编码和自动测试也主要由AI完成。我的参与集中在提供要求、安排阶段、保留成果及反馈结果；报告分别说明引导、方案和验证，不将AI执行的工作写成个人手写或亲测。</w:t>
       </w:r>
     </w:p>
     <w:p>
@@ -2284,7 +2298,7 @@
           <w:rFonts w:ascii="Times New Roman" w:hAnsi="Times New Roman" w:cs="Times New Roman" w:eastAsia="宋体"/>
           <w:sz w:val="23"/>
         </w:rPr>
-        <w:t>对未明确的细节，设计文档说明当前约定：不建新版时只保存私有工作稿；恢复通过追加版本保留过程；不同版本和本卷改动的定义分组统计。这些是AI辅助实现时采用的方案，保留在文档中供后续需求变化时调整。</w:t>
+        <w:t>方案落实为数据库约束、业务服务和页面交互三个层次：database.py维护Schema与索引，library.py处理权限、版本及聚合，原validation.py和logic.py继续校验题目与路径。没有把规则只放在按钮是否可点上。私有工作稿、追加恢复和定义分组属于文档未明确细节的实现约定，已在设计中说明，后续可随需求调整。</w:t>
       </w:r>
     </w:p>
     <w:p>
@@ -2368,7 +2382,21 @@
           <w:rFonts w:ascii="Times New Roman" w:hAnsi="Times New Roman" w:cs="Times New Roman" w:eastAsia="宋体"/>
           <w:sz w:val="23"/>
         </w:rPr>
-        <w:t>AI帮助较大的是将需求拆成接口、Schema和可执行用例，并在修正后重复验证。需要保留人工约束的地方是业务范围和交付目标，例如后端优先、旧成果兼容、测试与报告对应。一次正常请求或一段完整说明都不足以代替验收，后续修改仍应检查数据库实际结果、权限边界和测试输入。</w:t>
+        <w:t>AI帮助较大的是把需求转成接口、Schema和可执行用例，但实现和测试可能共享同一遗漏。数字统计案例中，平均值断言通过，并不代表已经满足分布需求。因此验证既要回到题目逐项核对，也要用Python assert检查响应与数据库结果，再通过页面流程确认交互。业务输入错误仍用显式校验处理，不依赖可被关闭的assert。</w:t>
+      </w:r>
+    </w:p>
+    <w:p>
+      <w:pPr>
+        <w:widowControl/>
+        <w:spacing w:line="348" w:lineRule="auto" w:after="40"/>
+        <w:ind w:firstLine="460"/>
+      </w:pPr>
+      <w:r>
+        <w:rPr>
+          <w:rFonts w:ascii="Times New Roman" w:hAnsi="Times New Roman" w:cs="Times New Roman" w:eastAsia="宋体"/>
+          <w:sz w:val="23"/>
+        </w:rPr>
+        <w:t>这次协作使我更清楚：人工需要把业务范围、验收口径和阶段约束说清楚，AI负责方案与实现后，仍须检查旧数据、权限和异常输入。不能把AI自行提出的版本上限说成课程要求，也不能把单文档条件更新描述为跨集合事务。共享撤销与导入同时发生的竞争、索引执行计划仍待专项验证，当前52项通过不涵盖这些范围。</w:t>
       </w:r>
     </w:p>
     <w:p>
@@ -2472,6 +2500,7 @@
     </w:p>
     <w:p>
       <w:pPr>
+        <w:keepNext/>
         <w:keepLines/>
         <w:ind w:firstLine="0"/>
       </w:pPr>
@@ -2543,6 +2572,7 @@
     </w:p>
     <w:p>
       <w:pPr>
+        <w:keepNext/>
         <w:keepLines/>
         <w:ind w:firstLine="0"/>
       </w:pPr>

</xml_diff>

<commit_message>
Present AI collaboration as staged technical work and reflection
</commit_message>
<xml_diff>
--- a/第二阶段/提交材料/2026_ECNU_PJ1_2_温正泽-可编辑.docx
+++ b/第二阶段/提交材料/2026_ECNU_PJ1_2_温正泽-可编辑.docx
@@ -2200,7 +2200,7 @@
           <w:b w:val="0"/>
           <w:sz w:val="24"/>
         </w:rPr>
-        <w:t>6.1 需求引导与任务拆分</w:t>
+        <w:t>6.1 分阶段引导与任务推进</w:t>
       </w:r>
     </w:p>
     <w:p>
@@ -2214,7 +2214,7 @@
           <w:rFonts w:ascii="Times New Roman" w:hAnsi="Times New Roman" w:cs="Times New Roman" w:eastAsia="宋体"/>
           <w:sz w:val="23"/>
         </w:rPr>
-        <w:t>本项目使用Codex辅助需求分析、数据库设计、接口实现和测试。我先提供作业文件及课堂补充，要求后端和MongoDB优先、保留第一阶段功能与旧数据，并按阶段交付。第二阶段以八项变更需求为输入，分别核对题目复用、版本关系、旧问卷保护、共享权限和统计，要求每项能够找到实现和验证依据。</w:t>
+        <w:t>本项目使用Codex辅助需求分析、数据库设计、接口实现和测试。开始时，我提供作业文档和课堂补充，明确后端逻辑、MongoDB操作和测试优先，并要求在第一阶段成果上继续开发。AI据此整理第二阶段的八项需求，把题目复用、历史关系、旧问卷保护、共享和统计转成可以核对的任务，先明确保存什么数据、允许哪些操作，再进入实现。</w:t>
       </w:r>
     </w:p>
     <w:p>
@@ -2228,7 +2228,7 @@
           <w:rFonts w:ascii="Times New Roman" w:hAnsi="Times New Roman" w:cs="Times New Roman" w:eastAsia="宋体"/>
           <w:sz w:val="23"/>
         </w:rPr>
-        <w:t>引导时，我提出“先按照现有的做吧，没有的话以文件为准”，限定需求依据；要求先完成第一阶段再接续第二阶段，避免覆盖已交成果；又强调“同时仓库和报告的东西需要对的上”，要求交付说明与实际代码一致。对应产物为需求验收表、第一阶段基线标签，以及Schema、API、测试结果和报告文件的核对。关键指令片段与对应文件见ai_logs/阶段二引导与产物.md。</w:t>
+        <w:t>随后，协作围绕数据结构和业务边界展开。我的要求是保留已有功能与数据，避免第二阶段改动破坏原流程；AI比较题目复制、来源引用和版本保存方式，提出题库保留历史、问卷保存副本及来源的方案。题目和版本如何编号、恢复如何追加、共享能访问哪些内容，也在设计与接口中分别说明，而没有仅凭页面原型决定后端行为。</w:t>
       </w:r>
     </w:p>
     <w:p>
@@ -2242,7 +2242,7 @@
           <w:rFonts w:ascii="Times New Roman" w:hAnsi="Times New Roman" w:cs="Times New Roman" w:eastAsia="宋体"/>
           <w:sz w:val="23"/>
         </w:rPr>
-        <w:t>这些指令没有预先确定所有字段。两个新增集合、工作稿与正式版本分离、导入时复制并记录来源等方案由AI提出，具体字段设计、编码和自动测试也主要由AI完成。我的参与集中在提供要求、安排阶段、保留成果及反馈结果；报告分别说明引导、方案和验证，不将AI执行的工作写成个人手写或亲测。</w:t>
+        <w:t>实现按题库与版本、共享导入、使用追踪和跨卷统计推进，之后结合原有功能做回归与浏览器验收。我持续要求检查完成范围、展示实际页面，并核对报告与仓库是否一致；AI承担具体字段设计、编码、测试脚本及执行工作。发现遗漏后再回到相应模块修改，并保存用例与结果。相关指令和产物留在ai_logs中，正文侧重说明推进方式和技术判断。</w:t>
       </w:r>
     </w:p>
     <w:p>
@@ -2368,7 +2368,7 @@
           <w:b w:val="0"/>
           <w:sz w:val="24"/>
         </w:rPr>
-        <w:t>6.4 分工与后续改进</w:t>
+        <w:t>6.4 设计判断与使用反思</w:t>
       </w:r>
     </w:p>
     <w:p>
@@ -2396,7 +2396,21 @@
           <w:rFonts w:ascii="Times New Roman" w:hAnsi="Times New Roman" w:cs="Times New Roman" w:eastAsia="宋体"/>
           <w:sz w:val="23"/>
         </w:rPr>
-        <w:t>这次协作使我更清楚：人工需要把业务范围、验收口径和阶段约束说清楚，AI负责方案与实现后，仍须检查旧数据、权限和异常输入。不能把AI自行提出的版本上限说成课程要求，也不能把单文档条件更新描述为跨集合事务。共享撤销与导入同时发生的竞争、索引执行计划仍待专项验证，当前52项通过不涵盖这些范围。</w:t>
+        <w:t>这次协作中，我主要提供需求、安排阶段并反馈成果，AI承担大部分技术方案和实现。需要持续判断的是方案是否符合使用场景：题库改版后，旧问卷还能否解释原答案；共享题目后，双方数据是否仍然隔离；恢复旧内容后，历史记录是否仍可追踪。这些问题比页面是否出现一个按钮更能检验设计。它们也帮助我区分题目内容版本与并发修订号，理解复制、引用和条件更新分别解决什么问题。</w:t>
+      </w:r>
+    </w:p>
+    <w:p>
+      <w:pPr>
+        <w:widowControl/>
+        <w:spacing w:line="348" w:lineRule="auto" w:after="40"/>
+        <w:ind w:firstLine="460"/>
+      </w:pPr>
+      <w:r>
+        <w:rPr>
+          <w:rFonts w:ascii="Times New Roman" w:hAnsi="Times New Roman" w:cs="Times New Roman" w:eastAsia="宋体"/>
+          <w:sz w:val="23"/>
+        </w:rPr>
+        <w:t>后续仍需单独验证共享撤销与导入同时发生的竞争，并记录索引执行计划。当前52项通过只说明已覆盖用例符合预期，不能据此推断跨文档操作具备事务隔离或大规模查询性能。这也是继续使用AI时需要保留的检查方式：让方案、代码和证据相互对应，对没有验证的结论保持边界。</w:t>
       </w:r>
     </w:p>
     <w:p>

</xml_diff>

<commit_message>
Polish diagram hierarchy connectors and report figure layout
</commit_message>
<xml_diff>
--- a/第二阶段/提交材料/2026_ECNU_PJ1_2_温正泽-可编辑.docx
+++ b/第二阶段/提交材料/2026_ECNU_PJ1_2_温正泽-可编辑.docx
@@ -836,7 +836,9 @@
     <w:p>
       <w:pPr>
         <w:keepLines/>
+        <w:spacing w:line="240" w:lineRule="auto" w:before="80" w:after="100"/>
         <w:ind w:firstLine="0"/>
+        <w:jc w:val="center"/>
       </w:pPr>
       <w:r>
         <w:rPr>
@@ -1005,7 +1007,9 @@
     <w:p>
       <w:pPr>
         <w:keepLines/>
+        <w:spacing w:line="240" w:lineRule="auto" w:before="80" w:after="100"/>
         <w:ind w:firstLine="0"/>
+        <w:jc w:val="center"/>
       </w:pPr>
       <w:r>
         <w:rPr>
@@ -2472,7 +2476,7 @@
     <w:p>
       <w:pPr>
         <w:pStyle w:val="Heading1"/>
-        <w:pageBreakBefore w:val="0"/>
+        <w:pageBreakBefore/>
         <w:spacing w:before="240" w:after="100"/>
       </w:pPr>
       <w:r>
@@ -2516,7 +2520,9 @@
       <w:pPr>
         <w:keepNext/>
         <w:keepLines/>
+        <w:spacing w:line="240" w:lineRule="auto" w:before="80" w:after="100"/>
         <w:ind w:firstLine="0"/>
+        <w:jc w:val="center"/>
       </w:pPr>
       <w:r>
         <w:rPr>
@@ -2588,7 +2594,9 @@
       <w:pPr>
         <w:keepNext/>
         <w:keepLines/>
+        <w:spacing w:line="240" w:lineRule="auto" w:before="80" w:after="100"/>
         <w:ind w:firstLine="0"/>
+        <w:jc w:val="center"/>
       </w:pPr>
       <w:r>
         <w:rPr>

</xml_diff>

<commit_message>
Use flush paragraphs and balanced spacing in stage-two report
</commit_message>
<xml_diff>
--- a/第二阶段/提交材料/2026_ECNU_PJ1_2_温正泽-可编辑.docx
+++ b/第二阶段/提交材料/2026_ECNU_PJ1_2_温正泽-可编辑.docx
@@ -45,6 +45,7 @@
       <w:pPr>
         <w:pStyle w:val="Heading1"/>
         <w:spacing w:before="240" w:after="100"/>
+        <w:ind w:firstLine="0"/>
       </w:pPr>
       <w:r>
         <w:rPr>
@@ -58,8 +59,9 @@
     <w:p>
       <w:pPr>
         <w:widowControl/>
-        <w:spacing w:line="348" w:lineRule="auto" w:after="40"/>
-        <w:ind w:firstLine="460"/>
+        <w:spacing w:line="348" w:lineRule="auto" w:after="100"/>
+        <w:ind w:firstLine="0"/>
+        <w:jc w:val="both"/>
       </w:pPr>
       <w:r>
         <w:rPr>
@@ -72,8 +74,9 @@
     <w:p>
       <w:pPr>
         <w:widowControl/>
-        <w:spacing w:line="348" w:lineRule="auto" w:after="40"/>
-        <w:ind w:firstLine="460"/>
+        <w:spacing w:line="348" w:lineRule="auto" w:after="100"/>
+        <w:ind w:firstLine="0"/>
+        <w:jc w:val="both"/>
       </w:pPr>
       <w:r>
         <w:rPr>
@@ -416,6 +419,7 @@
       <w:pPr>
         <w:pStyle w:val="Heading1"/>
         <w:spacing w:before="240" w:after="100"/>
+        <w:ind w:firstLine="0"/>
       </w:pPr>
       <w:r>
         <w:rPr>
@@ -430,6 +434,7 @@
       <w:pPr>
         <w:pStyle w:val="Heading2"/>
         <w:spacing w:before="160" w:after="100"/>
+        <w:ind w:firstLine="0"/>
       </w:pPr>
       <w:r>
         <w:rPr>
@@ -443,8 +448,9 @@
     <w:p>
       <w:pPr>
         <w:widowControl/>
-        <w:spacing w:line="348" w:lineRule="auto" w:after="40"/>
-        <w:ind w:firstLine="460"/>
+        <w:spacing w:line="348" w:lineRule="auto" w:after="100"/>
+        <w:ind w:firstLine="0"/>
+        <w:jc w:val="both"/>
       </w:pPr>
       <w:r>
         <w:rPr>
@@ -457,8 +463,9 @@
     <w:p>
       <w:pPr>
         <w:widowControl/>
-        <w:spacing w:line="348" w:lineRule="auto" w:after="40"/>
-        <w:ind w:firstLine="460"/>
+        <w:spacing w:line="348" w:lineRule="auto" w:after="100"/>
+        <w:ind w:firstLine="0"/>
+        <w:jc w:val="both"/>
       </w:pPr>
       <w:r>
         <w:rPr>
@@ -882,6 +889,7 @@
       <w:pPr>
         <w:pStyle w:val="Heading2"/>
         <w:spacing w:before="160" w:after="100"/>
+        <w:ind w:firstLine="0"/>
       </w:pPr>
       <w:r>
         <w:rPr>
@@ -895,8 +903,9 @@
     <w:p>
       <w:pPr>
         <w:widowControl/>
-        <w:spacing w:line="348" w:lineRule="auto" w:after="40"/>
-        <w:ind w:firstLine="460"/>
+        <w:spacing w:line="348" w:lineRule="auto" w:after="100"/>
+        <w:ind w:firstLine="0"/>
+        <w:jc w:val="both"/>
       </w:pPr>
       <w:r>
         <w:rPr>
@@ -909,8 +918,9 @@
     <w:p>
       <w:pPr>
         <w:widowControl/>
-        <w:spacing w:line="348" w:lineRule="auto" w:after="40"/>
-        <w:ind w:firstLine="460"/>
+        <w:spacing w:line="348" w:lineRule="auto" w:after="100"/>
+        <w:ind w:firstLine="0"/>
+        <w:jc w:val="both"/>
       </w:pPr>
       <w:r>
         <w:rPr>
@@ -923,8 +933,9 @@
     <w:p>
       <w:pPr>
         <w:widowControl/>
-        <w:spacing w:line="348" w:lineRule="auto" w:after="40"/>
-        <w:ind w:firstLine="460"/>
+        <w:spacing w:line="348" w:lineRule="auto" w:after="100"/>
+        <w:ind w:firstLine="0"/>
+        <w:jc w:val="both"/>
       </w:pPr>
       <w:r>
         <w:rPr>
@@ -938,6 +949,7 @@
       <w:pPr>
         <w:pStyle w:val="Heading1"/>
         <w:spacing w:before="240" w:after="100"/>
+        <w:ind w:firstLine="0"/>
       </w:pPr>
       <w:r>
         <w:rPr>
@@ -952,6 +964,7 @@
       <w:pPr>
         <w:pStyle w:val="Heading2"/>
         <w:spacing w:before="160" w:after="100"/>
+        <w:ind w:firstLine="0"/>
       </w:pPr>
       <w:r>
         <w:rPr>
@@ -965,8 +978,9 @@
     <w:p>
       <w:pPr>
         <w:widowControl/>
-        <w:spacing w:line="348" w:lineRule="auto" w:after="40"/>
-        <w:ind w:firstLine="460"/>
+        <w:spacing w:line="348" w:lineRule="auto" w:after="100"/>
+        <w:ind w:firstLine="0"/>
+        <w:jc w:val="both"/>
       </w:pPr>
       <w:r>
         <w:rPr>
@@ -979,8 +993,9 @@
     <w:p>
       <w:pPr>
         <w:widowControl/>
-        <w:spacing w:line="348" w:lineRule="auto" w:after="40"/>
-        <w:ind w:firstLine="460"/>
+        <w:spacing w:line="348" w:lineRule="auto" w:after="100"/>
+        <w:ind w:firstLine="0"/>
+        <w:jc w:val="both"/>
       </w:pPr>
       <w:r>
         <w:rPr>
@@ -1053,6 +1068,7 @@
       <w:pPr>
         <w:pStyle w:val="Heading2"/>
         <w:spacing w:before="160" w:after="100"/>
+        <w:ind w:firstLine="0"/>
       </w:pPr>
       <w:r>
         <w:rPr>
@@ -1066,8 +1082,9 @@
     <w:p>
       <w:pPr>
         <w:widowControl/>
-        <w:spacing w:line="348" w:lineRule="auto" w:after="40"/>
-        <w:ind w:firstLine="460"/>
+        <w:spacing w:line="348" w:lineRule="auto" w:after="100"/>
+        <w:ind w:firstLine="0"/>
+        <w:jc w:val="both"/>
       </w:pPr>
       <w:r>
         <w:rPr>
@@ -1080,8 +1097,9 @@
     <w:p>
       <w:pPr>
         <w:widowControl/>
-        <w:spacing w:line="348" w:lineRule="auto" w:after="40"/>
-        <w:ind w:firstLine="460"/>
+        <w:spacing w:line="348" w:lineRule="auto" w:after="100"/>
+        <w:ind w:firstLine="0"/>
+        <w:jc w:val="both"/>
       </w:pPr>
       <w:r>
         <w:rPr>
@@ -1094,8 +1112,9 @@
     <w:p>
       <w:pPr>
         <w:widowControl/>
-        <w:spacing w:line="348" w:lineRule="auto" w:after="40"/>
-        <w:ind w:firstLine="460"/>
+        <w:spacing w:line="348" w:lineRule="auto" w:after="100"/>
+        <w:ind w:firstLine="0"/>
+        <w:jc w:val="both"/>
       </w:pPr>
       <w:r>
         <w:rPr>
@@ -1109,6 +1128,7 @@
       <w:pPr>
         <w:pStyle w:val="Heading2"/>
         <w:spacing w:before="160" w:after="100"/>
+        <w:ind w:firstLine="0"/>
       </w:pPr>
       <w:r>
         <w:rPr>
@@ -1122,8 +1142,9 @@
     <w:p>
       <w:pPr>
         <w:widowControl/>
-        <w:spacing w:line="348" w:lineRule="auto" w:after="40"/>
-        <w:ind w:firstLine="460"/>
+        <w:spacing w:line="348" w:lineRule="auto" w:after="100"/>
+        <w:ind w:firstLine="0"/>
+        <w:jc w:val="both"/>
       </w:pPr>
       <w:r>
         <w:rPr>
@@ -1136,8 +1157,9 @@
     <w:p>
       <w:pPr>
         <w:widowControl/>
-        <w:spacing w:line="348" w:lineRule="auto" w:after="40"/>
-        <w:ind w:firstLine="460"/>
+        <w:spacing w:line="348" w:lineRule="auto" w:after="100"/>
+        <w:ind w:firstLine="0"/>
+        <w:jc w:val="both"/>
       </w:pPr>
       <w:r>
         <w:rPr>
@@ -1151,6 +1173,7 @@
       <w:pPr>
         <w:pStyle w:val="Heading1"/>
         <w:spacing w:before="240" w:after="100"/>
+        <w:ind w:firstLine="0"/>
       </w:pPr>
       <w:r>
         <w:rPr>
@@ -1164,8 +1187,9 @@
     <w:p>
       <w:pPr>
         <w:widowControl/>
-        <w:spacing w:line="348" w:lineRule="auto" w:after="40"/>
-        <w:ind w:firstLine="460"/>
+        <w:spacing w:line="348" w:lineRule="auto" w:after="100"/>
+        <w:ind w:firstLine="0"/>
+        <w:jc w:val="both"/>
       </w:pPr>
       <w:r>
         <w:rPr>
@@ -1178,8 +1202,9 @@
     <w:p>
       <w:pPr>
         <w:widowControl/>
-        <w:spacing w:line="348" w:lineRule="auto" w:after="40"/>
-        <w:ind w:firstLine="460"/>
+        <w:spacing w:line="348" w:lineRule="auto" w:after="100"/>
+        <w:ind w:firstLine="0"/>
+        <w:jc w:val="both"/>
       </w:pPr>
       <w:r>
         <w:rPr>
@@ -1192,8 +1217,9 @@
     <w:p>
       <w:pPr>
         <w:widowControl/>
-        <w:spacing w:line="348" w:lineRule="auto" w:after="40"/>
-        <w:ind w:firstLine="460"/>
+        <w:spacing w:line="348" w:lineRule="auto" w:after="100"/>
+        <w:ind w:firstLine="0"/>
+        <w:jc w:val="both"/>
       </w:pPr>
       <w:r>
         <w:rPr>
@@ -1549,6 +1575,7 @@
       <w:pPr>
         <w:pStyle w:val="Heading1"/>
         <w:spacing w:before="240" w:after="100"/>
+        <w:ind w:firstLine="0"/>
       </w:pPr>
       <w:r>
         <w:rPr>
@@ -1562,8 +1589,9 @@
     <w:p>
       <w:pPr>
         <w:widowControl/>
-        <w:spacing w:line="348" w:lineRule="auto" w:after="40"/>
-        <w:ind w:firstLine="460"/>
+        <w:spacing w:line="348" w:lineRule="auto" w:after="100"/>
+        <w:ind w:firstLine="0"/>
+        <w:jc w:val="both"/>
       </w:pPr>
       <w:r>
         <w:rPr>
@@ -2154,8 +2182,9 @@
     <w:p>
       <w:pPr>
         <w:widowControl/>
-        <w:spacing w:line="348" w:lineRule="auto" w:after="40"/>
-        <w:ind w:firstLine="460"/>
+        <w:spacing w:line="348" w:lineRule="auto" w:after="100"/>
+        <w:ind w:firstLine="0"/>
+        <w:jc w:val="both"/>
       </w:pPr>
       <w:r>
         <w:rPr>
@@ -2168,8 +2197,9 @@
     <w:p>
       <w:pPr>
         <w:widowControl/>
-        <w:spacing w:line="348" w:lineRule="auto" w:after="40"/>
-        <w:ind w:firstLine="460"/>
+        <w:spacing w:line="348" w:lineRule="auto" w:after="100"/>
+        <w:ind w:firstLine="0"/>
+        <w:jc w:val="both"/>
       </w:pPr>
       <w:r>
         <w:rPr>
@@ -2183,6 +2213,7 @@
       <w:pPr>
         <w:pStyle w:val="Heading1"/>
         <w:spacing w:before="240" w:after="100"/>
+        <w:ind w:firstLine="0"/>
       </w:pPr>
       <w:r>
         <w:rPr>
@@ -2197,6 +2228,7 @@
       <w:pPr>
         <w:pStyle w:val="Heading2"/>
         <w:spacing w:before="160" w:after="100"/>
+        <w:ind w:firstLine="0"/>
       </w:pPr>
       <w:r>
         <w:rPr>
@@ -2210,8 +2242,9 @@
     <w:p>
       <w:pPr>
         <w:widowControl/>
-        <w:spacing w:line="348" w:lineRule="auto" w:after="40"/>
-        <w:ind w:firstLine="460"/>
+        <w:spacing w:line="348" w:lineRule="auto" w:after="100"/>
+        <w:ind w:firstLine="0"/>
+        <w:jc w:val="both"/>
       </w:pPr>
       <w:r>
         <w:rPr>
@@ -2224,8 +2257,9 @@
     <w:p>
       <w:pPr>
         <w:widowControl/>
-        <w:spacing w:line="348" w:lineRule="auto" w:after="40"/>
-        <w:ind w:firstLine="460"/>
+        <w:spacing w:line="348" w:lineRule="auto" w:after="100"/>
+        <w:ind w:firstLine="0"/>
+        <w:jc w:val="both"/>
       </w:pPr>
       <w:r>
         <w:rPr>
@@ -2238,8 +2272,9 @@
     <w:p>
       <w:pPr>
         <w:widowControl/>
-        <w:spacing w:line="348" w:lineRule="auto" w:after="40"/>
-        <w:ind w:firstLine="460"/>
+        <w:spacing w:line="348" w:lineRule="auto" w:after="100"/>
+        <w:ind w:firstLine="0"/>
+        <w:jc w:val="both"/>
       </w:pPr>
       <w:r>
         <w:rPr>
@@ -2253,6 +2288,7 @@
       <w:pPr>
         <w:pStyle w:val="Heading2"/>
         <w:spacing w:before="160" w:after="100"/>
+        <w:ind w:firstLine="0"/>
       </w:pPr>
       <w:r>
         <w:rPr>
@@ -2266,8 +2302,9 @@
     <w:p>
       <w:pPr>
         <w:widowControl/>
-        <w:spacing w:line="348" w:lineRule="auto" w:after="40"/>
-        <w:ind w:firstLine="460"/>
+        <w:spacing w:line="348" w:lineRule="auto" w:after="100"/>
+        <w:ind w:firstLine="0"/>
+        <w:jc w:val="both"/>
       </w:pPr>
       <w:r>
         <w:rPr>
@@ -2280,8 +2317,9 @@
     <w:p>
       <w:pPr>
         <w:widowControl/>
-        <w:spacing w:line="348" w:lineRule="auto" w:after="40"/>
-        <w:ind w:firstLine="460"/>
+        <w:spacing w:line="348" w:lineRule="auto" w:after="100"/>
+        <w:ind w:firstLine="0"/>
+        <w:jc w:val="both"/>
       </w:pPr>
       <w:r>
         <w:rPr>
@@ -2294,8 +2332,9 @@
     <w:p>
       <w:pPr>
         <w:widowControl/>
-        <w:spacing w:line="348" w:lineRule="auto" w:after="40"/>
-        <w:ind w:firstLine="460"/>
+        <w:spacing w:line="348" w:lineRule="auto" w:after="100"/>
+        <w:ind w:firstLine="0"/>
+        <w:jc w:val="both"/>
       </w:pPr>
       <w:r>
         <w:rPr>
@@ -2309,6 +2348,7 @@
       <w:pPr>
         <w:pStyle w:val="Heading2"/>
         <w:spacing w:before="160" w:after="100"/>
+        <w:ind w:firstLine="0"/>
       </w:pPr>
       <w:r>
         <w:rPr>
@@ -2322,8 +2362,9 @@
     <w:p>
       <w:pPr>
         <w:widowControl/>
-        <w:spacing w:line="348" w:lineRule="auto" w:after="40"/>
-        <w:ind w:firstLine="460"/>
+        <w:spacing w:line="348" w:lineRule="auto" w:after="100"/>
+        <w:ind w:firstLine="0"/>
+        <w:jc w:val="both"/>
       </w:pPr>
       <w:r>
         <w:rPr>
@@ -2336,8 +2377,9 @@
     <w:p>
       <w:pPr>
         <w:widowControl/>
-        <w:spacing w:line="348" w:lineRule="auto" w:after="40"/>
-        <w:ind w:firstLine="460"/>
+        <w:spacing w:line="348" w:lineRule="auto" w:after="100"/>
+        <w:ind w:firstLine="0"/>
+        <w:jc w:val="both"/>
       </w:pPr>
       <w:r>
         <w:rPr>
@@ -2350,8 +2392,9 @@
     <w:p>
       <w:pPr>
         <w:widowControl/>
-        <w:spacing w:line="348" w:lineRule="auto" w:after="40"/>
-        <w:ind w:firstLine="460"/>
+        <w:spacing w:line="348" w:lineRule="auto" w:after="100"/>
+        <w:ind w:firstLine="0"/>
+        <w:jc w:val="both"/>
       </w:pPr>
       <w:r>
         <w:rPr>
@@ -2365,6 +2408,7 @@
       <w:pPr>
         <w:pStyle w:val="Heading2"/>
         <w:spacing w:before="160" w:after="100"/>
+        <w:ind w:firstLine="0"/>
       </w:pPr>
       <w:r>
         <w:rPr>
@@ -2378,8 +2422,9 @@
     <w:p>
       <w:pPr>
         <w:widowControl/>
-        <w:spacing w:line="348" w:lineRule="auto" w:after="40"/>
-        <w:ind w:firstLine="460"/>
+        <w:spacing w:line="348" w:lineRule="auto" w:after="100"/>
+        <w:ind w:firstLine="0"/>
+        <w:jc w:val="both"/>
       </w:pPr>
       <w:r>
         <w:rPr>
@@ -2392,8 +2437,9 @@
     <w:p>
       <w:pPr>
         <w:widowControl/>
-        <w:spacing w:line="348" w:lineRule="auto" w:after="40"/>
-        <w:ind w:firstLine="460"/>
+        <w:spacing w:line="348" w:lineRule="auto" w:after="100"/>
+        <w:ind w:firstLine="0"/>
+        <w:jc w:val="both"/>
       </w:pPr>
       <w:r>
         <w:rPr>
@@ -2406,8 +2452,9 @@
     <w:p>
       <w:pPr>
         <w:widowControl/>
-        <w:spacing w:line="348" w:lineRule="auto" w:after="40"/>
-        <w:ind w:firstLine="460"/>
+        <w:spacing w:line="348" w:lineRule="auto" w:after="100"/>
+        <w:ind w:firstLine="0"/>
+        <w:jc w:val="both"/>
       </w:pPr>
       <w:r>
         <w:rPr>
@@ -2420,8 +2467,9 @@
     <w:p>
       <w:pPr>
         <w:widowControl/>
-        <w:spacing w:line="348" w:lineRule="auto" w:after="40"/>
-        <w:ind w:firstLine="460"/>
+        <w:spacing w:line="348" w:lineRule="auto" w:after="100"/>
+        <w:ind w:firstLine="0"/>
+        <w:jc w:val="both"/>
       </w:pPr>
       <w:r>
         <w:rPr>
@@ -2435,6 +2483,7 @@
       <w:pPr>
         <w:pStyle w:val="Heading1"/>
         <w:spacing w:before="240" w:after="100"/>
+        <w:ind w:firstLine="0"/>
       </w:pPr>
       <w:r>
         <w:rPr>
@@ -2448,8 +2497,9 @@
     <w:p>
       <w:pPr>
         <w:widowControl/>
-        <w:spacing w:line="348" w:lineRule="auto" w:after="40"/>
-        <w:ind w:firstLine="460"/>
+        <w:spacing w:line="348" w:lineRule="auto" w:after="100"/>
+        <w:ind w:firstLine="0"/>
+        <w:jc w:val="both"/>
       </w:pPr>
       <w:r>
         <w:rPr>
@@ -2462,8 +2512,9 @@
     <w:p>
       <w:pPr>
         <w:widowControl/>
-        <w:spacing w:line="348" w:lineRule="auto" w:after="40"/>
-        <w:ind w:firstLine="460"/>
+        <w:spacing w:line="348" w:lineRule="auto" w:after="100"/>
+        <w:ind w:firstLine="0"/>
+        <w:jc w:val="both"/>
       </w:pPr>
       <w:r>
         <w:rPr>
@@ -2478,6 +2529,7 @@
         <w:pStyle w:val="Heading1"/>
         <w:pageBreakBefore/>
         <w:spacing w:before="240" w:after="100"/>
+        <w:ind w:firstLine="0"/>
       </w:pPr>
       <w:r>
         <w:rPr>
@@ -2491,8 +2543,9 @@
     <w:p>
       <w:pPr>
         <w:widowControl/>
-        <w:spacing w:line="348" w:lineRule="auto" w:after="40"/>
-        <w:ind w:firstLine="460"/>
+        <w:spacing w:line="348" w:lineRule="auto" w:after="100"/>
+        <w:ind w:firstLine="0"/>
+        <w:jc w:val="both"/>
       </w:pPr>
       <w:r>
         <w:rPr>
@@ -2565,8 +2618,9 @@
     <w:p>
       <w:pPr>
         <w:widowControl/>
-        <w:spacing w:line="348" w:lineRule="auto" w:after="40"/>
-        <w:ind w:firstLine="460"/>
+        <w:spacing w:line="348" w:lineRule="auto" w:after="100"/>
+        <w:ind w:firstLine="0"/>
+        <w:jc w:val="both"/>
       </w:pPr>
       <w:r>
         <w:rPr>
@@ -2639,8 +2693,9 @@
     <w:p>
       <w:pPr>
         <w:widowControl/>
-        <w:spacing w:line="348" w:lineRule="auto" w:after="40"/>
-        <w:ind w:firstLine="460"/>
+        <w:spacing w:line="348" w:lineRule="auto" w:after="100"/>
+        <w:ind w:firstLine="0"/>
+        <w:jc w:val="both"/>
       </w:pPr>
       <w:r>
         <w:rPr>

</xml_diff>

<commit_message>
Clarify design alternatives, validation evidence and requirement boundaries
</commit_message>
<xml_diff>
--- a/第二阶段/提交材料/2026_ECNU_PJ1_2_温正泽-可编辑.docx
+++ b/第二阶段/提交材料/2026_ECNU_PJ1_2_温正泽-可编辑.docx
@@ -2311,7 +2311,7 @@
           <w:rFonts w:ascii="Times New Roman" w:hAnsi="Times New Roman" w:cs="Times New Roman" w:eastAsia="宋体"/>
           <w:sz w:val="23"/>
         </w:rPr>
-        <w:t>版本管理需要同时回答两个问题：修改历史能否保留，已经收集的答案是否仍按原含义解释。若问卷显示时直接读取源题，题库改版会影响旧问卷；若完全复制而不记来源，又难以查使用位置和跨卷汇总。AI据此采用“题库保留不可变版本，问卷保存独立副本和来源”的结构，通过同文档条件更新保护历史，通过内容副本保护已发布问卷。</w:t>
+        <w:t>方案讨论比较了三种方式：实时引用源题，复制题目而不保留来源，以及复制指定版本并记录来源。实时引用容易使旧问卷随源题变化；单纯复制难以追踪使用位置和跨卷汇总。因此采用“题库保留不可变版本，问卷保存副本和来源”。历史内嵌便于同文档原子更新，代价是文档增长，故设置100版上限；这是AI提出并落实的设计取舍，不是题目指定结构。</w:t>
       </w:r>
     </w:p>
     <w:p>
@@ -2386,7 +2386,7 @@
           <w:rFonts w:ascii="Times New Roman" w:hAnsi="Times New Roman" w:cs="Times New Roman" w:eastAsia="宋体"/>
           <w:sz w:val="23"/>
         </w:rPr>
-        <w:t>文本回答最初通过聚合一次收集全部内容，选项汇总分支也接收了文本回答。只在页面截取前20条，仍不能解决后端返回量的问题。AI将文本分页放入聚合分支，按时间和答卷ID稳定排序，同时限制选项分支只处理选择题。23条答卷验证了20条和3条两页的内容及顺序；该测试验证功能正确性，未用于推算大规模性能。</w:t>
+        <w:t>文本回答最初通过聚合一次收集全部内容，选项汇总分支也接收了文本回答。只在页面截取前20条，仍不能解决后端返回量的问题。AI将文本分页放入聚合分支，按时间和答卷ID稳定排序，同时限制选项分支只处理选择题。实现位于backend/library.py；tests/test_library.py以23条答卷验证20条和3条两页的内容及顺序，stage2-latest.json保留实际结果。该测试不用于推算大规模性能。</w:t>
       </w:r>
     </w:p>
     <w:p>
@@ -2521,7 +2521,7 @@
           <w:rFonts w:ascii="Times New Roman" w:hAnsi="Times New Roman" w:cs="Times New Roman" w:eastAsia="宋体"/>
           <w:sz w:val="23"/>
         </w:rPr>
-        <w:t>当前每题最多100版，跨卷统计限本人问卷，数字分布自适应分桶，不提供删除引用源题的入口；扩展这些边界需先明确授权和数据量。源码、设计、API、测试及可编辑报告在同一仓库，后续可继续调整。</w:t>
+        <w:t>当前每题最多100版，数字分布采用自适应分桶，不提供删除引用源题的入口。使用追踪仅列出本人问卷，外部使用只返回数量；跨卷统计也限本人问卷。这是本项目对权限的解释，题目未明确该范围。若要求查看他人问卷或全体用户的汇总，仍需补充授权及匿名统计规则。源码、设计、API、测试与报告均在同一仓库。</w:t>
       </w:r>
     </w:p>
     <w:p>

</xml_diff>

<commit_message>
Add explicit cross-user usage and statistics grants with regression coverage
</commit_message>
<xml_diff>
--- a/第二阶段/提交材料/2026_ECNU_PJ1_2_温正泽-可编辑.docx
+++ b/第二阶段/提交材料/2026_ECNU_PJ1_2_温正泽-可编辑.docx
@@ -83,7 +83,7 @@
           <w:rFonts w:ascii="Times New Roman" w:hAnsi="Times New Roman" w:cs="Times New Roman" w:eastAsia="宋体"/>
           <w:sz w:val="23"/>
         </w:rPr>
-        <w:t>本次在原Flask、PyMongo和原生网页上扩展，没有替换第一阶段技术栈。新增两个MongoDB集合及12个API，系统共有七个集合、35个API。第一阶段提交快照保留为stage1-submission-20261023，旧报告及38项测试记录保持原样。本阶段52项自动化测试通过，另完成真实浏览器流程；这些结果覆盖已执行的场景，不代表已完成大规模性能验证。</w:t>
+        <w:t>本次在原Flask、PyMongo和原生网页上扩展，没有替换第一阶段技术栈。新增两个MongoDB集合及13个API，系统共有七个集合、36个API。第一阶段提交快照保留为stage1-submission-20261023，旧报告及38项测试记录保持原样。本阶段58项自动化测试通过，另完成真实浏览器流程；这些结果覆盖已执行的场景，不代表已完成大规模性能验证。</w:t>
       </w:r>
     </w:p>
     <w:p>
@@ -368,7 +368,7 @@
                 <w:b w:val="0"/>
                 <w:sz w:val="20"/>
               </w:rPr>
-              <w:t>来源字段记录题目与版本，本人查看引用位置，外部引用仅显示数量</w:t>
+              <w:t>来源字段记录题目与版本，本人查看引用位置；外部问卷授权后可查看名称和题号</w:t>
             </w:r>
           </w:p>
         </w:tc>
@@ -409,7 +409,7 @@
                 <w:b w:val="0"/>
                 <w:sz w:val="20"/>
               </w:rPr>
-              <w:t>按来源版本与实际定义分组；保留单卷统计，增加数字分布与文本分页</w:t>
+              <w:t>支持本人及跨用户授权汇总，按来源版本与定义分组；数字分布、文本分页保留</w:t>
             </w:r>
           </w:p>
         </w:tc>
@@ -784,7 +784,7 @@
                 <w:b w:val="0"/>
                 <w:sz w:val="20"/>
               </w:rPr>
-              <w:t>surveys.questions.source</w:t>
+              <w:t>surveys来源与授权</w:t>
             </w:r>
           </w:p>
         </w:tc>
@@ -802,7 +802,7 @@
                 <w:b w:val="0"/>
                 <w:sz w:val="20"/>
               </w:rPr>
-              <w:t>library_id、version、definition_hash</w:t>
+              <w:t>questions.source；library_permissions</w:t>
             </w:r>
           </w:p>
         </w:tc>
@@ -820,7 +820,7 @@
                 <w:b w:val="0"/>
                 <w:sz w:val="20"/>
               </w:rPr>
-              <w:t>保存导入来源及定义摘要；问卷副本不依赖实时读取题库</w:t>
+              <w:t>来源含library_id、version、definition_hash；按题号另存usage与statistics授权，不改变冻结题目</w:t>
             </w:r>
           </w:p>
         </w:tc>
@@ -1166,7 +1166,7 @@
           <w:rFonts w:ascii="Times New Roman" w:hAnsi="Times New Roman" w:cs="Times New Roman" w:eastAsia="宋体"/>
           <w:sz w:val="23"/>
         </w:rPr>
-        <w:t>题主可查本人问卷名称、题号、版本和本卷修改标识；外部引用只显示次数。跨卷统计先限制问卷所有者，再按来源查答卷，不返回他人标题、链接或答案。全局统计需另行明确授权及匿名汇总规则。</w:t>
+        <w:t>问卷作者可分别授权题主查看使用位置、汇总该题统计，也可在发布后撤回。授权按本卷题号和来源ID保存于library_permissions，与冻结题目分离，并使用revision条件更新。题主能看到已授权外部问卷的名称、题号和来源版本，不能获得访问链接、账号或原始答卷；未授权引用只计数量。旧数据缺少授权时默认关闭，不自动扩大共享范围。</w:t>
       </w:r>
     </w:p>
     <w:p>
@@ -1196,7 +1196,7 @@
           <w:rFonts w:ascii="Times New Roman" w:hAnsi="Times New Roman" w:cs="Times New Roman" w:eastAsia="宋体"/>
           <w:sz w:val="23"/>
         </w:rPr>
-        <w:t>跨卷统计沿用MongoDB聚合，由问卷中的source查找同一来源题的使用位置，再从本人问卷的正式答卷展开answers。每个回答按“来源版本ID与实际定义摘要”分组。同一题在两份问卷中各回答一次计为两次作答，分母不是去重人数；跳过题和明确空答不会生成有效答案记录。</w:t>
+        <w:t>跨卷统计沿用MongoDB聚合，由source查找同一来源题，再展开纳入范围的正式答卷answers。默认仅查本人问卷；题主可切换到全部已授权问卷，其他共享用户不能读取该范围。每个回答按“来源版本ID与实际定义摘要”分组。同一题在两份问卷中各回答一次计为两次作答，分母不是去重人数；跳过题和明确空答不会生成有效答案记录。</w:t>
       </w:r>
     </w:p>
     <w:p>
@@ -1226,7 +1226,7 @@
           <w:rFonts w:ascii="Times New Roman" w:hAnsi="Times New Roman" w:cs="Times New Roman" w:eastAsia="宋体"/>
           <w:sz w:val="23"/>
         </w:rPr>
-        <w:t>文本题按提交时间及答卷ID排序，每页20条；总作答次数与当前页内容分开返回。数字0参与平均，空数字组返回null均值和空分布。统计使用同一个$facet输入完成分支汇总，避免为总数与选项次数分别读取带来的结果差异。选项分支只处理选择题，文本不会进入无意义的选项汇总。</w:t>
+        <w:t>本人文本题按提交时间及答卷ID排序，每页20条；跨用户范围只给出文本作答次数，不返回原文。汇总结果移除问卷ID与使用位置明细。数字0参与平均，空数字组返回null均值和空分布。统计使用同一个$facet输入完成分支汇总，避免为总数与选项次数分别读取带来的结果差异。选项分支只处理选择题，文本不会进入无意义的选项汇总。</w:t>
       </w:r>
     </w:p>
     <w:p>
@@ -1598,7 +1598,7 @@
           <w:rFonts w:ascii="Times New Roman" w:hAnsi="Times New Roman" w:cs="Times New Roman" w:eastAsia="宋体"/>
           <w:sz w:val="23"/>
         </w:rPr>
-        <w:t>测试采用Python assert、真实MongoDB API测试和Playwright浏览器检查。自动测试创建随机survey_test_数据库，结束时清理；浏览器使用独立测试库，不清空原业务库。2026年10月28日本轮52项测试全部通过，其中原第一阶段38项保留，新增14项覆盖题库与统计；实际时间和逐项结果在tests/results/stage2-latest.json。</w:t>
+        <w:t>测试采用Python assert、真实MongoDB API测试和Playwright浏览器检查。自动测试创建随机survey_test_数据库，结束时清理；浏览器使用独立测试库，不清空原业务库。2026年10月29日本轮58项测试全部通过，其中原第一阶段38项保留，新增20项覆盖题库、统计与跨用户授权；实际时间和逐项结果在tests/results/stage2-latest.json。</w:t>
       </w:r>
     </w:p>
     <w:p>
@@ -1901,7 +1901,7 @@
                 <w:b w:val="0"/>
                 <w:sz w:val="20"/>
               </w:rPr>
-              <w:t>共享双方各提交不同选项</w:t>
+              <w:t>两账号分别回答0和8并授权</w:t>
             </w:r>
           </w:p>
         </w:tc>
@@ -1919,7 +1919,7 @@
                 <w:b w:val="0"/>
                 <w:sz w:val="20"/>
               </w:rPr>
-              <w:t>每人只汇总自己的问卷和答卷</w:t>
+              <w:t>本人统计不变，题主全卷汇总2次、均值4</w:t>
             </w:r>
           </w:p>
         </w:tc>
@@ -2137,7 +2137,7 @@
                 <w:b w:val="0"/>
                 <w:sz w:val="20"/>
               </w:rPr>
-              <w:t>未知共享账号及撤销共享</w:t>
+              <w:t>授权位置与统计后分别撤回</w:t>
             </w:r>
           </w:p>
         </w:tc>
@@ -2155,7 +2155,7 @@
                 <w:b w:val="0"/>
                 <w:sz w:val="20"/>
               </w:rPr>
-              <w:t>非法变更不落库，撤销后不能再读取源题</w:t>
+              <w:t>名称和汇总分别关闭，冻结题目内容不变</w:t>
             </w:r>
           </w:p>
         </w:tc>
@@ -2191,7 +2191,7 @@
           <w:rFonts w:ascii="Times New Roman" w:hAnsi="Times New Roman" w:cs="Times New Roman" w:eastAsia="宋体"/>
           <w:sz w:val="23"/>
         </w:rPr>
-        <w:t>浏览器检查分为单账号题库流程和双账号连续验收。前者验证创建、工作稿、历史恢复、数字分布、文本翻页及390px宽度布局；后者使用两个隔离会话，通过页面完成共享、旧版本导入、发布填写、改版、撤销和恢复。接收者旧问卷保持原内容，双方分别得到自己的统计结果，题主看不到外部问卷名称。检查由Playwright执行，结果分别保存于stage2-browser.json和stage2-acceptance.json。</w:t>
+        <w:t>浏览器检查分为单账号题库流程和双账号连续验收。前者验证创建、工作稿、历史恢复、数字分布、文本翻页及390px宽度布局；后者使用两个隔离会话，通过页面完成共享、旧版本导入、发布填写、改版、撤销和恢复。接收者旧问卷保持原内容，默认统计隔离；授权后题主看到外部名称及分版本汇总，撤回后外部结果消失。检查由Playwright执行，结果分别保存于stage2-browser.json和stage2-acceptance.json。</w:t>
       </w:r>
     </w:p>
     <w:p>
@@ -2206,7 +2206,7 @@
           <w:rFonts w:ascii="Times New Roman" w:hAnsi="Times New Roman" w:cs="Times New Roman" w:eastAsia="宋体"/>
           <w:sz w:val="23"/>
         </w:rPr>
-        <w:t>另从Git导出独立源码，在全新虚拟环境执行requirements.txt安装，连接空的独立MongoDB数据目录启动服务。健康检查和七集合初始化通过，随后在该环境完成52项回归与双账号验收。环境及依赖明细见tests/results/stage2-reproduction.json。兼容性通过原接口、无来源问卷、发布冻结和提交路径的回归测试验证。旧答卷不因本次初始化或题库更新被迁移覆盖。当前验证未覆盖大规模题目引用、高并发压测或全部浏览器；不能由52项通过推断这些范围也已验证。</w:t>
+        <w:t>另从Git导出独立源码，在全新虚拟环境执行requirements.txt安装，连接空的独立MongoDB数据目录启动服务。健康检查和七集合初始化通过，随后在该环境完成52项回归与双账号验收。环境及依赖明细见tests/results/stage2-reproduction.json。兼容性通过原接口、无来源问卷、发布冻结和提交路径的回归测试验证。旧答卷不因本次初始化或题库更新被迁移覆盖。当前验证未覆盖大规模题目引用、高并发压测或全部浏览器；不能由58项通过推断这些范围也已验证。</w:t>
       </w:r>
     </w:p>
     <w:p>
@@ -2326,7 +2326,7 @@
           <w:rFonts w:ascii="Times New Roman" w:hAnsi="Times New Roman" w:cs="Times New Roman" w:eastAsia="宋体"/>
           <w:sz w:val="23"/>
         </w:rPr>
-        <w:t>共享的边界也需要单独检查。能够导入他人的题目，不代表可以查看其答卷。因此接口先限制问卷所有者，再处理来源题的统计；使用位置只向题主返回外部引用数。自动测试让两个账号各提交不同选项，验证彼此的统计不混入对方数据；双浏览器验收进一步检查共享、填写、改版和撤销后的连续行为。</w:t>
+        <w:t>复核需求时发现，首版只显示外部引用次数、只统计本人问卷，虽然保证隔离，却没有完整提供跨用户使用位置和汇总入口。我要求继续修复，AI据此补充两项独立授权：问卷作者同意后，题主可查看位置或汇总统计。本人统计保持原口径，全卷范围不返回身份、问卷链接及文本原文。两个账号的API和浏览器流程验证授权生效、单独撤回及旧题不变。</w:t>
       </w:r>
     </w:p>
     <w:p>
@@ -2461,7 +2461,7 @@
           <w:rFonts w:ascii="Times New Roman" w:hAnsi="Times New Roman" w:cs="Times New Roman" w:eastAsia="宋体"/>
           <w:sz w:val="23"/>
         </w:rPr>
-        <w:t>后续仍需单独验证共享撤销与导入同时发生的竞争，并记录索引执行计划。当前52项通过只说明已覆盖用例符合预期，不能据此推断跨文档操作具备事务隔离或大规模查询性能。这也是继续使用AI时需要保留的检查方式：让方案、代码和证据相互对应，对没有验证的结论保持边界。</w:t>
+        <w:t>后续仍需单独验证共享撤销与导入同时发生的竞争，并记录索引执行计划。当前58项通过只说明已覆盖用例符合预期，不能据此推断跨文档操作具备事务隔离或大规模查询性能。这也是继续使用AI时需要保留的检查方式：让方案、代码和证据相互对应，对没有验证的结论保持边界。</w:t>
       </w:r>
     </w:p>
     <w:p>
@@ -2521,7 +2521,7 @@
           <w:rFonts w:ascii="Times New Roman" w:hAnsi="Times New Roman" w:cs="Times New Roman" w:eastAsia="宋体"/>
           <w:sz w:val="23"/>
         </w:rPr>
-        <w:t>当前每题最多100版，数字分布采用自适应分桶，不提供删除引用源题的入口。使用追踪仅列出本人问卷，外部使用只返回数量；跨卷统计也限本人问卷。这是本项目对权限的解释，题目未明确该范围。若要求查看他人问卷或全体用户的汇总，仍需补充授权及匿名统计规则。源码、设计、API、测试与报告均在同一仓库。</w:t>
+        <w:t>当前每题最多100版，数字分布采用自适应分桶，不提供删除引用源题的入口。跨用户使用明细与统计均已提供，但须由问卷作者授权，可分别撤回；不会无条件公开所有用户的数据。跨用户文本只统计次数，原文仍由问卷作者管理。源码、设计、API、测试及报告保存在同一仓库；大规模负载与跨文档竞争仍需专项验证。</w:t>
       </w:r>
     </w:p>
     <w:p>

</xml_diff>